<commit_message>
Prepare four-hour sorting workshop materials and offline student handout
</commit_message>
<xml_diff>
--- a/docs/instructor-guide.docx
+++ b/docs/instructor-guide.docx
@@ -7,56 +7,12 @@
         <w:pStyle w:val="Title"/>
       </w:pPr>
       <w:r>
-        <w:t>CPS Candy Factory</w:t>
+        <w:t>Instructor runbook: Autonomous Robot Sorting</w:t>
       </w:r>
     </w:p>
     <w:p>
       <w:r>
-        <w:rPr>
-          <w:color w:val="607383"/>
-          <w:sz w:val="20"/>
-        </w:rPr>
-        <w:t>T17(1) · Instructor guide · 4 hours · 6 students</w:t>
-      </w:r>
-    </w:p>
-    <w:p>
-      <w:pPr>
-        <w:spacing w:after="40"/>
-        <w:jc w:val="center"/>
-      </w:pPr>
-      <w:r>
-        <w:drawing>
-          <wp:inline xmlns:a="http://schemas.openxmlformats.org/drawingml/2006/main" xmlns:pic="http://schemas.openxmlformats.org/drawingml/2006/picture">
-            <wp:extent cx="5394960" cy="2614224"/>
-            <wp:docPr id="1" name="Picture 1"/>
-            <wp:cNvGraphicFramePr>
-              <a:graphicFrameLocks noChangeAspect="1"/>
-            </wp:cNvGraphicFramePr>
-            <a:graphic>
-              <a:graphicData uri="http://schemas.openxmlformats.org/drawingml/2006/picture">
-                <pic:pic>
-                  <pic:nvPicPr>
-                    <pic:cNvPr id="0" name="factory-overview.png"/>
-                    <pic:cNvPicPr/>
-                  </pic:nvPicPr>
-                  <pic:blipFill>
-                    <a:blip r:embed="rId10"/>
-                    <a:stretch>
-                      <a:fillRect/>
-                    </a:stretch>
-                  </pic:blipFill>
-                  <pic:spPr>
-                    <a:xfrm>
-                      <a:off x="0" y="0"/>
-                      <a:ext cx="5394960" cy="2614224"/>
-                    </a:xfrm>
-                    <a:prstGeom prst="rect"/>
-                  </pic:spPr>
-                </pic:pic>
-              </a:graphicData>
-            </a:graphic>
-          </wp:inline>
-        </w:drawing>
+        <w:t>Thursday, 22 October 2026. Four hours, six first-semester bachelor students, three pairs. Use the timed lesson plan, eight introductory slides and one-page worksheet. English student instructions. No programming or ROS prerequisite.</w:t>
       </w:r>
     </w:p>
     <w:p>
@@ -64,17 +20,433 @@
         <w:pStyle w:val="Heading1"/>
       </w:pPr>
       <w:r>
-        <w:t>Learning objective</w:t>
+        <w:t>1. Before students arrive</w:t>
       </w:r>
     </w:p>
     <w:p>
       <w:r>
-        <w:t>Students explore sensing → decision → action → verification using a safe Python simulation and optional supervised hardware stations.</w:t>
+        <w:t>Prepare Python 3.11 or newer and a text editor on each laptop. Open a terminal in the repository or extracted student bundle. Use the same tested Python command throughout the session (</w:t>
+      </w:r>
+      <w:r>
+        <w:rPr>
+          <w:rFonts w:ascii="DejaVu Sans Mono" w:hAnsi="DejaVu Sans Mono"/>
+          <w:sz w:val="18"/>
+        </w:rPr>
+        <w:t>python</w:t>
+      </w:r>
+      <w:r>
+        <w:t xml:space="preserve">, or </w:t>
+      </w:r>
+      <w:r>
+        <w:rPr>
+          <w:rFonts w:ascii="DejaVu Sans Mono" w:hAnsi="DejaVu Sans Mono"/>
+          <w:sz w:val="18"/>
+        </w:rPr>
+        <w:t>python3</w:t>
+      </w:r>
+      <w:r>
+        <w:t xml:space="preserve"> where required). No package installation or internet should be necessary in class.</w:t>
       </w:r>
     </w:p>
     <w:p>
       <w:r>
-        <w:t>All students must be able to change an if rule and explain why the belt must stop before sorting.</w:t>
+        <w:t>Run these commands on each student laptop, with networking disconnected:</w:t>
+      </w:r>
+    </w:p>
+    <w:p>
+      <w:r>
+        <w:rPr>
+          <w:rFonts w:ascii="DejaVu Sans Mono" w:hAnsi="DejaVu Sans Mono"/>
+          <w:sz w:val="17"/>
+        </w:rPr>
+        <w:t>python --version</w:t>
+      </w:r>
+    </w:p>
+    <w:p>
+      <w:r>
+        <w:rPr>
+          <w:rFonts w:ascii="DejaVu Sans Mono" w:hAnsi="DejaVu Sans Mono"/>
+          <w:sz w:val="17"/>
+        </w:rPr>
+        <w:t>python exercises/check_setup.py</w:t>
+      </w:r>
+    </w:p>
+    <w:p>
+      <w:r>
+        <w:rPr>
+          <w:rFonts w:ascii="DejaVu Sans Mono" w:hAnsi="DejaVu Sans Mono"/>
+          <w:sz w:val="17"/>
+        </w:rPr>
+        <w:t>python exercises/01_python.py</w:t>
+      </w:r>
+    </w:p>
+    <w:p>
+      <w:r>
+        <w:rPr>
+          <w:rFonts w:ascii="DejaVu Sans Mono" w:hAnsi="DejaVu Sans Mono"/>
+          <w:sz w:val="17"/>
+        </w:rPr>
+        <w:t>python exercises/02_robot.py</w:t>
+      </w:r>
+    </w:p>
+    <w:p>
+      <w:r>
+        <w:rPr>
+          <w:rFonts w:ascii="DejaVu Sans Mono" w:hAnsi="DejaVu Sans Mono"/>
+          <w:sz w:val="17"/>
+        </w:rPr>
+        <w:t>python exercises/03_vision.py</w:t>
+      </w:r>
+    </w:p>
+    <w:p>
+      <w:r>
+        <w:rPr>
+          <w:rFonts w:ascii="DejaVu Sans Mono" w:hAnsi="DejaVu Sans Mono"/>
+          <w:sz w:val="17"/>
+        </w:rPr>
+        <w:t>python exercises/04_sort.py</w:t>
+      </w:r>
+    </w:p>
+    <w:p>
+      <w:r>
+        <w:rPr>
+          <w:rFonts w:ascii="DejaVu Sans Mono" w:hAnsi="DejaVu Sans Mono"/>
+          <w:sz w:val="17"/>
+        </w:rPr>
+        <w:t>python exercises/05_visual_sort.py</w:t>
+      </w:r>
+    </w:p>
+    <w:p>
+      <w:r>
+        <w:rPr>
+          <w:rFonts w:ascii="DejaVu Sans Mono" w:hAnsi="DejaVu Sans Mono"/>
+          <w:sz w:val="17"/>
+        </w:rPr>
+        <w:t>python -m workshop</w:t>
+      </w:r>
+    </w:p>
+    <w:p>
+      <w:r>
+        <w:t xml:space="preserve">Open </w:t>
+      </w:r>
+      <w:r>
+        <w:rPr>
+          <w:rFonts w:ascii="DejaVu Sans Mono" w:hAnsi="DejaVu Sans Mono"/>
+          <w:sz w:val="18"/>
+        </w:rPr>
+        <w:t>sorting-result.html</w:t>
+      </w:r>
+      <w:r>
+        <w:t xml:space="preserve"> in the laptop's browser. Confirm that the animation advances, labels are readable, and unknown objects reach reject. Edit one rule, rerun the Python file and reload the browser. Confirm that the output changes. These commands use simulated hardware and standard Python.</w:t>
+      </w:r>
+    </w:p>
+    <w:p>
+      <w:r>
+        <w:t>Prepare a portable copy in advance:</w:t>
+      </w:r>
+    </w:p>
+    <w:p>
+      <w:r>
+        <w:rPr>
+          <w:rFonts w:ascii="DejaVu Sans Mono" w:hAnsi="DejaVu Sans Mono"/>
+          <w:sz w:val="17"/>
+        </w:rPr>
+        <w:t>python exercises/make_student_bundle.py --output student-workshop.zip</w:t>
+      </w:r>
+    </w:p>
+    <w:p>
+      <w:r>
+        <w:t>Extract it into a writable folder on each laptop. Rerun the checks there. Keep a USB copy, printed worksheets, the slides and a PDF copy if the presentation application differs. Test all three laptops; one passing workstation does not establish that all laptops work.</w:t>
+      </w:r>
+    </w:p>
+    <w:tbl>
+      <w:tblPr>
+        <w:tblStyle w:val="LightShading-Accent1"/>
+        <w:tblW w:type="auto" w:w="0"/>
+        <w:tblLook w:firstColumn="1" w:firstRow="1" w:lastColumn="0" w:lastRow="0" w:noHBand="0" w:noVBand="1" w:val="04A0"/>
+      </w:tblPr>
+      <w:tblGrid>
+        <w:gridCol w:w="1967"/>
+        <w:gridCol w:w="1967"/>
+        <w:gridCol w:w="1967"/>
+        <w:gridCol w:w="1967"/>
+        <w:gridCol w:w="1967"/>
+      </w:tblGrid>
+      <w:tr>
+        <w:trPr>
+          <w:tblHeader/>
+        </w:trPr>
+        <w:tc>
+          <w:tcPr>
+            <w:tcW w:type="dxa" w:w="1967"/>
+          </w:tcPr>
+          <w:p>
+            <w:r>
+              <w:rPr>
+                <w:sz w:val="16"/>
+              </w:rPr>
+              <w:t>Computer</w:t>
+            </w:r>
+          </w:p>
+        </w:tc>
+        <w:tc>
+          <w:tcPr>
+            <w:tcW w:type="dxa" w:w="1967"/>
+          </w:tcPr>
+          <w:p>
+            <w:r>
+              <w:rPr>
+                <w:sz w:val="16"/>
+              </w:rPr>
+              <w:t>Python and four exercises</w:t>
+            </w:r>
+          </w:p>
+        </w:tc>
+        <w:tc>
+          <w:tcPr>
+            <w:tcW w:type="dxa" w:w="1967"/>
+          </w:tcPr>
+          <w:p>
+            <w:r>
+              <w:rPr>
+                <w:sz w:val="16"/>
+              </w:rPr>
+              <w:t>Visual HTML changed and replayed</w:t>
+            </w:r>
+          </w:p>
+        </w:tc>
+        <w:tc>
+          <w:tcPr>
+            <w:tcW w:type="dxa" w:w="1967"/>
+          </w:tcPr>
+          <w:p>
+            <w:r>
+              <w:rPr>
+                <w:sz w:val="16"/>
+              </w:rPr>
+              <w:t>Offline test</w:t>
+            </w:r>
+          </w:p>
+        </w:tc>
+        <w:tc>
+          <w:tcPr>
+            <w:tcW w:type="dxa" w:w="1967"/>
+          </w:tcPr>
+          <w:p>
+            <w:r>
+              <w:rPr>
+                <w:sz w:val="16"/>
+              </w:rPr>
+              <w:t>Checked by</w:t>
+            </w:r>
+          </w:p>
+        </w:tc>
+      </w:tr>
+      <w:tr>
+        <w:tc>
+          <w:tcPr>
+            <w:tcW w:type="dxa" w:w="1967"/>
+          </w:tcPr>
+          <w:p>
+            <w:r>
+              <w:rPr>
+                <w:sz w:val="16"/>
+              </w:rPr>
+              <w:t>Pair 1</w:t>
+            </w:r>
+          </w:p>
+        </w:tc>
+        <w:tc>
+          <w:tcPr>
+            <w:tcW w:type="dxa" w:w="1967"/>
+          </w:tcPr>
+          <w:p>
+            <w:r>
+              <w:rPr>
+                <w:sz w:val="16"/>
+              </w:rPr>
+              <w:t>___</w:t>
+            </w:r>
+          </w:p>
+        </w:tc>
+        <w:tc>
+          <w:tcPr>
+            <w:tcW w:type="dxa" w:w="1967"/>
+          </w:tcPr>
+          <w:p>
+            <w:r>
+              <w:rPr>
+                <w:sz w:val="16"/>
+              </w:rPr>
+              <w:t>___</w:t>
+            </w:r>
+          </w:p>
+        </w:tc>
+        <w:tc>
+          <w:tcPr>
+            <w:tcW w:type="dxa" w:w="1967"/>
+          </w:tcPr>
+          <w:p>
+            <w:r>
+              <w:rPr>
+                <w:sz w:val="16"/>
+              </w:rPr>
+              <w:t>___</w:t>
+            </w:r>
+          </w:p>
+        </w:tc>
+        <w:tc>
+          <w:tcPr>
+            <w:tcW w:type="dxa" w:w="1967"/>
+          </w:tcPr>
+          <w:p>
+            <w:r>
+              <w:rPr>
+                <w:sz w:val="16"/>
+              </w:rPr>
+              <w:t>___</w:t>
+            </w:r>
+          </w:p>
+        </w:tc>
+      </w:tr>
+      <w:tr>
+        <w:tc>
+          <w:tcPr>
+            <w:tcW w:type="dxa" w:w="1967"/>
+          </w:tcPr>
+          <w:p>
+            <w:r>
+              <w:rPr>
+                <w:sz w:val="16"/>
+              </w:rPr>
+              <w:t>Pair 2</w:t>
+            </w:r>
+          </w:p>
+        </w:tc>
+        <w:tc>
+          <w:tcPr>
+            <w:tcW w:type="dxa" w:w="1967"/>
+          </w:tcPr>
+          <w:p>
+            <w:r>
+              <w:rPr>
+                <w:sz w:val="16"/>
+              </w:rPr>
+              <w:t>___</w:t>
+            </w:r>
+          </w:p>
+        </w:tc>
+        <w:tc>
+          <w:tcPr>
+            <w:tcW w:type="dxa" w:w="1967"/>
+          </w:tcPr>
+          <w:p>
+            <w:r>
+              <w:rPr>
+                <w:sz w:val="16"/>
+              </w:rPr>
+              <w:t>___</w:t>
+            </w:r>
+          </w:p>
+        </w:tc>
+        <w:tc>
+          <w:tcPr>
+            <w:tcW w:type="dxa" w:w="1967"/>
+          </w:tcPr>
+          <w:p>
+            <w:r>
+              <w:rPr>
+                <w:sz w:val="16"/>
+              </w:rPr>
+              <w:t>___</w:t>
+            </w:r>
+          </w:p>
+        </w:tc>
+        <w:tc>
+          <w:tcPr>
+            <w:tcW w:type="dxa" w:w="1967"/>
+          </w:tcPr>
+          <w:p>
+            <w:r>
+              <w:rPr>
+                <w:sz w:val="16"/>
+              </w:rPr>
+              <w:t>___</w:t>
+            </w:r>
+          </w:p>
+        </w:tc>
+      </w:tr>
+      <w:tr>
+        <w:tc>
+          <w:tcPr>
+            <w:tcW w:type="dxa" w:w="1967"/>
+          </w:tcPr>
+          <w:p>
+            <w:r>
+              <w:rPr>
+                <w:sz w:val="16"/>
+              </w:rPr>
+              <w:t>Pair 3</w:t>
+            </w:r>
+          </w:p>
+        </w:tc>
+        <w:tc>
+          <w:tcPr>
+            <w:tcW w:type="dxa" w:w="1967"/>
+          </w:tcPr>
+          <w:p>
+            <w:r>
+              <w:rPr>
+                <w:sz w:val="16"/>
+              </w:rPr>
+              <w:t>___</w:t>
+            </w:r>
+          </w:p>
+        </w:tc>
+        <w:tc>
+          <w:tcPr>
+            <w:tcW w:type="dxa" w:w="1967"/>
+          </w:tcPr>
+          <w:p>
+            <w:r>
+              <w:rPr>
+                <w:sz w:val="16"/>
+              </w:rPr>
+              <w:t>___</w:t>
+            </w:r>
+          </w:p>
+        </w:tc>
+        <w:tc>
+          <w:tcPr>
+            <w:tcW w:type="dxa" w:w="1967"/>
+          </w:tcPr>
+          <w:p>
+            <w:r>
+              <w:rPr>
+                <w:sz w:val="16"/>
+              </w:rPr>
+              <w:t>___</w:t>
+            </w:r>
+          </w:p>
+        </w:tc>
+        <w:tc>
+          <w:tcPr>
+            <w:tcW w:type="dxa" w:w="1967"/>
+          </w:tcPr>
+          <w:p>
+            <w:r>
+              <w:rPr>
+                <w:sz w:val="16"/>
+              </w:rPr>
+              <w:t>___</w:t>
+            </w:r>
+          </w:p>
+        </w:tc>
+      </w:tr>
+    </w:tbl>
+    <w:p>
+      <w:r>
+        <w:br w:type="page"/>
       </w:r>
     </w:p>
     <w:p>
@@ -82,25 +454,293 @@
         <w:pStyle w:val="Heading1"/>
       </w:pPr>
       <w:r>
-        <w:t>Four-hour schedule</w:t>
+        <w:t>2. Physical-station decision</w:t>
+      </w:r>
+    </w:p>
+    <w:p>
+      <w:r>
+        <w:t>Check the actual camera, robot and conveyor separately before class. Record the accepted demonstration for each. Secure the arm, conveyor, camera and cables. Keep an accessible stop and power disconnect. Only the instructor enables actuators. Brief students before touching leader controls. Never run a second motor owner or generic calibration command alongside the station controller.</w:t>
       </w:r>
     </w:p>
     <w:tbl>
       <w:tblPr>
         <w:tblStyle w:val="LightShading-Accent1"/>
         <w:tblW w:type="auto" w:w="0"/>
-        <w:jc w:val="center"/>
         <w:tblLook w:firstColumn="1" w:firstRow="1" w:lastColumn="0" w:lastRow="0" w:noHBand="0" w:noVBand="1" w:val="04A0"/>
       </w:tblPr>
       <w:tblGrid>
-        <w:gridCol w:w="3331"/>
-        <w:gridCol w:w="3331"/>
-        <w:gridCol w:w="3331"/>
+        <w:gridCol w:w="3278"/>
+        <w:gridCol w:w="3278"/>
+        <w:gridCol w:w="3278"/>
       </w:tblGrid>
+      <w:tr>
+        <w:trPr>
+          <w:tblHeader/>
+        </w:trPr>
+        <w:tc>
+          <w:tcPr>
+            <w:tcW w:type="dxa" w:w="3278"/>
+          </w:tcPr>
+          <w:p>
+            <w:r>
+              <w:rPr>
+                <w:sz w:val="16"/>
+              </w:rPr>
+              <w:t>Station</w:t>
+            </w:r>
+          </w:p>
+        </w:tc>
+        <w:tc>
+          <w:tcPr>
+            <w:tcW w:type="dxa" w:w="3278"/>
+          </w:tcPr>
+          <w:p>
+            <w:r>
+              <w:rPr>
+                <w:sz w:val="16"/>
+              </w:rPr>
+              <w:t>Check before enabling</w:t>
+            </w:r>
+          </w:p>
+        </w:tc>
+        <w:tc>
+          <w:tcPr>
+            <w:tcW w:type="dxa" w:w="3278"/>
+          </w:tcPr>
+          <w:p>
+            <w:r>
+              <w:rPr>
+                <w:sz w:val="16"/>
+              </w:rPr>
+              <w:t>Fallback</w:t>
+            </w:r>
+          </w:p>
+        </w:tc>
+      </w:tr>
       <w:tr>
         <w:tc>
           <w:tcPr>
-            <w:tcW w:type="dxa" w:w="3331"/>
+            <w:tcW w:type="dxa" w:w="3278"/>
+          </w:tcPr>
+          <w:p>
+            <w:r>
+              <w:rPr>
+                <w:sz w:val="16"/>
+              </w:rPr>
+              <w:t>Robot</w:t>
+            </w:r>
+          </w:p>
+        </w:tc>
+        <w:tc>
+          <w:tcPr>
+            <w:tcW w:type="dxa" w:w="3278"/>
+          </w:tcPr>
+          <w:p>
+            <w:r>
+              <w:rPr>
+                <w:sz w:val="16"/>
+              </w:rPr>
+              <w:t>Fresh feedback, calibrated leader/follower, known stop response, clear workspace and supervised motion</w:t>
+            </w:r>
+          </w:p>
+        </w:tc>
+        <w:tc>
+          <w:tcPr>
+            <w:tcW w:type="dxa" w:w="3278"/>
+          </w:tcPr>
+          <w:p>
+            <w:r>
+              <w:rPr>
+                <w:sz w:val="16"/>
+              </w:rPr>
+              <w:t>python exercises/02_robot.py; explain a sequence of simulated actions</w:t>
+            </w:r>
+          </w:p>
+        </w:tc>
+      </w:tr>
+      <w:tr>
+        <w:tc>
+          <w:tcPr>
+            <w:tcW w:type="dxa" w:w="3278"/>
+          </w:tcPr>
+          <w:p>
+            <w:r>
+              <w:rPr>
+                <w:sz w:val="16"/>
+              </w:rPr>
+              <w:t>Conveyor</w:t>
+            </w:r>
+          </w:p>
+        </w:tc>
+        <w:tc>
+          <w:tcPr>
+            <w:tcW w:type="dxa" w:w="3278"/>
+          </w:tcPr>
+          <w:p>
+            <w:r>
+              <w:rPr>
+                <w:sz w:val="16"/>
+              </w:rPr>
+              <w:t>Correct direction, working stop, clear mechanism, repeatable object stopping</w:t>
+            </w:r>
+          </w:p>
+        </w:tc>
+        <w:tc>
+          <w:tcPr>
+            <w:tcW w:type="dxa" w:w="3278"/>
+          </w:tcPr>
+          <w:p>
+            <w:r>
+              <w:rPr>
+                <w:sz w:val="16"/>
+              </w:rPr>
+              <w:t>python -m workshop; inspect the unpowered mechanism</w:t>
+            </w:r>
+          </w:p>
+        </w:tc>
+      </w:tr>
+      <w:tr>
+        <w:tc>
+          <w:tcPr>
+            <w:tcW w:type="dxa" w:w="3278"/>
+          </w:tcPr>
+          <w:p>
+            <w:r>
+              <w:rPr>
+                <w:sz w:val="16"/>
+              </w:rPr>
+              <w:t>Camera</w:t>
+            </w:r>
+          </w:p>
+        </w:tc>
+        <w:tc>
+          <w:tcPr>
+            <w:tcW w:type="dxa" w:w="3278"/>
+          </w:tcPr>
+          <w:p>
+            <w:r>
+              <w:rPr>
+                <w:sz w:val="16"/>
+              </w:rPr>
+              <w:t>Advancing real images and classifications under actual lighting</w:t>
+            </w:r>
+          </w:p>
+        </w:tc>
+        <w:tc>
+          <w:tcPr>
+            <w:tcW w:type="dxa" w:w="3278"/>
+          </w:tcPr>
+          <w:p>
+            <w:r>
+              <w:rPr>
+                <w:sz w:val="16"/>
+              </w:rPr>
+              <w:t>docs/assets/vision-demo.png and docs/assets/vision-roi.png, plus exercise 03</w:t>
+            </w:r>
+          </w:p>
+        </w:tc>
+      </w:tr>
+    </w:tbl>
+    <w:p>
+      <w:r>
+        <w:t>The included images are labeled teaching schematics, not photographs or validation evidence. A physical autonomous pick/place remains a separate commissioning result. Demonstrate it only if the complete cycle has actually passed the current station checks. Component tests or a successful simulation do not prove a physical sort.</w:t>
+      </w:r>
+    </w:p>
+    <w:p>
+      <w:r>
+        <w:t>If a stream becomes stale, a person enters the work envelope or motion differs from expectations, stop the hardware and switch that station to its fallback. Do not troubleshoot powered hardware while students wait. Students must not change calibration, joint limits, motor settings or service configurations.</w:t>
+      </w:r>
+    </w:p>
+    <w:p>
+      <w:pPr>
+        <w:pStyle w:val="Heading1"/>
+      </w:pPr>
+      <w:r>
+        <w:t>3. Introduction: eight slides, 25 minutes</w:t>
+      </w:r>
+    </w:p>
+    <w:p>
+      <w:r>
+        <w:t>1. Can a robot run a factory? (3 min): ask what it must know before moving a block.</w:t>
+      </w:r>
+    </w:p>
+    <w:p>
+      <w:r>
+        <w:t>2. Our miniature factory (3 min): point to the actual camera, LEGO belt, arm and bins. The slide is a schematic.</w:t>
+      </w:r>
+    </w:p>
+    <w:p>
+      <w:r>
+        <w:t>3. Observe, decide, act, check (4 min): classify camera as sensor and motor as actuator. Ask how to check a result.</w:t>
+      </w:r>
+    </w:p>
+    <w:p>
+      <w:r>
+        <w:t>4. A camera sees pixels (3 min): compare red, blue and unknown examples. Discuss lighting, shadows and missing information.</w:t>
+      </w:r>
+    </w:p>
+    <w:p>
+      <w:r>
+        <w:t>5. Robot joints and gripper (3 min): show joints and a target, using only an accepted motion demonstration.</w:t>
+      </w:r>
+    </w:p>
+    <w:p>
+      <w:r>
+        <w:t>6. Your first Python rule (4 min): predict a tiny loop and color condition. Avoid a long syntax lecture.</w:t>
+      </w:r>
+    </w:p>
+    <w:p>
+      <w:r>
+        <w:t>7. What can go wrong? (3 min): ask students for a failure and a safe response.</w:t>
+      </w:r>
+    </w:p>
+    <w:p>
+      <w:r>
+        <w:t>8. Your challenge (2 min): pairs must change a rule, test five objects and explain rejection.</w:t>
+      </w:r>
+    </w:p>
+    <w:p>
+      <w:r>
+        <w:t>The presentation contains speaker notes with prompts and pacing. Continue with the exact 240-minute schedule.</w:t>
+      </w:r>
+    </w:p>
+    <w:p>
+      <w:r>
+        <w:br w:type="page"/>
+      </w:r>
+    </w:p>
+    <w:p>
+      <w:pPr>
+        <w:pStyle w:val="Heading1"/>
+      </w:pPr>
+      <w:r>
+        <w:t>4. Three rotations: 01:35–02:20</w:t>
+      </w:r>
+    </w:p>
+    <w:p>
+      <w:r>
+        <w:t>Use pairs A, B and C. Each visit lasts 15 minutes, including transition. The instructor supervises any powered robot activity; if the other stations require supervision too, use their offline alternatives. Swap the typing / predicting roles between activities.</w:t>
+      </w:r>
+    </w:p>
+    <w:tbl>
+      <w:tblPr>
+        <w:tblStyle w:val="LightShading-Accent1"/>
+        <w:tblW w:type="auto" w:w="0"/>
+        <w:tblLook w:firstColumn="1" w:firstRow="1" w:lastColumn="0" w:lastRow="0" w:noHBand="0" w:noVBand="1" w:val="04A0"/>
+      </w:tblPr>
+      <w:tblGrid>
+        <w:gridCol w:w="2459"/>
+        <w:gridCol w:w="2459"/>
+        <w:gridCol w:w="2459"/>
+        <w:gridCol w:w="2459"/>
+      </w:tblGrid>
+      <w:tr>
+        <w:trPr>
+          <w:tblHeader/>
+        </w:trPr>
+        <w:tc>
+          <w:tcPr>
+            <w:tcW w:type="dxa" w:w="2459"/>
           </w:tcPr>
           <w:p>
             <w:r>
@@ -113,27 +753,40 @@
         </w:tc>
         <w:tc>
           <w:tcPr>
-            <w:tcW w:type="dxa" w:w="3331"/>
+            <w:tcW w:type="dxa" w:w="2459"/>
           </w:tcPr>
           <w:p>
             <w:r>
               <w:rPr>
                 <w:sz w:val="16"/>
               </w:rPr>
-              <w:t>Block</w:t>
+              <w:t>Pair A</w:t>
             </w:r>
           </w:p>
         </w:tc>
         <w:tc>
           <w:tcPr>
-            <w:tcW w:type="dxa" w:w="3331"/>
+            <w:tcW w:type="dxa" w:w="2459"/>
           </w:tcPr>
           <w:p>
             <w:r>
               <w:rPr>
                 <w:sz w:val="16"/>
               </w:rPr>
-              <w:t>Outcome</w:t>
+              <w:t>Pair B</w:t>
+            </w:r>
+          </w:p>
+        </w:tc>
+        <w:tc>
+          <w:tcPr>
+            <w:tcW w:type="dxa" w:w="2459"/>
+          </w:tcPr>
+          <w:p>
+            <w:r>
+              <w:rPr>
+                <w:sz w:val="16"/>
+              </w:rPr>
+              <w:t>Pair C</w:t>
             </w:r>
           </w:p>
         </w:tc>
@@ -141,43 +794,53 @@
       <w:tr>
         <w:tc>
           <w:tcPr>
-            <w:tcW w:type="dxa" w:w="3331"/>
-            <w:vAlign w:val="center"/>
+            <w:tcW w:type="dxa" w:w="2459"/>
           </w:tcPr>
           <w:p>
             <w:r>
               <w:rPr>
                 <w:sz w:val="16"/>
               </w:rPr>
-              <w:t>00:00–00:45</w:t>
+              <w:t>01:35–01:50</w:t>
             </w:r>
           </w:p>
         </w:tc>
         <w:tc>
           <w:tcPr>
-            <w:tcW w:type="dxa" w:w="3331"/>
-            <w:vAlign w:val="center"/>
+            <w:tcW w:type="dxa" w:w="2459"/>
           </w:tcPr>
           <w:p>
             <w:r>
               <w:rPr>
                 <w:sz w:val="16"/>
               </w:rPr>
-              <w:t>CPS, Python, safety &amp; demo</w:t>
+              <w:t>Robot</w:t>
             </w:r>
           </w:p>
         </w:tc>
         <w:tc>
           <w:tcPr>
-            <w:tcW w:type="dxa" w:w="3331"/>
-            <w:vAlign w:val="center"/>
+            <w:tcW w:type="dxa" w:w="2459"/>
           </w:tcPr>
           <w:p>
             <w:r>
               <w:rPr>
                 <w:sz w:val="16"/>
               </w:rPr>
-              <w:t>Understand</w:t>
+              <w:t>Conveyor</w:t>
+            </w:r>
+          </w:p>
+        </w:tc>
+        <w:tc>
+          <w:tcPr>
+            <w:tcW w:type="dxa" w:w="2459"/>
+          </w:tcPr>
+          <w:p>
+            <w:r>
+              <w:rPr>
+                <w:sz w:val="16"/>
+              </w:rPr>
+              <w:t>Camera</w:t>
             </w:r>
           </w:p>
         </w:tc>
@@ -185,43 +848,53 @@
       <w:tr>
         <w:tc>
           <w:tcPr>
-            <w:tcW w:type="dxa" w:w="3331"/>
-            <w:vAlign w:val="center"/>
+            <w:tcW w:type="dxa" w:w="2459"/>
           </w:tcPr>
           <w:p>
             <w:r>
               <w:rPr>
                 <w:sz w:val="16"/>
               </w:rPr>
-              <w:t>00:45–01:45</w:t>
+              <w:t>01:50–02:05</w:t>
             </w:r>
           </w:p>
         </w:tc>
         <w:tc>
           <w:tcPr>
-            <w:tcW w:type="dxa" w:w="3331"/>
-            <w:vAlign w:val="center"/>
+            <w:tcW w:type="dxa" w:w="2459"/>
           </w:tcPr>
           <w:p>
             <w:r>
               <w:rPr>
                 <w:sz w:val="16"/>
               </w:rPr>
-              <w:t>3 × 20 min stations</w:t>
+              <w:t>Conveyor</w:t>
             </w:r>
           </w:p>
         </w:tc>
         <w:tc>
           <w:tcPr>
-            <w:tcW w:type="dxa" w:w="3331"/>
-            <w:vAlign w:val="center"/>
+            <w:tcW w:type="dxa" w:w="2459"/>
           </w:tcPr>
           <w:p>
             <w:r>
               <w:rPr>
                 <w:sz w:val="16"/>
               </w:rPr>
-              <w:t>Try hardware/simulation</w:t>
+              <w:t>Camera</w:t>
+            </w:r>
+          </w:p>
+        </w:tc>
+        <w:tc>
+          <w:tcPr>
+            <w:tcW w:type="dxa" w:w="2459"/>
+          </w:tcPr>
+          <w:p>
+            <w:r>
+              <w:rPr>
+                <w:sz w:val="16"/>
+              </w:rPr>
+              <w:t>Robot</w:t>
             </w:r>
           </w:p>
         </w:tc>
@@ -229,239 +902,61 @@
       <w:tr>
         <w:tc>
           <w:tcPr>
-            <w:tcW w:type="dxa" w:w="3331"/>
-            <w:vAlign w:val="center"/>
+            <w:tcW w:type="dxa" w:w="2459"/>
           </w:tcPr>
           <w:p>
             <w:r>
               <w:rPr>
                 <w:sz w:val="16"/>
               </w:rPr>
-              <w:t>01:45–01:55</w:t>
+              <w:t>02:05–02:20</w:t>
             </w:r>
           </w:p>
         </w:tc>
         <w:tc>
           <w:tcPr>
-            <w:tcW w:type="dxa" w:w="3331"/>
-            <w:vAlign w:val="center"/>
+            <w:tcW w:type="dxa" w:w="2459"/>
           </w:tcPr>
           <w:p>
             <w:r>
               <w:rPr>
                 <w:sz w:val="16"/>
               </w:rPr>
-              <w:t>Break</w:t>
+              <w:t>Camera</w:t>
             </w:r>
           </w:p>
         </w:tc>
         <w:tc>
           <w:tcPr>
-            <w:tcW w:type="dxa" w:w="3331"/>
-            <w:vAlign w:val="center"/>
+            <w:tcW w:type="dxa" w:w="2459"/>
           </w:tcPr>
           <w:p>
             <w:r>
               <w:rPr>
                 <w:sz w:val="16"/>
               </w:rPr>
+              <w:t>Robot</w:t>
             </w:r>
           </w:p>
         </w:tc>
-      </w:tr>
-      <w:tr>
         <w:tc>
           <w:tcPr>
-            <w:tcW w:type="dxa" w:w="3331"/>
-            <w:vAlign w:val="center"/>
+            <w:tcW w:type="dxa" w:w="2459"/>
           </w:tcPr>
           <w:p>
             <w:r>
               <w:rPr>
                 <w:sz w:val="16"/>
               </w:rPr>
-              <w:t>01:55–02:20</w:t>
-            </w:r>
-          </w:p>
-        </w:tc>
-        <w:tc>
-          <w:tcPr>
-            <w:tcW w:type="dxa" w:w="3331"/>
-            <w:vAlign w:val="center"/>
-          </w:tcPr>
-          <w:p>
-            <w:r>
-              <w:rPr>
-                <w:sz w:val="16"/>
-              </w:rPr>
-              <w:t>Make a sorting rule</w:t>
-            </w:r>
-          </w:p>
-        </w:tc>
-        <w:tc>
-          <w:tcPr>
-            <w:tcW w:type="dxa" w:w="3331"/>
-            <w:vAlign w:val="center"/>
-          </w:tcPr>
-          <w:p>
-            <w:r>
-              <w:rPr>
-                <w:sz w:val="16"/>
-              </w:rPr>
-              <w:t>Write if / else</w:t>
-            </w:r>
-          </w:p>
-        </w:tc>
-      </w:tr>
-      <w:tr>
-        <w:tc>
-          <w:tcPr>
-            <w:tcW w:type="dxa" w:w="3331"/>
-            <w:vAlign w:val="center"/>
-          </w:tcPr>
-          <w:p>
-            <w:r>
-              <w:rPr>
-                <w:sz w:val="16"/>
-              </w:rPr>
-              <w:t>02:20–03:05</w:t>
-            </w:r>
-          </w:p>
-        </w:tc>
-        <w:tc>
-          <w:tcPr>
-            <w:tcW w:type="dxa" w:w="3331"/>
-            <w:vAlign w:val="center"/>
-          </w:tcPr>
-          <w:p>
-            <w:r>
-              <w:rPr>
-                <w:sz w:val="16"/>
-              </w:rPr>
-              <w:t>Five-cycle sorter</w:t>
-            </w:r>
-          </w:p>
-        </w:tc>
-        <w:tc>
-          <w:tcPr>
-            <w:tcW w:type="dxa" w:w="3331"/>
-            <w:vAlign w:val="center"/>
-          </w:tcPr>
-          <w:p>
-            <w:r>
-              <w:rPr>
-                <w:sz w:val="16"/>
-              </w:rPr>
-              <w:t>Test</w:t>
-            </w:r>
-          </w:p>
-        </w:tc>
-      </w:tr>
-      <w:tr>
-        <w:tc>
-          <w:tcPr>
-            <w:tcW w:type="dxa" w:w="3331"/>
-            <w:vAlign w:val="center"/>
-          </w:tcPr>
-          <w:p>
-            <w:r>
-              <w:rPr>
-                <w:sz w:val="16"/>
-              </w:rPr>
-              <w:t>03:05–03:35</w:t>
-            </w:r>
-          </w:p>
-        </w:tc>
-        <w:tc>
-          <w:tcPr>
-            <w:tcW w:type="dxa" w:w="3331"/>
-            <w:vAlign w:val="center"/>
-          </w:tcPr>
-          <w:p>
-            <w:r>
-              <w:rPr>
-                <w:sz w:val="16"/>
-              </w:rPr>
-              <w:t>Team challenges</w:t>
-            </w:r>
-          </w:p>
-        </w:tc>
-        <w:tc>
-          <w:tcPr>
-            <w:tcW w:type="dxa" w:w="3331"/>
-            <w:vAlign w:val="center"/>
-          </w:tcPr>
-          <w:p>
-            <w:r>
-              <w:rPr>
-                <w:sz w:val="16"/>
-              </w:rPr>
-              <w:t>Improve</w:t>
-            </w:r>
-          </w:p>
-        </w:tc>
-      </w:tr>
-      <w:tr>
-        <w:tc>
-          <w:tcPr>
-            <w:tcW w:type="dxa" w:w="3331"/>
-            <w:vAlign w:val="center"/>
-          </w:tcPr>
-          <w:p>
-            <w:r>
-              <w:rPr>
-                <w:sz w:val="16"/>
-              </w:rPr>
-              <w:t>03:35–04:00</w:t>
-            </w:r>
-          </w:p>
-        </w:tc>
-        <w:tc>
-          <w:tcPr>
-            <w:tcW w:type="dxa" w:w="3331"/>
-            <w:vAlign w:val="center"/>
-          </w:tcPr>
-          <w:p>
-            <w:r>
-              <w:rPr>
-                <w:sz w:val="16"/>
-              </w:rPr>
-              <w:t>Demos &amp; reflection</w:t>
-            </w:r>
-          </w:p>
-        </w:tc>
-        <w:tc>
-          <w:tcPr>
-            <w:tcW w:type="dxa" w:w="3331"/>
-            <w:vAlign w:val="center"/>
-          </w:tcPr>
-          <w:p>
-            <w:r>
-              <w:rPr>
-                <w:sz w:val="16"/>
-              </w:rPr>
-              <w:t>Explain CPS</w:t>
+              <w:t>Conveyor</w:t>
             </w:r>
           </w:p>
         </w:tc>
       </w:tr>
     </w:tbl>
     <w:p>
-      <w:pPr>
-        <w:pStyle w:val="Heading1"/>
-      </w:pPr>
       <w:r>
-        <w:t>Group rotation</w:t>
-      </w:r>
-    </w:p>
-    <w:p>
-      <w:r>
-        <w:t>Team 1: A → B → C; Team 2: B → C → A; Team 3: C → A → B. Two students per team; rotate operator and observer every 10 minutes.</w:t>
-      </w:r>
-    </w:p>
-    <w:p>
-      <w:r>
-        <w:br w:type="page"/>
+        <w:t>Robot question: How easy is it to reach the same target twice? Conveyor question: Does a sensor trigger guarantee a repeatable stopping position? Camera question: Which change makes recognition less reliable? Each pair records one observation and one improvement.</w:t>
       </w:r>
     </w:p>
     <w:p>
@@ -469,32 +964,22 @@
         <w:pStyle w:val="Heading1"/>
       </w:pPr>
       <w:r>
-        <w:t>Instructor preflight</w:t>
+        <w:t>5. Sorting and independent challenges</w:t>
       </w:r>
     </w:p>
     <w:p>
       <w:r>
-        <w:t>1. Install Python and run python -m workshop on each student laptop; instructor runs pytest before class.</w:t>
+        <w:t>At 02:20, return all pairs to their laptops. Start with the unchanged exercise 04. Ask for predicted counts before execution, then reverse the destinations. Explain that the mapping accepts known labels and sends everything else to reject. Use exercise 05 for visible feedback. Students edit Python, rerun and reload the generated page; the page does not control real hardware.</w:t>
       </w:r>
     </w:p>
     <w:p>
       <w:r>
-        <w:t>2. Test all camera, EV3 and robot hardware before enabling motion. See docs/acceptance.md.</w:t>
+        <w:t>For fast pairs, use the six graded challenges on the worksheet. Complete reversing and counting first. Then introduce green, invalid/missing readings, new sequences or a reliability improvement. Do not require every pair to finish all six.</w:t>
       </w:r>
     </w:p>
     <w:p>
       <w:r>
-        <w:t>3. Secure table, enforce exclusion zone, confirm accessible power disconnect.</w:t>
-      </w:r>
-    </w:p>
-    <w:p>
-      <w:r>
-        <w:t>4. Prepare 20–30 mm colored blocks, a stop guide, and fixed lighting.</w:t>
-      </w:r>
-    </w:p>
-    <w:p>
-      <w:r>
-        <w:t>5. Keep paper copies and offline simulation available for every team.</w:t>
+        <w:t>Expected baseline counts and current examples are in the tested exercise files. After editing a sequence, count it by hand first. Counts must sum to the sequence length, unknown/missing/invalid readings must be rejected, and changing a recognized color's destination must change its route.</w:t>
       </w:r>
     </w:p>
     <w:p>
@@ -502,172 +987,67 @@
         <w:pStyle w:val="Heading1"/>
       </w:pPr>
       <w:r>
-        <w:t>Safe sorting cycle</w:t>
-      </w:r>
-    </w:p>
-    <w:p>
-      <w:pPr>
-        <w:spacing w:after="20"/>
-        <w:jc w:val="center"/>
-      </w:pPr>
-      <w:r>
-        <w:drawing>
-          <wp:inline xmlns:a="http://schemas.openxmlformats.org/drawingml/2006/main" xmlns:pic="http://schemas.openxmlformats.org/drawingml/2006/picture">
-            <wp:extent cx="5394960" cy="1971491"/>
-            <wp:docPr id="2" name="Picture 2"/>
-            <wp:cNvGraphicFramePr>
-              <a:graphicFrameLocks noChangeAspect="1"/>
-            </wp:cNvGraphicFramePr>
-            <a:graphic>
-              <a:graphicData uri="http://schemas.openxmlformats.org/drawingml/2006/picture">
-                <pic:pic>
-                  <pic:nvPicPr>
-                    <pic:cNvPr id="0" name="safe-sort-cycle.png"/>
-                    <pic:cNvPicPr/>
-                  </pic:nvPicPr>
-                  <pic:blipFill>
-                    <a:blip r:embed="rId11"/>
-                    <a:stretch>
-                      <a:fillRect/>
-                    </a:stretch>
-                  </pic:blipFill>
-                  <pic:spPr>
-                    <a:xfrm>
-                      <a:off x="0" y="0"/>
-                      <a:ext cx="5394960" cy="1971491"/>
-                    </a:xfrm>
-                    <a:prstGeom prst="rect"/>
-                  </pic:spPr>
-                </pic:pic>
-              </a:graphicData>
-            </a:graphic>
-          </wp:inline>
-        </w:drawing>
+        <w:t>6. Closing and readiness record</w:t>
       </w:r>
     </w:p>
     <w:p>
       <w:r>
-        <w:t>Missing images, unknown detections, or obstructions never trigger an unvalidated motion.</w:t>
-      </w:r>
-    </w:p>
-    <w:p>
-      <w:pPr>
-        <w:pStyle w:val="Heading1"/>
-      </w:pPr>
-      <w:r>
-        <w:t>Minimal reliable demo</w:t>
-      </w:r>
-    </w:p>
-    <w:p>
-      <w:pPr>
-        <w:spacing w:after="60"/>
-        <w:ind w:left="317"/>
-      </w:pPr>
-      <w:r>
-        <w:rPr>
-          <w:rFonts w:ascii="DejaVu Sans Mono" w:hAnsi="DejaVu Sans Mono"/>
-          <w:color w:val="197F80"/>
-          <w:sz w:val="16"/>
-        </w:rPr>
-        <w:t>python -m workshop</w:t>
-        <w:br/>
-      </w:r>
-      <w:r>
-        <w:rPr>
-          <w:rFonts w:ascii="DejaVu Sans Mono" w:hAnsi="DejaVu Sans Mono"/>
-          <w:color w:val="197F80"/>
-          <w:sz w:val="16"/>
-        </w:rPr>
-        <w:t>python exercises/01_python.py</w:t>
-        <w:br/>
-      </w:r>
-      <w:r>
-        <w:rPr>
-          <w:rFonts w:ascii="DejaVu Sans Mono" w:hAnsi="DejaVu Sans Mono"/>
-          <w:color w:val="197F80"/>
-          <w:sz w:val="16"/>
-        </w:rPr>
-        <w:t>python exercises/02_robot.py</w:t>
-        <w:br/>
-      </w:r>
-      <w:r>
-        <w:rPr>
-          <w:rFonts w:ascii="DejaVu Sans Mono" w:hAnsi="DejaVu Sans Mono"/>
-          <w:color w:val="197F80"/>
-          <w:sz w:val="16"/>
-        </w:rPr>
-        <w:t>python exercises/03_vision.py</w:t>
-        <w:br/>
-      </w:r>
-      <w:r>
-        <w:rPr>
-          <w:rFonts w:ascii="DejaVu Sans Mono" w:hAnsi="DejaVu Sans Mono"/>
-          <w:color w:val="197F80"/>
-          <w:sz w:val="16"/>
-        </w:rPr>
-        <w:t>python exercises/04_sort.py</w:t>
-        <w:br/>
-      </w:r>
-    </w:p>
-    <w:p>
-      <w:pPr>
-        <w:pStyle w:val="Heading1"/>
-      </w:pPr>
-      <w:r>
-        <w:t>Not yet demonstrated physically</w:t>
+        <w:t>At 03:45, allow 2–3 minutes per pair. Each pair shows a changed rule, one prediction versus result, and a possible failure response. Close with the most advanced physical demonstration accepted that day, or the visual simulator.</w:t>
       </w:r>
     </w:p>
     <w:p>
       <w:r>
-        <w:t>HERO10 transport, EV3 movement, SO-ARM101 teleoperation and autonomous gripping must be bench-validated. The PowerPoint shows schematics, not photos of a completed sorter.</w:t>
+        <w:t>Before class, tick only what you have actually checked:</w:t>
+      </w:r>
+    </w:p>
+    <w:p>
+      <w:r>
+        <w:t>[ ] All three laptops pass the offline commands and edit / rerun test.</w:t>
+      </w:r>
+    </w:p>
+    <w:p>
+      <w:r>
+        <w:t>[ ] Eight slides open correctly on the projector.</w:t>
+      </w:r>
+    </w:p>
+    <w:p>
+      <w:r>
+        <w:t>[ ] Six one-page worksheets are printed.</w:t>
+      </w:r>
+    </w:p>
+    <w:p>
+      <w:r>
+        <w:t>[ ] Red, blue and unknown objects are prepared and fit the station.</w:t>
+      </w:r>
+    </w:p>
+    <w:p>
+      <w:r>
+        <w:t>[ ] Camera, robot and conveyor each have an accepted demonstration or fallback.</w:t>
+      </w:r>
+    </w:p>
+    <w:p>
+      <w:r>
+        <w:t>[ ] USB student bundle and image examples are available without networking.</w:t>
+      </w:r>
+    </w:p>
+    <w:p>
+      <w:r>
+        <w:t>[ ] Pairs and rotation order are assigned.</w:t>
+      </w:r>
+    </w:p>
+    <w:p>
+      <w:r>
+        <w:t>Student success means a tested five-object simulated sorter and a clear explanation. Hardware integration remains instructor infrastructure; students do not need to learn ROS during this session.</w:t>
       </w:r>
     </w:p>
     <w:sectPr>
-      <w:headerReference w:type="default" r:id="rId9"/>
-      <w:footerReference w:type="default" r:id="rId12"/>
-      <w:pgSz w:w="12240" w:h="15840"/>
-      <w:pgMar w:top="792" w:right="1123" w:bottom="864" w:left="1123" w:header="720" w:footer="720" w:gutter="0"/>
+      <w:pgSz w:w="11909" w:h="16834"/>
+      <w:pgMar w:top="936" w:right="1037" w:bottom="936" w:left="1037" w:header="720" w:footer="720" w:gutter="0"/>
       <w:cols w:space="720"/>
       <w:docGrid w:linePitch="360"/>
     </w:sectPr>
   </w:body>
 </w:document>
-</file>
-
-<file path=word/footer1.xml><?xml version="1.0" encoding="utf-8"?>
-<w:ftr xmlns:m="http://schemas.openxmlformats.org/officeDocument/2006/math" xmlns:mc="http://schemas.openxmlformats.org/markup-compatibility/2006" xmlns:mo="http://schemas.microsoft.com/office/mac/office/2008/main" xmlns:mv="urn:schemas-microsoft-com:mac:vml" xmlns:o="urn:schemas-microsoft-com:office:office" xmlns:r="http://schemas.openxmlformats.org/officeDocument/2006/relationships" xmlns:v="urn:schemas-microsoft-com:vml" xmlns:w10="urn:schemas-microsoft-com:office:word" xmlns:w14="http://schemas.microsoft.com/office/word/2010/wordml" xmlns:w="http://schemas.openxmlformats.org/wordprocessingml/2006/main" xmlns:wne="http://schemas.microsoft.com/office/word/2006/wordml" xmlns:wp14="http://schemas.microsoft.com/office/word/2010/wordprocessingDrawing" xmlns:wp="http://schemas.openxmlformats.org/drawingml/2006/wordprocessingDrawing" xmlns:wpc="http://schemas.microsoft.com/office/word/2010/wordprocessingCanvas" xmlns:wpg="http://schemas.microsoft.com/office/word/2010/wordprocessingGroup" xmlns:wpi="http://schemas.microsoft.com/office/word/2010/wordprocessingInk" xmlns:wps="http://schemas.microsoft.com/office/word/2010/wordprocessingShape" mc:Ignorable="w14 wp14">
-  <w:p>
-    <w:pPr>
-      <w:pStyle w:val="Footer"/>
-      <w:jc w:val="right"/>
-    </w:pPr>
-    <w:r>
-      <w:rPr>
-        <w:color w:val="607383"/>
-        <w:sz w:val="14"/>
-      </w:rPr>
-      <w:t>T17(1) | Exciting Science 2026  ·  Workshop draft</w:t>
-    </w:r>
-  </w:p>
-</w:ftr>
-</file>
-
-<file path=word/header1.xml><?xml version="1.0" encoding="utf-8"?>
-<w:hdr xmlns:m="http://schemas.openxmlformats.org/officeDocument/2006/math" xmlns:mc="http://schemas.openxmlformats.org/markup-compatibility/2006" xmlns:mo="http://schemas.microsoft.com/office/mac/office/2008/main" xmlns:mv="urn:schemas-microsoft-com:mac:vml" xmlns:o="urn:schemas-microsoft-com:office:office" xmlns:r="http://schemas.openxmlformats.org/officeDocument/2006/relationships" xmlns:v="urn:schemas-microsoft-com:vml" xmlns:w10="urn:schemas-microsoft-com:office:word" xmlns:w14="http://schemas.microsoft.com/office/word/2010/wordml" xmlns:w="http://schemas.openxmlformats.org/wordprocessingml/2006/main" xmlns:wne="http://schemas.microsoft.com/office/word/2006/wordml" xmlns:wp14="http://schemas.microsoft.com/office/word/2010/wordprocessingDrawing" xmlns:wp="http://schemas.openxmlformats.org/drawingml/2006/wordprocessingDrawing" xmlns:wpc="http://schemas.microsoft.com/office/word/2010/wordprocessingCanvas" xmlns:wpg="http://schemas.microsoft.com/office/word/2010/wordprocessingGroup" xmlns:wpi="http://schemas.microsoft.com/office/word/2010/wordprocessingInk" xmlns:wps="http://schemas.microsoft.com/office/word/2010/wordprocessingShape" mc:Ignorable="w14 wp14">
-  <w:p>
-    <w:pPr>
-      <w:pStyle w:val="Header"/>
-    </w:pPr>
-    <w:r>
-      <w:rPr>
-        <w:rFonts w:ascii="DejaVu Sans" w:hAnsi="DejaVu Sans"/>
-        <w:color w:val="197F80"/>
-        <w:sz w:val="15"/>
-      </w:rPr>
-      <w:t>MONTANUNIVERSITÄT LEOBEN  /  CYBER-PHYSICAL SYSTEMS</w:t>
-    </w:r>
-  </w:p>
-</w:hdr>
 </file>
 
 <file path=word/numbering.xml><?xml version="1.0" encoding="utf-8"?>
@@ -1034,12 +1414,12 @@
     <w:qFormat/>
     <w:rsid w:val="00FC693F"/>
     <w:pPr>
-      <w:spacing w:after="80"/>
+      <w:spacing w:after="120" w:line="259" w:lineRule="auto"/>
     </w:pPr>
     <w:rPr>
       <w:rFonts w:ascii="DejaVu Sans" w:hAnsi="DejaVu Sans"/>
-      <w:color w:val="273C4D"/>
-      <w:sz w:val="18"/>
+      <w:color w:val="17354B"/>
+      <w:sz w:val="20"/>
     </w:rPr>
   </w:style>
   <w:style w:type="paragraph" w:styleId="Header">
@@ -1097,7 +1477,7 @@
     <w:pPr>
       <w:keepNext/>
       <w:keepLines/>
-      <w:spacing w:before="140" w:after="40"/>
+      <w:spacing w:before="140" w:after="120"/>
       <w:outlineLvl w:val="0"/>
     </w:pPr>
     <w:rPr>
@@ -1105,7 +1485,7 @@
       <w:b/>
       <w:bCs/>
       <w:color w:val="17354B"/>
-      <w:sz w:val="26"/>
+      <w:sz w:val="30"/>
       <w:szCs w:val="28"/>
     </w:rPr>
   </w:style>
@@ -1121,7 +1501,7 @@
     <w:pPr>
       <w:keepNext/>
       <w:keepLines/>
-      <w:spacing w:before="200" w:after="0"/>
+      <w:spacing w:before="200" w:after="120"/>
       <w:outlineLvl w:val="1"/>
     </w:pPr>
     <w:rPr>
@@ -1129,7 +1509,7 @@
       <w:b/>
       <w:bCs/>
       <w:color w:val="17354B"/>
-      <w:sz w:val="22"/>
+      <w:sz w:val="24"/>
       <w:szCs w:val="26"/>
     </w:rPr>
   </w:style>
@@ -1383,10 +1763,7 @@
     <w:qFormat/>
     <w:rsid w:val="00FC693F"/>
     <w:pPr>
-      <w:pBdr>
-        <w:bottom w:val="single" w:sz="8" w:space="4" w:color="4F81BD" w:themeColor="accent1"/>
-      </w:pBdr>
-      <w:spacing w:after="300" w:line="240" w:lineRule="auto"/>
+      <w:spacing w:after="120" w:line="240" w:lineRule="auto"/>
       <w:contextualSpacing/>
     </w:pPr>
     <w:rPr>
@@ -1394,7 +1771,7 @@
       <w:color w:val="17354B"/>
       <w:spacing w:val="5"/>
       <w:kern w:val="28"/>
-      <w:sz w:val="46"/>
+      <w:sz w:val="48"/>
       <w:szCs w:val="52"/>
     </w:rPr>
   </w:style>
@@ -1870,9 +2247,6 @@
     <w:qFormat/>
     <w:rsid w:val="00FC693F"/>
     <w:pPr>
-      <w:pBdr>
-        <w:bottom w:val="single" w:sz="4" w:space="4" w:color="4F81BD" w:themeColor="accent1"/>
-      </w:pBdr>
       <w:spacing w:before="200" w:after="280"/>
       <w:ind w:left="936" w:right="936"/>
     </w:pPr>

</xml_diff>

<commit_message>
Build progressive beginner notebooks and printable workshop activities
</commit_message>
<xml_diff>
--- a/docs/instructor-guide.docx
+++ b/docs/instructor-guide.docx
@@ -7,12 +7,17 @@
         <w:pStyle w:val="Title"/>
       </w:pPr>
       <w:r>
-        <w:t>Instructor runbook: Autonomous Robot Sorting</w:t>
+        <w:t>Teaching the sorting factory workshop</w:t>
       </w:r>
     </w:p>
     <w:p>
       <w:r>
-        <w:t>Thursday, 22 October 2026. Four hours, six first-semester bachelor students, three pairs. Use the timed lesson plan, eight introductory slides and one-page worksheet. English student instructions. No programming or ROS prerequisite.</w:t>
+        <w:t>22 October 2026 · Four hours · First semester · No programming or robotics prerequisites</w:t>
+      </w:r>
+    </w:p>
+    <w:p>
+      <w:r>
+        <w:t>The class learns by predicting a small change, running it, and explaining visible results. Use the student notebook as the main route. The separate instructor notebook adds answers beside the same activities. Pair one student who types with one who predicts and have them swap roles each activity. Success means an explained, tested result, not finishing every optional challenge.</w:t>
       </w:r>
     </w:p>
     <w:p>
@@ -20,37 +25,17 @@
         <w:pStyle w:val="Heading1"/>
       </w:pPr>
       <w:r>
-        <w:t>1. Before students arrive</w:t>
+        <w:t>Prepare before the class</w:t>
       </w:r>
     </w:p>
     <w:p>
       <w:r>
-        <w:t>Prepare Python 3.11 or newer and a text editor on each laptop. Open a terminal in the repository or extracted student bundle. Use the same tested Python command throughout the session (</w:t>
-      </w:r>
-      <w:r>
-        <w:rPr>
-          <w:rFonts w:ascii="DejaVu Sans Mono" w:hAnsi="DejaVu Sans Mono"/>
-          <w:sz w:val="18"/>
-        </w:rPr>
-        <w:t>python</w:t>
-      </w:r>
-      <w:r>
-        <w:t xml:space="preserve">, or </w:t>
-      </w:r>
-      <w:r>
-        <w:rPr>
-          <w:rFonts w:ascii="DejaVu Sans Mono" w:hAnsi="DejaVu Sans Mono"/>
-          <w:sz w:val="18"/>
-        </w:rPr>
-        <w:t>python3</w:t>
-      </w:r>
-      <w:r>
-        <w:t xml:space="preserve"> where required). No package installation or internet should be necessary in class.</w:t>
+        <w:t>Give every pair an extracted student ZIP and an already prepared Python environment. Jupyter and Matplotlib need dependencies; the lesson works without internet after preparation. The plain Python scripts and HTML animation need only Python 3.11 or newer. Do not spend classroom time installing packages.</w:t>
       </w:r>
     </w:p>
     <w:p>
       <w:r>
-        <w:t>Run these commands on each student laptop, with networking disconnected:</w:t>
+        <w:t>On the classroom computer prepare a dedicated environment, separate from any robot or ROS environment:</w:t>
       </w:r>
     </w:p>
     <w:p>
@@ -59,7 +44,7 @@
           <w:rFonts w:ascii="DejaVu Sans Mono" w:hAnsi="DejaVu Sans Mono"/>
           <w:sz w:val="17"/>
         </w:rPr>
-        <w:t>python --version</w:t>
+        <w:t>python3 -m venv .venv-workshop</w:t>
       </w:r>
     </w:p>
     <w:p>
@@ -68,7 +53,7 @@
           <w:rFonts w:ascii="DejaVu Sans Mono" w:hAnsi="DejaVu Sans Mono"/>
           <w:sz w:val="17"/>
         </w:rPr>
-        <w:t>python exercises/check_setup.py</w:t>
+        <w:t>.venv-workshop/bin/python -m pip install -r notebooks/requirements.txt</w:t>
       </w:r>
     </w:p>
     <w:p>
@@ -77,7 +62,7 @@
           <w:rFonts w:ascii="DejaVu Sans Mono" w:hAnsi="DejaVu Sans Mono"/>
           <w:sz w:val="17"/>
         </w:rPr>
-        <w:t>python exercises/01_python.py</w:t>
+        <w:t>.venv-workshop/bin/python tools/verify_notebooks.py</w:t>
       </w:r>
     </w:p>
     <w:p>
@@ -86,7 +71,27 @@
           <w:rFonts w:ascii="DejaVu Sans Mono" w:hAnsi="DejaVu Sans Mono"/>
           <w:sz w:val="17"/>
         </w:rPr>
-        <w:t>python exercises/02_robot.py</w:t>
+        <w:t>.venv-workshop/bin/python exercises/make_student_bundle.py --output docs/student-workshop.zip</w:t>
+      </w:r>
+    </w:p>
+    <w:p>
+      <w:r>
+        <w:t xml:space="preserve">Copy the ZIP to student machines and extract it. Prepare the same dependencies on those machines before class; a virtual environment copied from another machine is not portable. On Windows the environment Python is </w:t>
+      </w:r>
+      <w:r>
+        <w:rPr>
+          <w:rFonts w:ascii="DejaVu Sans Mono" w:hAnsi="DejaVu Sans Mono"/>
+          <w:sz w:val="18"/>
+        </w:rPr>
+        <w:t>.venv-workshop\Scripts\python.exe</w:t>
+      </w:r>
+      <w:r>
+        <w:t>. Install using that Python and the same requirements file.</w:t>
+      </w:r>
+    </w:p>
+    <w:p>
+      <w:r>
+        <w:t>Launch from the extracted folder:</w:t>
       </w:r>
     </w:p>
     <w:p>
@@ -95,7 +100,259 @@
           <w:rFonts w:ascii="DejaVu Sans Mono" w:hAnsi="DejaVu Sans Mono"/>
           <w:sz w:val="17"/>
         </w:rPr>
-        <w:t>python exercises/03_vision.py</w:t>
+        <w:t>.venv-workshop/bin/python notebooks/launch.py</w:t>
+      </w:r>
+    </w:p>
+    <w:p>
+      <w:r>
+        <w:t xml:space="preserve">If Jupyter is already prepared under another interpreter, run that interpreter followed by </w:t>
+      </w:r>
+      <w:r>
+        <w:rPr>
+          <w:rFonts w:ascii="DejaVu Sans Mono" w:hAnsi="DejaVu Sans Mono"/>
+          <w:sz w:val="18"/>
+        </w:rPr>
+        <w:t>notebooks/launch.py</w:t>
+      </w:r>
+      <w:r>
+        <w:t>. The launcher opens the student notebook in JupyterLab with the bundle folder as its root. On Windows use the prepared Python executable with the same argument. Make a team copy with File → Save Notebook As; retain the original. Restarting the kernel clears memory, not saved file edits. Keep the instructor notebook away from the learner ZIP.</w:t>
+      </w:r>
+    </w:p>
+    <w:p>
+      <w:r>
+        <w:t>Before students arrive, open the notebook, run setup and the first mission, and check that the bins appear. Confirm that a fresh copy runs top to bottom. Print one worksheet per pair. Project the eight introduction slides. If hardware is unavailable, use the station photograph, paper objects and notebook simulation for all rotations. Only the instructor controls physical equipment; autonomous physical sorting is not established by these notebook checks.</w:t>
+      </w:r>
+    </w:p>
+    <w:p>
+      <w:pPr>
+        <w:pStyle w:val="Heading1"/>
+      </w:pPr>
+      <w:r>
+        <w:t>Introduction 25 minutes</w:t>
+      </w:r>
+    </w:p>
+    <w:p>
+      <w:r>
+        <w:t>Use the eight slide deck and its speaker notes. Ask students how they would sort one object by hand. Build observe → decide → act → check from their answers. Point out the camera, conveyor and robot in the real station photograph. Define sensor as something that measures and actuator as something that changes the world. Ask what should happen when a camera report is missing. Finish by showing exactly how to open a team copy, click a code cell, press Shift+Enter, find output and save.</w:t>
+      </w:r>
+    </w:p>
+    <w:p>
+      <w:pPr>
+        <w:pStyle w:val="Heading1"/>
+      </w:pPr>
+      <w:r>
+        <w:t>A First instructions 25 minutes</w:t>
+      </w:r>
+    </w:p>
+    <w:p>
+      <w:r>
+        <w:t xml:space="preserve">Allow 5 minutes for the one-line worked example and notebook controls, 8 minutes for reading and running the original mission, 8 minutes for individual changes and 4 minutes for pair explanation. Ask “What will the last object number be?” before running. Point to a single </w:t>
+      </w:r>
+      <w:r>
+        <w:rPr>
+          <w:rFonts w:ascii="DejaVu Sans Mono" w:hAnsi="DejaVu Sans Mono"/>
+          <w:sz w:val="18"/>
+        </w:rPr>
+        <w:t>=</w:t>
+      </w:r>
+      <w:r>
+        <w:t xml:space="preserve"> storing a value, a double </w:t>
+      </w:r>
+      <w:r>
+        <w:rPr>
+          <w:rFonts w:ascii="DejaVu Sans Mono" w:hAnsi="DejaVu Sans Mono"/>
+          <w:sz w:val="18"/>
+        </w:rPr>
+        <w:t>==</w:t>
+      </w:r>
+      <w:r>
+        <w:t xml:space="preserve"> asking a question, quotes marking text and four spaces grouping a loop body. Avoid introducing concepts that have not appeared yet.</w:t>
+      </w:r>
+    </w:p>
+    <w:p>
+      <w:r>
+        <w:t xml:space="preserve">Expected original output: object numbers 1, 2, 3 and decision left. Five repetitions produce 1–5; blue chooses right; yellow chooses reject. Green extension uses another </w:t>
+      </w:r>
+      <w:r>
+        <w:rPr>
+          <w:rFonts w:ascii="DejaVu Sans Mono" w:hAnsi="DejaVu Sans Mono"/>
+          <w:sz w:val="18"/>
+        </w:rPr>
+        <w:t>elif COLOR == "green":</w:t>
+      </w:r>
+      <w:r>
+        <w:t xml:space="preserve"> before else and an indented </w:t>
+      </w:r>
+      <w:r>
+        <w:rPr>
+          <w:rFonts w:ascii="DejaVu Sans Mono" w:hAnsi="DejaVu Sans Mono"/>
+          <w:sz w:val="18"/>
+        </w:rPr>
+        <w:t>destination = "left"</w:t>
+      </w:r>
+      <w:r>
+        <w:t xml:space="preserve">. First hint: change only the value on the right of </w:t>
+      </w:r>
+      <w:r>
+        <w:rPr>
+          <w:rFonts w:ascii="DejaVu Sans Mono" w:hAnsi="DejaVu Sans Mono"/>
+          <w:sz w:val="18"/>
+        </w:rPr>
+        <w:t>=</w:t>
+      </w:r>
+      <w:r>
+        <w:t>. Second hint: point to the quoted color. Ask a student to explain why changing a name label does not change the repeat count.</w:t>
+      </w:r>
+    </w:p>
+    <w:p>
+      <w:r>
+        <w:t>If a quote is missing, read the last error line aloud, repair one quote and rerun. If indentation changes, compare the line with the clean original. Demonstrate this once; do not treat an error as failure.</w:t>
+      </w:r>
+    </w:p>
+    <w:p>
+      <w:pPr>
+        <w:pStyle w:val="Heading1"/>
+      </w:pPr>
+      <w:r>
+        <w:t>B Camera information 35 minutes</w:t>
+      </w:r>
+    </w:p>
+    <w:p>
+      <w:r>
+        <w:t>Spend 8 minutes comparing the real photograph crops and their human labels, 12 minutes on the five simulated reports, 10 minutes on actual versus reported color, and 5 minutes sharing explanations. The photograph contains real colored objects; the lists are controlled simulated sensor reports, not an implemented image classifier.</w:t>
+      </w:r>
+    </w:p>
+    <w:p>
+      <w:r>
+        <w:t>Default counts: left 2, right 2, reject 1. Changing the second blue report to red produces 3, 1, 1. Adding green without a rule adds a reject. Reverse the two destination variables to flip individual actions. For green insert an elif before else; preserve fallback rejection. In the actual/report experiment, changing only the first report from red to blue sends an actual red object right. Changing it to None rejects it. A believable incorrect report is not detectable by this routing rule alone.</w:t>
+      </w:r>
+    </w:p>
+    <w:p>
+      <w:r>
+        <w:t>First hint: trace one list item through its condition. Second hint: underline the report and destination separately. Ask “Did the program do the wrong thing, or did it receive wrong information?” Invite lighting, shadows and occlusion examples. Do not claim the human crop labels are measured recognition accuracy.</w:t>
+      </w:r>
+    </w:p>
+    <w:p>
+      <w:pPr>
+        <w:pStyle w:val="Heading1"/>
+      </w:pPr>
+      <w:r>
+        <w:t>Break 10 minutes</w:t>
+      </w:r>
+    </w:p>
+    <w:p>
+      <w:r>
+        <w:t>Save work. Display the three rotation groups and their starting stations. Keep a clean original ready for students who need recovery.</w:t>
+      </w:r>
+    </w:p>
+    <w:p>
+      <w:pPr>
+        <w:pStyle w:val="Heading1"/>
+      </w:pPr>
+      <w:r>
+        <w:t>C Three rotations 45 minutes</w:t>
+      </w:r>
+    </w:p>
+    <w:p>
+      <w:r>
+        <w:t>Run three slots of exactly 15 minutes. Group 1: robot → conveyor → camera. Group 2: conveyor → camera → robot. Group 3: camera → robot → conveyor. In each slot allow 2 minutes to describe the task, 9 minutes to try it, 3 minutes to explain an observation and 1 minute to rotate.</w:t>
+      </w:r>
+    </w:p>
+    <w:p>
+      <w:r>
+        <w:t>At robot use notebook 02 to plan left/left/right, then add reject and an invalid command. Default left/right/left gives left 2/right 1; changed left/left/right has the same totals and a different order. Middle becomes reject. Ask what a real arm needs beyond a label: coordinates relative to a reference, reachable positions, a safe path and gripper timing. A recorded action is not proof of a completed placement.</w:t>
+      </w:r>
+    </w:p>
+    <w:p>
+      <w:r>
+        <w:t>At conveyor ask one partner to call move → stop → observe → decide → pick while the other moves paper objects. Ask what changes if pick happens before stop. At camera compare crops, hide part of one object and discuss uncertain reports. These are complete fallback activities; live demonstrations supplement them only when the instructor has qualified the station. Keep students outside any moving workspace.</w:t>
+      </w:r>
+    </w:p>
+    <w:p>
+      <w:pPr>
+        <w:pStyle w:val="Heading1"/>
+      </w:pPr>
+      <w:r>
+        <w:t>D Integrated factory 45 minutes</w:t>
+      </w:r>
+    </w:p>
+    <w:p>
+      <w:r>
+        <w:t>Use 8 minutes to trace the worked two-object example, 12 minutes for five-object predictions and baseline run, 15 minutes for rule changes, and 10 minutes to compare order and counts. Explain a mapping only now, using red → left and blue → right. Point out braces, colons and commas in the code.</w:t>
+      </w:r>
+    </w:p>
+    <w:p>
+      <w:r>
+        <w:t>Baseline: left 2/right 2/reject 1, five advances and actions left/right/left/reject/right. A reversed rule has identical totals on this balanced input but different actions. This is a useful discovery: totals alone can hide a mistake. Ask teams to invent an asymmetric input. Every cycle stops the belt before reading or picking, and stops again on completion. The helper recreates state each time the cell runs.</w:t>
+      </w:r>
+    </w:p>
+    <w:p>
+      <w:r>
+        <w:t xml:space="preserve">Green extension adds </w:t>
+      </w:r>
+      <w:r>
+        <w:rPr>
+          <w:rFonts w:ascii="DejaVu Sans Mono" w:hAnsi="DejaVu Sans Mono"/>
+          <w:sz w:val="18"/>
+        </w:rPr>
+        <w:t>"green": "left"</w:t>
+      </w:r>
+      <w:r>
+        <w:t xml:space="preserve"> and at least one green report. None and unknown remain rejected with the normal red/blue/green rules. An invalid destination such as middle is rejected. The count assertion checks that objects are not lost; it does not prove each destination is correct.</w:t>
+      </w:r>
+    </w:p>
+    <w:p>
+      <w:pPr>
+        <w:pStyle w:val="Heading1"/>
+      </w:pPr>
+      <w:r>
+        <w:t>E Independent experiments 40 minutes</w:t>
+      </w:r>
+    </w:p>
+    <w:p>
+      <w:r>
+        <w:t>Give 5 minutes to choose two challenges and write predictions, 25 minutes to run and record them, and 10 minutes to swap tests with another pair. Offer one hint at a time. Early finishers design a test that catches swapped rules; they do not need physical hardware.</w:t>
+      </w:r>
+    </w:p>
+    <w:p>
+      <w:r>
+        <w:t xml:space="preserve">Suggested answers: adding None, unknown, 42 and empty text to baseline produces left 2/right 2/reject 5. A middle destination for red makes baseline left 0/right 2/reject 3. A ten-report run must total ten. Green without a rule rejects; with a valid rule it reaches that bin. Swapping an unbalanced input changes totals. An assertion like </w:t>
+      </w:r>
+      <w:r>
+        <w:rPr>
+          <w:rFonts w:ascii="DejaVu Sans Mono" w:hAnsi="DejaVu Sans Mono"/>
+          <w:sz w:val="18"/>
+        </w:rPr>
+        <w:t>assert factory.counts["reject"] == 1</w:t>
+      </w:r>
+      <w:r>
+        <w:t xml:space="preserve"> is useful on baseline but insufficient alone.</w:t>
+      </w:r>
+    </w:p>
+    <w:p>
+      <w:pPr>
+        <w:pStyle w:val="Heading1"/>
+      </w:pPr>
+      <w:r>
+        <w:t>Closing 15 minutes</w:t>
+      </w:r>
+    </w:p>
+    <w:p>
+      <w:r>
+        <w:t>Give pairs 5 minutes to prepare a result, 7 minutes for several short presentations and 3 minutes for a final explanation and save. Each presentation includes a prediction, a changed rule, observed evidence and one real-world limitation. Invite quieter students to explain a single route. Collect worksheets as formative evidence, not a speed contest.</w:t>
+      </w:r>
+    </w:p>
+    <w:p>
+      <w:pPr>
+        <w:pStyle w:val="Heading1"/>
+      </w:pPr>
+      <w:r>
+        <w:t>If the notebook environment fails</w:t>
+      </w:r>
+    </w:p>
+    <w:p>
+      <w:r>
+        <w:t>Use the prepared plain Python route. Open a terminal, then run one command at a time. The scripts locate their own imports, so they also work when invoked with an absolute path from another directory.</w:t>
       </w:r>
     </w:p>
     <w:p>
@@ -104,7 +361,7 @@
           <w:rFonts w:ascii="DejaVu Sans Mono" w:hAnsi="DejaVu Sans Mono"/>
           <w:sz w:val="17"/>
         </w:rPr>
-        <w:t>python exercises/04_sort.py</w:t>
+        <w:t>python3 exercises/check_setup.py</w:t>
       </w:r>
     </w:p>
     <w:p>
@@ -113,7 +370,7 @@
           <w:rFonts w:ascii="DejaVu Sans Mono" w:hAnsi="DejaVu Sans Mono"/>
           <w:sz w:val="17"/>
         </w:rPr>
-        <w:t>python exercises/05_visual_sort.py</w:t>
+        <w:t>python3 exercises/01_python.py</w:t>
       </w:r>
     </w:p>
     <w:p>
@@ -122,27 +379,7 @@
           <w:rFonts w:ascii="DejaVu Sans Mono" w:hAnsi="DejaVu Sans Mono"/>
           <w:sz w:val="17"/>
         </w:rPr>
-        <w:t>python -m workshop</w:t>
-      </w:r>
-    </w:p>
-    <w:p>
-      <w:r>
-        <w:t xml:space="preserve">Open </w:t>
-      </w:r>
-      <w:r>
-        <w:rPr>
-          <w:rFonts w:ascii="DejaVu Sans Mono" w:hAnsi="DejaVu Sans Mono"/>
-          <w:sz w:val="18"/>
-        </w:rPr>
-        <w:t>sorting-result.html</w:t>
-      </w:r>
-      <w:r>
-        <w:t xml:space="preserve"> in the laptop's browser. Confirm that the animation advances, labels are readable, and unknown objects reach reject. Edit one rule, rerun the Python file and reload the browser. Confirm that the output changes. These commands use simulated hardware and standard Python.</w:t>
-      </w:r>
-    </w:p>
-    <w:p>
-      <w:r>
-        <w:t>Prepare a portable copy in advance:</w:t>
+        <w:t>python3 exercises/03_vision.py</w:t>
       </w:r>
     </w:p>
     <w:p>
@@ -151,893 +388,30 @@
           <w:rFonts w:ascii="DejaVu Sans Mono" w:hAnsi="DejaVu Sans Mono"/>
           <w:sz w:val="17"/>
         </w:rPr>
-        <w:t>python exercises/make_student_bundle.py --output student-workshop.zip</w:t>
+        <w:t>python3 exercises/02_robot.py</w:t>
       </w:r>
     </w:p>
     <w:p>
       <w:r>
-        <w:t>Extract it into a writable folder on each laptop. Rerun the checks there. Keep a USB copy, printed worksheets, the slides and a PDF copy if the presentation application differs. Test all three laptops; one passing workstation does not establish that all laptops work.</w:t>
-      </w:r>
-    </w:p>
-    <w:tbl>
-      <w:tblPr>
-        <w:tblStyle w:val="LightShading-Accent1"/>
-        <w:tblW w:type="auto" w:w="0"/>
-        <w:tblLook w:firstColumn="1" w:firstRow="1" w:lastColumn="0" w:lastRow="0" w:noHBand="0" w:noVBand="1" w:val="04A0"/>
-      </w:tblPr>
-      <w:tblGrid>
-        <w:gridCol w:w="1967"/>
-        <w:gridCol w:w="1967"/>
-        <w:gridCol w:w="1967"/>
-        <w:gridCol w:w="1967"/>
-        <w:gridCol w:w="1967"/>
-      </w:tblGrid>
-      <w:tr>
-        <w:trPr>
-          <w:tblHeader/>
-        </w:trPr>
-        <w:tc>
-          <w:tcPr>
-            <w:tcW w:type="dxa" w:w="1967"/>
-          </w:tcPr>
-          <w:p>
-            <w:r>
-              <w:rPr>
-                <w:sz w:val="16"/>
-              </w:rPr>
-              <w:t>Computer</w:t>
-            </w:r>
-          </w:p>
-        </w:tc>
-        <w:tc>
-          <w:tcPr>
-            <w:tcW w:type="dxa" w:w="1967"/>
-          </w:tcPr>
-          <w:p>
-            <w:r>
-              <w:rPr>
-                <w:sz w:val="16"/>
-              </w:rPr>
-              <w:t>Python and four exercises</w:t>
-            </w:r>
-          </w:p>
-        </w:tc>
-        <w:tc>
-          <w:tcPr>
-            <w:tcW w:type="dxa" w:w="1967"/>
-          </w:tcPr>
-          <w:p>
-            <w:r>
-              <w:rPr>
-                <w:sz w:val="16"/>
-              </w:rPr>
-              <w:t>Visual HTML changed and replayed</w:t>
-            </w:r>
-          </w:p>
-        </w:tc>
-        <w:tc>
-          <w:tcPr>
-            <w:tcW w:type="dxa" w:w="1967"/>
-          </w:tcPr>
-          <w:p>
-            <w:r>
-              <w:rPr>
-                <w:sz w:val="16"/>
-              </w:rPr>
-              <w:t>Offline test</w:t>
-            </w:r>
-          </w:p>
-        </w:tc>
-        <w:tc>
-          <w:tcPr>
-            <w:tcW w:type="dxa" w:w="1967"/>
-          </w:tcPr>
-          <w:p>
-            <w:r>
-              <w:rPr>
-                <w:sz w:val="16"/>
-              </w:rPr>
-              <w:t>Checked by</w:t>
-            </w:r>
-          </w:p>
-        </w:tc>
-      </w:tr>
-      <w:tr>
-        <w:tc>
-          <w:tcPr>
-            <w:tcW w:type="dxa" w:w="1967"/>
-          </w:tcPr>
-          <w:p>
-            <w:r>
-              <w:rPr>
-                <w:sz w:val="16"/>
-              </w:rPr>
-              <w:t>Pair 1</w:t>
-            </w:r>
-          </w:p>
-        </w:tc>
-        <w:tc>
-          <w:tcPr>
-            <w:tcW w:type="dxa" w:w="1967"/>
-          </w:tcPr>
-          <w:p>
-            <w:r>
-              <w:rPr>
-                <w:sz w:val="16"/>
-              </w:rPr>
-              <w:t>___</w:t>
-            </w:r>
-          </w:p>
-        </w:tc>
-        <w:tc>
-          <w:tcPr>
-            <w:tcW w:type="dxa" w:w="1967"/>
-          </w:tcPr>
-          <w:p>
-            <w:r>
-              <w:rPr>
-                <w:sz w:val="16"/>
-              </w:rPr>
-              <w:t>___</w:t>
-            </w:r>
-          </w:p>
-        </w:tc>
-        <w:tc>
-          <w:tcPr>
-            <w:tcW w:type="dxa" w:w="1967"/>
-          </w:tcPr>
-          <w:p>
-            <w:r>
-              <w:rPr>
-                <w:sz w:val="16"/>
-              </w:rPr>
-              <w:t>___</w:t>
-            </w:r>
-          </w:p>
-        </w:tc>
-        <w:tc>
-          <w:tcPr>
-            <w:tcW w:type="dxa" w:w="1967"/>
-          </w:tcPr>
-          <w:p>
-            <w:r>
-              <w:rPr>
-                <w:sz w:val="16"/>
-              </w:rPr>
-              <w:t>___</w:t>
-            </w:r>
-          </w:p>
-        </w:tc>
-      </w:tr>
-      <w:tr>
-        <w:tc>
-          <w:tcPr>
-            <w:tcW w:type="dxa" w:w="1967"/>
-          </w:tcPr>
-          <w:p>
-            <w:r>
-              <w:rPr>
-                <w:sz w:val="16"/>
-              </w:rPr>
-              <w:t>Pair 2</w:t>
-            </w:r>
-          </w:p>
-        </w:tc>
-        <w:tc>
-          <w:tcPr>
-            <w:tcW w:type="dxa" w:w="1967"/>
-          </w:tcPr>
-          <w:p>
-            <w:r>
-              <w:rPr>
-                <w:sz w:val="16"/>
-              </w:rPr>
-              <w:t>___</w:t>
-            </w:r>
-          </w:p>
-        </w:tc>
-        <w:tc>
-          <w:tcPr>
-            <w:tcW w:type="dxa" w:w="1967"/>
-          </w:tcPr>
-          <w:p>
-            <w:r>
-              <w:rPr>
-                <w:sz w:val="16"/>
-              </w:rPr>
-              <w:t>___</w:t>
-            </w:r>
-          </w:p>
-        </w:tc>
-        <w:tc>
-          <w:tcPr>
-            <w:tcW w:type="dxa" w:w="1967"/>
-          </w:tcPr>
-          <w:p>
-            <w:r>
-              <w:rPr>
-                <w:sz w:val="16"/>
-              </w:rPr>
-              <w:t>___</w:t>
-            </w:r>
-          </w:p>
-        </w:tc>
-        <w:tc>
-          <w:tcPr>
-            <w:tcW w:type="dxa" w:w="1967"/>
-          </w:tcPr>
-          <w:p>
-            <w:r>
-              <w:rPr>
-                <w:sz w:val="16"/>
-              </w:rPr>
-              <w:t>___</w:t>
-            </w:r>
-          </w:p>
-        </w:tc>
-      </w:tr>
-      <w:tr>
-        <w:tc>
-          <w:tcPr>
-            <w:tcW w:type="dxa" w:w="1967"/>
-          </w:tcPr>
-          <w:p>
-            <w:r>
-              <w:rPr>
-                <w:sz w:val="16"/>
-              </w:rPr>
-              <w:t>Pair 3</w:t>
-            </w:r>
-          </w:p>
-        </w:tc>
-        <w:tc>
-          <w:tcPr>
-            <w:tcW w:type="dxa" w:w="1967"/>
-          </w:tcPr>
-          <w:p>
-            <w:r>
-              <w:rPr>
-                <w:sz w:val="16"/>
-              </w:rPr>
-              <w:t>___</w:t>
-            </w:r>
-          </w:p>
-        </w:tc>
-        <w:tc>
-          <w:tcPr>
-            <w:tcW w:type="dxa" w:w="1967"/>
-          </w:tcPr>
-          <w:p>
-            <w:r>
-              <w:rPr>
-                <w:sz w:val="16"/>
-              </w:rPr>
-              <w:t>___</w:t>
-            </w:r>
-          </w:p>
-        </w:tc>
-        <w:tc>
-          <w:tcPr>
-            <w:tcW w:type="dxa" w:w="1967"/>
-          </w:tcPr>
-          <w:p>
-            <w:r>
-              <w:rPr>
-                <w:sz w:val="16"/>
-              </w:rPr>
-              <w:t>___</w:t>
-            </w:r>
-          </w:p>
-        </w:tc>
-        <w:tc>
-          <w:tcPr>
-            <w:tcW w:type="dxa" w:w="1967"/>
-          </w:tcPr>
-          <w:p>
-            <w:r>
-              <w:rPr>
-                <w:sz w:val="16"/>
-              </w:rPr>
-              <w:t>___</w:t>
-            </w:r>
-          </w:p>
-        </w:tc>
-      </w:tr>
-    </w:tbl>
-    <w:p>
-      <w:r>
-        <w:br w:type="page"/>
-      </w:r>
-    </w:p>
-    <w:p>
-      <w:pPr>
-        <w:pStyle w:val="Heading1"/>
-      </w:pPr>
-      <w:r>
-        <w:t>2. Physical-station decision</w:t>
+        <w:rPr>
+          <w:rFonts w:ascii="DejaVu Sans Mono" w:hAnsi="DejaVu Sans Mono"/>
+          <w:sz w:val="17"/>
+        </w:rPr>
+        <w:t>python3 exercises/04_sort.py</w:t>
       </w:r>
     </w:p>
     <w:p>
       <w:r>
-        <w:t>Check the actual camera, robot and conveyor separately before class. Record the accepted demonstration for each. Secure the arm, conveyor, camera and cables. Keep an accessible stop and power disconnect. Only the instructor enables actuators. Brief students before touching leader controls. Never run a second motor owner or generic calibration command alongside the station controller.</w:t>
-      </w:r>
-    </w:p>
-    <w:tbl>
-      <w:tblPr>
-        <w:tblStyle w:val="LightShading-Accent1"/>
-        <w:tblW w:type="auto" w:w="0"/>
-        <w:tblLook w:firstColumn="1" w:firstRow="1" w:lastColumn="0" w:lastRow="0" w:noHBand="0" w:noVBand="1" w:val="04A0"/>
-      </w:tblPr>
-      <w:tblGrid>
-        <w:gridCol w:w="3278"/>
-        <w:gridCol w:w="3278"/>
-        <w:gridCol w:w="3278"/>
-      </w:tblGrid>
-      <w:tr>
-        <w:trPr>
-          <w:tblHeader/>
-        </w:trPr>
-        <w:tc>
-          <w:tcPr>
-            <w:tcW w:type="dxa" w:w="3278"/>
-          </w:tcPr>
-          <w:p>
-            <w:r>
-              <w:rPr>
-                <w:sz w:val="16"/>
-              </w:rPr>
-              <w:t>Station</w:t>
-            </w:r>
-          </w:p>
-        </w:tc>
-        <w:tc>
-          <w:tcPr>
-            <w:tcW w:type="dxa" w:w="3278"/>
-          </w:tcPr>
-          <w:p>
-            <w:r>
-              <w:rPr>
-                <w:sz w:val="16"/>
-              </w:rPr>
-              <w:t>Check before enabling</w:t>
-            </w:r>
-          </w:p>
-        </w:tc>
-        <w:tc>
-          <w:tcPr>
-            <w:tcW w:type="dxa" w:w="3278"/>
-          </w:tcPr>
-          <w:p>
-            <w:r>
-              <w:rPr>
-                <w:sz w:val="16"/>
-              </w:rPr>
-              <w:t>Fallback</w:t>
-            </w:r>
-          </w:p>
-        </w:tc>
-      </w:tr>
-      <w:tr>
-        <w:tc>
-          <w:tcPr>
-            <w:tcW w:type="dxa" w:w="3278"/>
-          </w:tcPr>
-          <w:p>
-            <w:r>
-              <w:rPr>
-                <w:sz w:val="16"/>
-              </w:rPr>
-              <w:t>Robot</w:t>
-            </w:r>
-          </w:p>
-        </w:tc>
-        <w:tc>
-          <w:tcPr>
-            <w:tcW w:type="dxa" w:w="3278"/>
-          </w:tcPr>
-          <w:p>
-            <w:r>
-              <w:rPr>
-                <w:sz w:val="16"/>
-              </w:rPr>
-              <w:t>Fresh feedback, calibrated leader/follower, known stop response, clear workspace and supervised motion</w:t>
-            </w:r>
-          </w:p>
-        </w:tc>
-        <w:tc>
-          <w:tcPr>
-            <w:tcW w:type="dxa" w:w="3278"/>
-          </w:tcPr>
-          <w:p>
-            <w:r>
-              <w:rPr>
-                <w:sz w:val="16"/>
-              </w:rPr>
-              <w:t>python exercises/02_robot.py; explain a sequence of simulated actions</w:t>
-            </w:r>
-          </w:p>
-        </w:tc>
-      </w:tr>
-      <w:tr>
-        <w:tc>
-          <w:tcPr>
-            <w:tcW w:type="dxa" w:w="3278"/>
-          </w:tcPr>
-          <w:p>
-            <w:r>
-              <w:rPr>
-                <w:sz w:val="16"/>
-              </w:rPr>
-              <w:t>Conveyor</w:t>
-            </w:r>
-          </w:p>
-        </w:tc>
-        <w:tc>
-          <w:tcPr>
-            <w:tcW w:type="dxa" w:w="3278"/>
-          </w:tcPr>
-          <w:p>
-            <w:r>
-              <w:rPr>
-                <w:sz w:val="16"/>
-              </w:rPr>
-              <w:t>Correct direction, working stop, clear mechanism, repeatable object stopping</w:t>
-            </w:r>
-          </w:p>
-        </w:tc>
-        <w:tc>
-          <w:tcPr>
-            <w:tcW w:type="dxa" w:w="3278"/>
-          </w:tcPr>
-          <w:p>
-            <w:r>
-              <w:rPr>
-                <w:sz w:val="16"/>
-              </w:rPr>
-              <w:t>python -m workshop; inspect the unpowered mechanism</w:t>
-            </w:r>
-          </w:p>
-        </w:tc>
-      </w:tr>
-      <w:tr>
-        <w:tc>
-          <w:tcPr>
-            <w:tcW w:type="dxa" w:w="3278"/>
-          </w:tcPr>
-          <w:p>
-            <w:r>
-              <w:rPr>
-                <w:sz w:val="16"/>
-              </w:rPr>
-              <w:t>Camera</w:t>
-            </w:r>
-          </w:p>
-        </w:tc>
-        <w:tc>
-          <w:tcPr>
-            <w:tcW w:type="dxa" w:w="3278"/>
-          </w:tcPr>
-          <w:p>
-            <w:r>
-              <w:rPr>
-                <w:sz w:val="16"/>
-              </w:rPr>
-              <w:t>Advancing real images and classifications under actual lighting</w:t>
-            </w:r>
-          </w:p>
-        </w:tc>
-        <w:tc>
-          <w:tcPr>
-            <w:tcW w:type="dxa" w:w="3278"/>
-          </w:tcPr>
-          <w:p>
-            <w:r>
-              <w:rPr>
-                <w:sz w:val="16"/>
-              </w:rPr>
-              <w:t>docs/assets/vision-demo.png and docs/assets/vision-roi.png, plus exercise 03</w:t>
-            </w:r>
-          </w:p>
-        </w:tc>
-      </w:tr>
-    </w:tbl>
-    <w:p>
-      <w:r>
-        <w:t>The included images are labeled teaching schematics, not photographs or validation evidence. A physical autonomous pick/place remains a separate commissioning result. Demonstrate it only if the complete cycle has actually passed the current station checks. Component tests or a successful simulation do not prove a physical sort.</w:t>
+        <w:rPr>
+          <w:rFonts w:ascii="DejaVu Sans Mono" w:hAnsi="DejaVu Sans Mono"/>
+          <w:sz w:val="17"/>
+        </w:rPr>
+        <w:t>python3 exercises/05_visual_sort.py</w:t>
       </w:r>
     </w:p>
     <w:p>
       <w:r>
-        <w:t>If a stream becomes stale, a person enters the work envelope or motion differs from expectations, stop the hardware and switch that station to its fallback. Do not troubleshoot powered hardware while students wait. Students must not change calibration, joint limits, motor settings or service configurations.</w:t>
-      </w:r>
-    </w:p>
-    <w:p>
-      <w:pPr>
-        <w:pStyle w:val="Heading1"/>
-      </w:pPr>
-      <w:r>
-        <w:t>3. Introduction: eight slides, 25 minutes</w:t>
-      </w:r>
-    </w:p>
-    <w:p>
-      <w:r>
-        <w:t>1. Can a robot run a factory? (3 min): ask what it must know before moving a block.</w:t>
-      </w:r>
-    </w:p>
-    <w:p>
-      <w:r>
-        <w:t>2. Our miniature factory (3 min): point to the actual camera, LEGO belt, arm and bins. The slide is a schematic.</w:t>
-      </w:r>
-    </w:p>
-    <w:p>
-      <w:r>
-        <w:t>3. Observe, decide, act, check (4 min): classify camera as sensor and motor as actuator. Ask how to check a result.</w:t>
-      </w:r>
-    </w:p>
-    <w:p>
-      <w:r>
-        <w:t>4. A camera sees pixels (3 min): compare red, blue and unknown examples. Discuss lighting, shadows and missing information.</w:t>
-      </w:r>
-    </w:p>
-    <w:p>
-      <w:r>
-        <w:t>5. Robot joints and gripper (3 min): show joints and a target, using only an accepted motion demonstration.</w:t>
-      </w:r>
-    </w:p>
-    <w:p>
-      <w:r>
-        <w:t>6. Your first Python rule (4 min): predict a tiny loop and color condition. Avoid a long syntax lecture.</w:t>
-      </w:r>
-    </w:p>
-    <w:p>
-      <w:r>
-        <w:t>7. What can go wrong? (3 min): ask students for a failure and a safe response.</w:t>
-      </w:r>
-    </w:p>
-    <w:p>
-      <w:r>
-        <w:t>8. Your challenge (2 min): pairs must change a rule, test five objects and explain rejection.</w:t>
-      </w:r>
-    </w:p>
-    <w:p>
-      <w:r>
-        <w:t>The presentation contains speaker notes with prompts and pacing. Continue with the exact 240-minute schedule.</w:t>
-      </w:r>
-    </w:p>
-    <w:p>
-      <w:r>
-        <w:br w:type="page"/>
-      </w:r>
-    </w:p>
-    <w:p>
-      <w:pPr>
-        <w:pStyle w:val="Heading1"/>
-      </w:pPr>
-      <w:r>
-        <w:t>4. Three rotations: 01:35–02:20</w:t>
-      </w:r>
-    </w:p>
-    <w:p>
-      <w:r>
-        <w:t>Use pairs A, B and C. Each visit lasts 15 minutes, including transition. The instructor supervises any powered robot activity; if the other stations require supervision too, use their offline alternatives. Swap the typing / predicting roles between activities.</w:t>
-      </w:r>
-    </w:p>
-    <w:tbl>
-      <w:tblPr>
-        <w:tblStyle w:val="LightShading-Accent1"/>
-        <w:tblW w:type="auto" w:w="0"/>
-        <w:tblLook w:firstColumn="1" w:firstRow="1" w:lastColumn="0" w:lastRow="0" w:noHBand="0" w:noVBand="1" w:val="04A0"/>
-      </w:tblPr>
-      <w:tblGrid>
-        <w:gridCol w:w="2459"/>
-        <w:gridCol w:w="2459"/>
-        <w:gridCol w:w="2459"/>
-        <w:gridCol w:w="2459"/>
-      </w:tblGrid>
-      <w:tr>
-        <w:trPr>
-          <w:tblHeader/>
-        </w:trPr>
-        <w:tc>
-          <w:tcPr>
-            <w:tcW w:type="dxa" w:w="2459"/>
-          </w:tcPr>
-          <w:p>
-            <w:r>
-              <w:rPr>
-                <w:sz w:val="16"/>
-              </w:rPr>
-              <w:t>Time</w:t>
-            </w:r>
-          </w:p>
-        </w:tc>
-        <w:tc>
-          <w:tcPr>
-            <w:tcW w:type="dxa" w:w="2459"/>
-          </w:tcPr>
-          <w:p>
-            <w:r>
-              <w:rPr>
-                <w:sz w:val="16"/>
-              </w:rPr>
-              <w:t>Pair A</w:t>
-            </w:r>
-          </w:p>
-        </w:tc>
-        <w:tc>
-          <w:tcPr>
-            <w:tcW w:type="dxa" w:w="2459"/>
-          </w:tcPr>
-          <w:p>
-            <w:r>
-              <w:rPr>
-                <w:sz w:val="16"/>
-              </w:rPr>
-              <w:t>Pair B</w:t>
-            </w:r>
-          </w:p>
-        </w:tc>
-        <w:tc>
-          <w:tcPr>
-            <w:tcW w:type="dxa" w:w="2459"/>
-          </w:tcPr>
-          <w:p>
-            <w:r>
-              <w:rPr>
-                <w:sz w:val="16"/>
-              </w:rPr>
-              <w:t>Pair C</w:t>
-            </w:r>
-          </w:p>
-        </w:tc>
-      </w:tr>
-      <w:tr>
-        <w:tc>
-          <w:tcPr>
-            <w:tcW w:type="dxa" w:w="2459"/>
-          </w:tcPr>
-          <w:p>
-            <w:r>
-              <w:rPr>
-                <w:sz w:val="16"/>
-              </w:rPr>
-              <w:t>01:35–01:50</w:t>
-            </w:r>
-          </w:p>
-        </w:tc>
-        <w:tc>
-          <w:tcPr>
-            <w:tcW w:type="dxa" w:w="2459"/>
-          </w:tcPr>
-          <w:p>
-            <w:r>
-              <w:rPr>
-                <w:sz w:val="16"/>
-              </w:rPr>
-              <w:t>Robot</w:t>
-            </w:r>
-          </w:p>
-        </w:tc>
-        <w:tc>
-          <w:tcPr>
-            <w:tcW w:type="dxa" w:w="2459"/>
-          </w:tcPr>
-          <w:p>
-            <w:r>
-              <w:rPr>
-                <w:sz w:val="16"/>
-              </w:rPr>
-              <w:t>Conveyor</w:t>
-            </w:r>
-          </w:p>
-        </w:tc>
-        <w:tc>
-          <w:tcPr>
-            <w:tcW w:type="dxa" w:w="2459"/>
-          </w:tcPr>
-          <w:p>
-            <w:r>
-              <w:rPr>
-                <w:sz w:val="16"/>
-              </w:rPr>
-              <w:t>Camera</w:t>
-            </w:r>
-          </w:p>
-        </w:tc>
-      </w:tr>
-      <w:tr>
-        <w:tc>
-          <w:tcPr>
-            <w:tcW w:type="dxa" w:w="2459"/>
-          </w:tcPr>
-          <w:p>
-            <w:r>
-              <w:rPr>
-                <w:sz w:val="16"/>
-              </w:rPr>
-              <w:t>01:50–02:05</w:t>
-            </w:r>
-          </w:p>
-        </w:tc>
-        <w:tc>
-          <w:tcPr>
-            <w:tcW w:type="dxa" w:w="2459"/>
-          </w:tcPr>
-          <w:p>
-            <w:r>
-              <w:rPr>
-                <w:sz w:val="16"/>
-              </w:rPr>
-              <w:t>Conveyor</w:t>
-            </w:r>
-          </w:p>
-        </w:tc>
-        <w:tc>
-          <w:tcPr>
-            <w:tcW w:type="dxa" w:w="2459"/>
-          </w:tcPr>
-          <w:p>
-            <w:r>
-              <w:rPr>
-                <w:sz w:val="16"/>
-              </w:rPr>
-              <w:t>Camera</w:t>
-            </w:r>
-          </w:p>
-        </w:tc>
-        <w:tc>
-          <w:tcPr>
-            <w:tcW w:type="dxa" w:w="2459"/>
-          </w:tcPr>
-          <w:p>
-            <w:r>
-              <w:rPr>
-                <w:sz w:val="16"/>
-              </w:rPr>
-              <w:t>Robot</w:t>
-            </w:r>
-          </w:p>
-        </w:tc>
-      </w:tr>
-      <w:tr>
-        <w:tc>
-          <w:tcPr>
-            <w:tcW w:type="dxa" w:w="2459"/>
-          </w:tcPr>
-          <w:p>
-            <w:r>
-              <w:rPr>
-                <w:sz w:val="16"/>
-              </w:rPr>
-              <w:t>02:05–02:20</w:t>
-            </w:r>
-          </w:p>
-        </w:tc>
-        <w:tc>
-          <w:tcPr>
-            <w:tcW w:type="dxa" w:w="2459"/>
-          </w:tcPr>
-          <w:p>
-            <w:r>
-              <w:rPr>
-                <w:sz w:val="16"/>
-              </w:rPr>
-              <w:t>Camera</w:t>
-            </w:r>
-          </w:p>
-        </w:tc>
-        <w:tc>
-          <w:tcPr>
-            <w:tcW w:type="dxa" w:w="2459"/>
-          </w:tcPr>
-          <w:p>
-            <w:r>
-              <w:rPr>
-                <w:sz w:val="16"/>
-              </w:rPr>
-              <w:t>Robot</w:t>
-            </w:r>
-          </w:p>
-        </w:tc>
-        <w:tc>
-          <w:tcPr>
-            <w:tcW w:type="dxa" w:w="2459"/>
-          </w:tcPr>
-          <w:p>
-            <w:r>
-              <w:rPr>
-                <w:sz w:val="16"/>
-              </w:rPr>
-              <w:t>Conveyor</w:t>
-            </w:r>
-          </w:p>
-        </w:tc>
-      </w:tr>
-    </w:tbl>
-    <w:p>
-      <w:r>
-        <w:t>Robot question: How easy is it to reach the same target twice? Conveyor question: Does a sensor trigger guarantee a repeatable stopping position? Camera question: Which change makes recognition less reliable? Each pair records one observation and one improvement.</w:t>
-      </w:r>
-    </w:p>
-    <w:p>
-      <w:pPr>
-        <w:pStyle w:val="Heading1"/>
-      </w:pPr>
-      <w:r>
-        <w:t>5. Sorting and independent challenges</w:t>
-      </w:r>
-    </w:p>
-    <w:p>
-      <w:r>
-        <w:t>At 02:20, return all pairs to their laptops. Start with the unchanged exercise 04. Ask for predicted counts before execution, then reverse the destinations. Explain that the mapping accepts known labels and sends everything else to reject. Use exercise 05 for visible feedback. Students edit Python, rerun and reload the generated page; the page does not control real hardware.</w:t>
-      </w:r>
-    </w:p>
-    <w:p>
-      <w:r>
-        <w:t>For fast pairs, use the six graded challenges on the worksheet. Complete reversing and counting first. Then introduce green, invalid/missing readings, new sequences or a reliability improvement. Do not require every pair to finish all six.</w:t>
-      </w:r>
-    </w:p>
-    <w:p>
-      <w:r>
-        <w:t>Expected baseline counts and current examples are in the tested exercise files. After editing a sequence, count it by hand first. Counts must sum to the sequence length, unknown/missing/invalid readings must be rejected, and changing a recognized color's destination must change its route.</w:t>
-      </w:r>
-    </w:p>
-    <w:p>
-      <w:pPr>
-        <w:pStyle w:val="Heading1"/>
-      </w:pPr>
-      <w:r>
-        <w:t>6. Closing and readiness record</w:t>
-      </w:r>
-    </w:p>
-    <w:p>
-      <w:r>
-        <w:t>At 03:45, allow 2–3 minutes per pair. Each pair shows a changed rule, one prediction versus result, and a possible failure response. Close with the most advanced physical demonstration accepted that day, or the visual simulator.</w:t>
-      </w:r>
-    </w:p>
-    <w:p>
-      <w:r>
-        <w:t>Before class, tick only what you have actually checked:</w:t>
-      </w:r>
-    </w:p>
-    <w:p>
-      <w:r>
-        <w:t>[ ] All three laptops pass the offline commands and edit / rerun test.</w:t>
-      </w:r>
-    </w:p>
-    <w:p>
-      <w:r>
-        <w:t>[ ] Eight slides open correctly on the projector.</w:t>
-      </w:r>
-    </w:p>
-    <w:p>
-      <w:r>
-        <w:t>[ ] Six one-page worksheets are printed.</w:t>
-      </w:r>
-    </w:p>
-    <w:p>
-      <w:r>
-        <w:t>[ ] Red, blue and unknown objects are prepared and fit the station.</w:t>
-      </w:r>
-    </w:p>
-    <w:p>
-      <w:r>
-        <w:t>[ ] Camera, robot and conveyor each have an accepted demonstration or fallback.</w:t>
-      </w:r>
-    </w:p>
-    <w:p>
-      <w:r>
-        <w:t>[ ] USB student bundle and image examples are available without networking.</w:t>
-      </w:r>
-    </w:p>
-    <w:p>
-      <w:r>
-        <w:t>[ ] Pairs and rotation order are assigned.</w:t>
-      </w:r>
-    </w:p>
-    <w:p>
-      <w:r>
-        <w:t>Student success means a tested five-object simulated sorter and a clear explanation. Hardware integration remains instructor infrastructure; students do not need to learn ROS during this session.</w:t>
+        <w:t>Students edit the marked STUDENT AREA, save, and rerun the same command. Open sorting-result.html in a browser for the fallback animation; it needs no network. Use student-exercises.md for explanations and print the station photo if necessary. If no computers work, enact the same decision rules with paper reports and three labeled bins and record predictions on the worksheet.</w:t>
       </w:r>
     </w:p>
     <w:sectPr>
@@ -1768,7 +1142,7 @@
     </w:pPr>
     <w:rPr>
       <w:rFonts w:asciiTheme="majorHAnsi" w:eastAsiaTheme="majorEastAsia" w:hAnsiTheme="majorHAnsi" w:cstheme="majorBidi" w:ascii="DejaVu Sans" w:hAnsi="DejaVu Sans"/>
-      <w:color w:val="17354B"/>
+      <w:color w:val="000000"/>
       <w:spacing w:val="5"/>
       <w:kern w:val="28"/>
       <w:sz w:val="48"/>

</xml_diff>

<commit_message>
Add read-only live robot lab and complete four-hour beginner workshop
</commit_message>
<xml_diff>
--- a/docs/instructor-guide.docx
+++ b/docs/instructor-guide.docx
@@ -12,12 +12,12 @@
     </w:p>
     <w:p>
       <w:r>
-        <w:t>22 October 2026 · Four hours · First semester · No programming or robotics prerequisites</w:t>
+        <w:t>22 October 2026 · Four hours · First semester · No prerequisites</w:t>
       </w:r>
     </w:p>
     <w:p>
       <w:r>
-        <w:t>The class learns by predicting a small change, running it, and explaining visible results. Use the student notebook as the main route. The separate instructor notebook adds answers beside the same activities. Pair one student who types with one who predicts and have them swap roles each activity. Success means an explained, tested result, not finishing every optional challenge.</w:t>
+        <w:t>Students learn by predicting a small change, running it and explaining a visible result. Use the student notebook as the main route. The instructor notebook adds guidance beside identical executable activities. Swap typing and predicting roles every activity. Red routes left, blue right, all other reports reject.</w:t>
       </w:r>
     </w:p>
     <w:p>
@@ -25,17 +25,12 @@
         <w:pStyle w:val="Heading1"/>
       </w:pPr>
       <w:r>
-        <w:t>Prepare before the class</w:t>
+        <w:t>Prepare before class</w:t>
       </w:r>
     </w:p>
     <w:p>
       <w:r>
-        <w:t>Give every pair an extracted student ZIP and an already prepared Python environment. Jupyter and Matplotlib need dependencies; the lesson works without internet after preparation. The plain Python scripts and HTML animation need only Python 3.11 or newer. Do not spend classroom time installing packages.</w:t>
-      </w:r>
-    </w:p>
-    <w:p>
-      <w:r>
-        <w:t>On the classroom computer prepare a dedicated environment, separate from any robot or ROS environment:</w:t>
+        <w:t>Prepare Python 3.11 or newer in an environment separate from ROS. Install notebooks/requirements.txt in that environment before class. Extract the complete student ZIP; retain exercises, notebooks and workshop together. Do not distribute the instructor notebook as learner material. Open a clean notebook, run setup and the first activity, save a team copy and demonstrate recovery after a kernel restart.</w:t>
       </w:r>
     </w:p>
     <w:p>
@@ -62,7 +57,519 @@
           <w:rFonts w:ascii="DejaVu Sans Mono" w:hAnsi="DejaVu Sans Mono"/>
           <w:sz w:val="17"/>
         </w:rPr>
-        <w:t>.venv-workshop/bin/python tools/verify_notebooks.py</w:t>
+        <w:t>.venv-workshop/bin/python notebooks/launch.py</w:t>
+      </w:r>
+    </w:p>
+    <w:p>
+      <w:r>
+        <w:t>Windows uses .venv-workshop\Scripts\python.exe with the same launcher. The launcher opens a local JupyterLab with the bundle as its root. No JupyterLite service is provided. Internet is needed for the optional Blockly and Teachable Machine activities; check the links and prepare offline alternatives in workshop-resources.md. Use nonpersonal objects, not student faces, for camera examples. Print one worksheet per pair.</w:t>
+      </w:r>
+    </w:p>
+    <w:p>
+      <w:pPr>
+        <w:pStyle w:val="Heading1"/>
+      </w:pPr>
+      <w:r>
+        <w:t>Timetable and transitions</w:t>
+      </w:r>
+    </w:p>
+    <w:tbl>
+      <w:tblPr>
+        <w:tblStyle w:val="LightShading-Accent1"/>
+        <w:tblW w:type="auto" w:w="0"/>
+        <w:tblLook w:firstColumn="1" w:firstRow="1" w:lastColumn="0" w:lastRow="0" w:noHBand="0" w:noVBand="1" w:val="04A0"/>
+      </w:tblPr>
+      <w:tblGrid>
+        <w:gridCol w:w="3278"/>
+        <w:gridCol w:w="3278"/>
+        <w:gridCol w:w="3278"/>
+      </w:tblGrid>
+      <w:tr>
+        <w:trPr>
+          <w:tblHeader/>
+        </w:trPr>
+        <w:tc>
+          <w:tcPr>
+            <w:tcW w:type="dxa" w:w="3278"/>
+          </w:tcPr>
+          <w:p>
+            <w:r>
+              <w:rPr>
+                <w:sz w:val="16"/>
+              </w:rPr>
+              <w:t>Elapsed minutes</w:t>
+            </w:r>
+          </w:p>
+        </w:tc>
+        <w:tc>
+          <w:tcPr>
+            <w:tcW w:type="dxa" w:w="3278"/>
+          </w:tcPr>
+          <w:p>
+            <w:r>
+              <w:rPr>
+                <w:sz w:val="16"/>
+              </w:rPr>
+              <w:t>Task</w:t>
+            </w:r>
+          </w:p>
+        </w:tc>
+        <w:tc>
+          <w:tcPr>
+            <w:tcW w:type="dxa" w:w="3278"/>
+          </w:tcPr>
+          <w:p>
+            <w:r>
+              <w:rPr>
+                <w:sz w:val="16"/>
+              </w:rPr>
+              <w:t>Teaching move</w:t>
+            </w:r>
+          </w:p>
+        </w:tc>
+      </w:tr>
+      <w:tr>
+        <w:tc>
+          <w:tcPr>
+            <w:tcW w:type="dxa" w:w="3278"/>
+          </w:tcPr>
+          <w:p>
+            <w:r>
+              <w:rPr>
+                <w:sz w:val="16"/>
+              </w:rPr>
+              <w:t>00–25</w:t>
+            </w:r>
+          </w:p>
+        </w:tc>
+        <w:tc>
+          <w:tcPr>
+            <w:tcW w:type="dxa" w:w="3278"/>
+          </w:tcPr>
+          <w:p>
+            <w:r>
+              <w:rPr>
+                <w:sz w:val="16"/>
+              </w:rPr>
+              <w:t>Introduction</w:t>
+            </w:r>
+          </w:p>
+        </w:tc>
+        <w:tc>
+          <w:tcPr>
+            <w:tcW w:type="dxa" w:w="3278"/>
+          </w:tcPr>
+          <w:p>
+            <w:r>
+              <w:rPr>
+                <w:sz w:val="16"/>
+              </w:rPr>
+              <w:t>Ask how humans sort; show sensing, deciding, acting and feedback; demonstrate notebook controls</w:t>
+            </w:r>
+          </w:p>
+        </w:tc>
+      </w:tr>
+      <w:tr>
+        <w:tc>
+          <w:tcPr>
+            <w:tcW w:type="dxa" w:w="3278"/>
+          </w:tcPr>
+          <w:p>
+            <w:r>
+              <w:rPr>
+                <w:sz w:val="16"/>
+              </w:rPr>
+              <w:t>25–35</w:t>
+            </w:r>
+          </w:p>
+        </w:tc>
+        <w:tc>
+          <w:tcPr>
+            <w:tcW w:type="dxa" w:w="3278"/>
+          </w:tcPr>
+          <w:p>
+            <w:r>
+              <w:rPr>
+                <w:sz w:val="16"/>
+              </w:rPr>
+              <w:t>Blockly Maze</w:t>
+            </w:r>
+          </w:p>
+        </w:tc>
+        <w:tc>
+          <w:tcPr>
+            <w:tcW w:type="dxa" w:w="3278"/>
+          </w:tcPr>
+          <w:p>
+            <w:r>
+              <w:rPr>
+                <w:sz w:val="16"/>
+              </w:rPr>
+              <w:t>Levels 1–3 core; 4–5 stretch; reserve last minute to return to notebook</w:t>
+            </w:r>
+          </w:p>
+        </w:tc>
+      </w:tr>
+      <w:tr>
+        <w:tc>
+          <w:tcPr>
+            <w:tcW w:type="dxa" w:w="3278"/>
+          </w:tcPr>
+          <w:p>
+            <w:r>
+              <w:rPr>
+                <w:sz w:val="16"/>
+              </w:rPr>
+              <w:t>35–65</w:t>
+            </w:r>
+          </w:p>
+        </w:tc>
+        <w:tc>
+          <w:tcPr>
+            <w:tcW w:type="dxa" w:w="3278"/>
+          </w:tcPr>
+          <w:p>
+            <w:r>
+              <w:rPr>
+                <w:sz w:val="16"/>
+              </w:rPr>
+              <w:t>A Python</w:t>
+            </w:r>
+          </w:p>
+        </w:tc>
+        <w:tc>
+          <w:tcPr>
+            <w:tcW w:type="dxa" w:w="3278"/>
+          </w:tcPr>
+          <w:p>
+            <w:r>
+              <w:rPr>
+                <w:sz w:val="16"/>
+              </w:rPr>
+              <w:t>Greeting 6 min, repeat 8, condition 10, explanation and transition 6</w:t>
+            </w:r>
+          </w:p>
+        </w:tc>
+      </w:tr>
+      <w:tr>
+        <w:tc>
+          <w:tcPr>
+            <w:tcW w:type="dxa" w:w="3278"/>
+          </w:tcPr>
+          <w:p>
+            <w:r>
+              <w:rPr>
+                <w:sz w:val="16"/>
+              </w:rPr>
+              <w:t>65–85</w:t>
+            </w:r>
+          </w:p>
+        </w:tc>
+        <w:tc>
+          <w:tcPr>
+            <w:tcW w:type="dxa" w:w="3278"/>
+          </w:tcPr>
+          <w:p>
+            <w:r>
+              <w:rPr>
+                <w:sz w:val="16"/>
+              </w:rPr>
+              <w:t>B Teachable Machine</w:t>
+            </w:r>
+          </w:p>
+        </w:tc>
+        <w:tc>
+          <w:tcPr>
+            <w:tcW w:type="dxa" w:w="3278"/>
+          </w:tcPr>
+          <w:p>
+            <w:r>
+              <w:rPr>
+                <w:sz w:val="16"/>
+              </w:rPr>
+              <w:t>Classes 5 min, tests 7, changed condition 5, explanation 3</w:t>
+            </w:r>
+          </w:p>
+        </w:tc>
+      </w:tr>
+      <w:tr>
+        <w:tc>
+          <w:tcPr>
+            <w:tcW w:type="dxa" w:w="3278"/>
+          </w:tcPr>
+          <w:p>
+            <w:r>
+              <w:rPr>
+                <w:sz w:val="16"/>
+              </w:rPr>
+              <w:t>85–95</w:t>
+            </w:r>
+          </w:p>
+        </w:tc>
+        <w:tc>
+          <w:tcPr>
+            <w:tcW w:type="dxa" w:w="3278"/>
+          </w:tcPr>
+          <w:p>
+            <w:r>
+              <w:rPr>
+                <w:sz w:val="16"/>
+              </w:rPr>
+              <w:t>Break</w:t>
+            </w:r>
+          </w:p>
+        </w:tc>
+        <w:tc>
+          <w:tcPr>
+            <w:tcW w:type="dxa" w:w="3278"/>
+          </w:tcPr>
+          <w:p>
+            <w:r>
+              <w:rPr>
+                <w:sz w:val="16"/>
+              </w:rPr>
+              <w:t>Save; name three groups and starting stations</w:t>
+            </w:r>
+          </w:p>
+        </w:tc>
+      </w:tr>
+      <w:tr>
+        <w:tc>
+          <w:tcPr>
+            <w:tcW w:type="dxa" w:w="3278"/>
+          </w:tcPr>
+          <w:p>
+            <w:r>
+              <w:rPr>
+                <w:sz w:val="16"/>
+              </w:rPr>
+              <w:t>95–140</w:t>
+            </w:r>
+          </w:p>
+        </w:tc>
+        <w:tc>
+          <w:tcPr>
+            <w:tcW w:type="dxa" w:w="3278"/>
+          </w:tcPr>
+          <w:p>
+            <w:r>
+              <w:rPr>
+                <w:sz w:val="16"/>
+              </w:rPr>
+              <w:t>C Stations</w:t>
+            </w:r>
+          </w:p>
+        </w:tc>
+        <w:tc>
+          <w:tcPr>
+            <w:tcW w:type="dxa" w:w="3278"/>
+          </w:tcPr>
+          <w:p>
+            <w:r>
+              <w:rPr>
+                <w:sz w:val="16"/>
+              </w:rPr>
+              <w:t>Three 15-minute rotations including 1-minute transitions</w:t>
+            </w:r>
+          </w:p>
+        </w:tc>
+      </w:tr>
+      <w:tr>
+        <w:tc>
+          <w:tcPr>
+            <w:tcW w:type="dxa" w:w="3278"/>
+          </w:tcPr>
+          <w:p>
+            <w:r>
+              <w:rPr>
+                <w:sz w:val="16"/>
+              </w:rPr>
+              <w:t>140–190</w:t>
+            </w:r>
+          </w:p>
+        </w:tc>
+        <w:tc>
+          <w:tcPr>
+            <w:tcW w:type="dxa" w:w="3278"/>
+          </w:tcPr>
+          <w:p>
+            <w:r>
+              <w:rPr>
+                <w:sz w:val="16"/>
+              </w:rPr>
+              <w:t>D Factory</w:t>
+            </w:r>
+          </w:p>
+        </w:tc>
+        <w:tc>
+          <w:tcPr>
+            <w:tcW w:type="dxa" w:w="3278"/>
+          </w:tcPr>
+          <w:p>
+            <w:r>
+              <w:rPr>
+                <w:sz w:val="16"/>
+              </w:rPr>
+              <w:t>Trace 10 min, baseline 12, change rule 15, compare routes 10, save 3</w:t>
+            </w:r>
+          </w:p>
+        </w:tc>
+      </w:tr>
+      <w:tr>
+        <w:tc>
+          <w:tcPr>
+            <w:tcW w:type="dxa" w:w="3278"/>
+          </w:tcPr>
+          <w:p>
+            <w:r>
+              <w:rPr>
+                <w:sz w:val="16"/>
+              </w:rPr>
+              <w:t>190–225</w:t>
+            </w:r>
+          </w:p>
+        </w:tc>
+        <w:tc>
+          <w:tcPr>
+            <w:tcW w:type="dxa" w:w="3278"/>
+          </w:tcPr>
+          <w:p>
+            <w:r>
+              <w:rPr>
+                <w:sz w:val="16"/>
+              </w:rPr>
+              <w:t>E Challenges</w:t>
+            </w:r>
+          </w:p>
+        </w:tc>
+        <w:tc>
+          <w:tcPr>
+            <w:tcW w:type="dxa" w:w="3278"/>
+          </w:tcPr>
+          <w:p>
+            <w:r>
+              <w:rPr>
+                <w:sz w:val="16"/>
+              </w:rPr>
+              <w:t>Choose 5 min, run and record 22, exchange tests 8</w:t>
+            </w:r>
+          </w:p>
+        </w:tc>
+      </w:tr>
+      <w:tr>
+        <w:tc>
+          <w:tcPr>
+            <w:tcW w:type="dxa" w:w="3278"/>
+          </w:tcPr>
+          <w:p>
+            <w:r>
+              <w:rPr>
+                <w:sz w:val="16"/>
+              </w:rPr>
+              <w:t>225–240</w:t>
+            </w:r>
+          </w:p>
+        </w:tc>
+        <w:tc>
+          <w:tcPr>
+            <w:tcW w:type="dxa" w:w="3278"/>
+          </w:tcPr>
+          <w:p>
+            <w:r>
+              <w:rPr>
+                <w:sz w:val="16"/>
+              </w:rPr>
+              <w:t>Demos</w:t>
+            </w:r>
+          </w:p>
+        </w:tc>
+        <w:tc>
+          <w:tcPr>
+            <w:tcW w:type="dxa" w:w="3278"/>
+          </w:tcPr>
+          <w:p>
+            <w:r>
+              <w:rPr>
+                <w:sz w:val="16"/>
+              </w:rPr>
+              <w:t>Prepare 4 min, show results 8, reflect and save 3</w:t>
+            </w:r>
+          </w:p>
+        </w:tc>
+      </w:tr>
+    </w:tbl>
+    <w:p>
+      <w:r>
+        <w:t>Exactly 240 minutes. Do not add the live lab as an extra lesson. The camera notebook contains optional extensions: select one controlled observation experiment within the 20-minute perception block; leave further list experiments for challenges. Definitions follow visible examples, not a vocabulary lecture.</w:t>
+      </w:r>
+    </w:p>
+    <w:p>
+      <w:pPr>
+        <w:pStyle w:val="Heading1"/>
+      </w:pPr>
+      <w:r>
+        <w:t>Beginner prompts and solutions</w:t>
+      </w:r>
+    </w:p>
+    <w:p>
+      <w:r>
+        <w:t>A: show Shift+Enter, output, quotes and indentation. A variable stores a value with =; == compares values. Original loop prints 1, 2, 3. Five repeats print 1–5. Red chooses left; blue right; yellow reject. If a quote is missing, read the last error line, repair one quote and rerun. A kernel restart clears values but preserves saved edits; run setup again.</w:t>
+      </w:r>
+    </w:p>
+    <w:p>
+      <w:r>
+        <w:t>B: prepared red, blue and background classes reduce setup time. Keep a few examples out of training. Ask what changes when background or illumination changes. The notebook photograph crops are real photographs with human descriptions; its report lists are controlled teaching data, not output of an implemented camera classifier. Actual red reported blue goes right; None rejects. A plausible incorrect report cannot be detected by the routing rule alone. Offline use the photograph and actual/report comparison; avoid presenting demo counts as recognition accuracy.</w:t>
+      </w:r>
+    </w:p>
+    <w:p>
+      <w:r>
+        <w:t>D: baseline is left 2, right 2, reject 1, with five belt advances and actions left/right/left/reject/right. Swapping rules has identical totals for this balanced input but different actions. Use three reds and one blue to reveal the difference in counts. Stop precedes observation and placement. Adding green without a rule rejects it; with a green-to-left rule it reaches left. None, unknown and invalid destinations reject. Counting every object does not prove every route is correct.</w:t>
+      </w:r>
+    </w:p>
+    <w:p>
+      <w:r>
+        <w:t>E: select two experiments, reset the original inputs between them and record predictions before running. Adding None, unknown, 42 and empty text to the baseline yields left 2, right 2, reject 5. Red-to-middle produces left 0, right 2, reject 3. Ten reports must produce ten outcomes. Ask early finishers for a test that detects swapped rules.</w:t>
+      </w:r>
+    </w:p>
+    <w:p>
+      <w:pPr>
+        <w:pStyle w:val="Heading1"/>
+      </w:pPr>
+      <w:r>
+        <w:t>Three stations</w:t>
+      </w:r>
+    </w:p>
+    <w:p>
+      <w:r>
+        <w:t>Use three groups: robot → camera → virtual; camera → virtual → robot; virtual → robot → camera. Each slot uses explain 2 min, try 9, explain evidence 3, save and rotate 1.</w:t>
+      </w:r>
+    </w:p>
+    <w:p>
+      <w:r>
+        <w:t>Robot and twin: open Robot_Candy_Factory_Live_SO101.ipynb. It defaults to invented DEMO data. Students choose one body joint, read a graph and calculate one relative versus absolute prediction. Relative mapping is follower start + leader now − leader start; 30 + 15 − 10 = 35 degrees. Absolute prediction is 15 degrees. Angle differences can be expected in relative mode. The gripper JointState is a visual proxy and is excluded. A twin follows measurements; it is not an independent confirmation of reality.</w:t>
+      </w:r>
+    </w:p>
+    <w:p>
+      <w:r>
+        <w:t>Camera and conveyor: trace move → stop → observe → decide → pick using paper objects or a qualified instructor demonstration. Ask why stopping before picking matters. Change one visual condition and explain uncertainty. No student connects motor hardware or changes station controls.</w:t>
+      </w:r>
+    </w:p>
+    <w:p>
+      <w:r>
+        <w:t>Virtual robot: run the notebook's short destination sequence; compare order and totals. Original left/right/left has the same totals as left/left/right. Add reject, then middle; invalid destinations reject. Optional kinematics activity is linked in workshop-resources.md; use the sequence fallback if unavailable. A destination label is not a physical motor coordinate.</w:t>
+      </w:r>
+    </w:p>
+    <w:p>
+      <w:pPr>
+        <w:pStyle w:val="Heading1"/>
+      </w:pPr>
+      <w:r>
+        <w:t>Live observer preparation</w:t>
+      </w:r>
+    </w:p>
+    <w:p>
+      <w:r>
+        <w:t>Use the full checkout on the same station host as ROS. Keep the existing commissioned resident controller; the observer starts no controller, opens no USB, calls no ROS services and reads only /leader/joint_states, /follower/joint_states and /follower/teleop_status. Real enable, mode selection and stop belong in the instructor's RViz operations panel. Review current physical acceptance evidence before demonstrating motion.</w:t>
       </w:r>
     </w:p>
     <w:p>
@@ -71,27 +578,7 @@
           <w:rFonts w:ascii="DejaVu Sans Mono" w:hAnsi="DejaVu Sans Mono"/>
           <w:sz w:val="17"/>
         </w:rPr>
-        <w:t>.venv-workshop/bin/python exercises/make_student_bundle.py --output docs/student-workshop.zip</w:t>
-      </w:r>
-    </w:p>
-    <w:p>
-      <w:r>
-        <w:t xml:space="preserve">Copy the ZIP to student machines and extract it. Prepare the same dependencies on those machines before class; a virtual environment copied from another machine is not portable. On Windows the environment Python is </w:t>
-      </w:r>
-      <w:r>
-        <w:rPr>
-          <w:rFonts w:ascii="DejaVu Sans Mono" w:hAnsi="DejaVu Sans Mono"/>
-          <w:sz w:val="18"/>
-        </w:rPr>
-        <w:t>.venv-workshop\Scripts\python.exe</w:t>
-      </w:r>
-      <w:r>
-        <w:t>. Install using that Python and the same requirements file.</w:t>
-      </w:r>
-    </w:p>
-    <w:p>
-      <w:r>
-        <w:t>Launch from the extracted folder:</w:t>
+        <w:t># Offline invented examples, no ROS needed</w:t>
       </w:r>
     </w:p>
     <w:p>
@@ -100,259 +587,7 @@
           <w:rFonts w:ascii="DejaVu Sans Mono" w:hAnsi="DejaVu Sans Mono"/>
           <w:sz w:val="17"/>
         </w:rPr>
-        <w:t>.venv-workshop/bin/python notebooks/launch.py</w:t>
-      </w:r>
-    </w:p>
-    <w:p>
-      <w:r>
-        <w:t xml:space="preserve">If Jupyter is already prepared under another interpreter, run that interpreter followed by </w:t>
-      </w:r>
-      <w:r>
-        <w:rPr>
-          <w:rFonts w:ascii="DejaVu Sans Mono" w:hAnsi="DejaVu Sans Mono"/>
-          <w:sz w:val="18"/>
-        </w:rPr>
-        <w:t>notebooks/launch.py</w:t>
-      </w:r>
-      <w:r>
-        <w:t>. The launcher opens the student notebook in JupyterLab with the bundle folder as its root. On Windows use the prepared Python executable with the same argument. Make a team copy with File → Save Notebook As; retain the original. Restarting the kernel clears memory, not saved file edits. Keep the instructor notebook away from the learner ZIP.</w:t>
-      </w:r>
-    </w:p>
-    <w:p>
-      <w:r>
-        <w:t>Before students arrive, open the notebook, run setup and the first mission, and check that the bins appear. Confirm that a fresh copy runs top to bottom. Print one worksheet per pair. Project the eight introduction slides. If hardware is unavailable, use the station photograph, paper objects and notebook simulation for all rotations. Only the instructor controls physical equipment; autonomous physical sorting is not established by these notebook checks.</w:t>
-      </w:r>
-    </w:p>
-    <w:p>
-      <w:pPr>
-        <w:pStyle w:val="Heading1"/>
-      </w:pPr>
-      <w:r>
-        <w:t>Introduction 25 minutes</w:t>
-      </w:r>
-    </w:p>
-    <w:p>
-      <w:r>
-        <w:t>Use the eight slide deck and its speaker notes. Ask students how they would sort one object by hand. Build observe → decide → act → check from their answers. Point out the camera, conveyor and robot in the real station photograph. Define sensor as something that measures and actuator as something that changes the world. Ask what should happen when a camera report is missing. Finish by showing exactly how to open a team copy, click a code cell, press Shift+Enter, find output and save.</w:t>
-      </w:r>
-    </w:p>
-    <w:p>
-      <w:pPr>
-        <w:pStyle w:val="Heading1"/>
-      </w:pPr>
-      <w:r>
-        <w:t>A First instructions 25 minutes</w:t>
-      </w:r>
-    </w:p>
-    <w:p>
-      <w:r>
-        <w:t xml:space="preserve">Allow 5 minutes for the one-line worked example and notebook controls, 8 minutes for reading and running the original mission, 8 minutes for individual changes and 4 minutes for pair explanation. Ask “What will the last object number be?” before running. Point to a single </w:t>
-      </w:r>
-      <w:r>
-        <w:rPr>
-          <w:rFonts w:ascii="DejaVu Sans Mono" w:hAnsi="DejaVu Sans Mono"/>
-          <w:sz w:val="18"/>
-        </w:rPr>
-        <w:t>=</w:t>
-      </w:r>
-      <w:r>
-        <w:t xml:space="preserve"> storing a value, a double </w:t>
-      </w:r>
-      <w:r>
-        <w:rPr>
-          <w:rFonts w:ascii="DejaVu Sans Mono" w:hAnsi="DejaVu Sans Mono"/>
-          <w:sz w:val="18"/>
-        </w:rPr>
-        <w:t>==</w:t>
-      </w:r>
-      <w:r>
-        <w:t xml:space="preserve"> asking a question, quotes marking text and four spaces grouping a loop body. Avoid introducing concepts that have not appeared yet.</w:t>
-      </w:r>
-    </w:p>
-    <w:p>
-      <w:r>
-        <w:t xml:space="preserve">Expected original output: object numbers 1, 2, 3 and decision left. Five repetitions produce 1–5; blue chooses right; yellow chooses reject. Green extension uses another </w:t>
-      </w:r>
-      <w:r>
-        <w:rPr>
-          <w:rFonts w:ascii="DejaVu Sans Mono" w:hAnsi="DejaVu Sans Mono"/>
-          <w:sz w:val="18"/>
-        </w:rPr>
-        <w:t>elif COLOR == "green":</w:t>
-      </w:r>
-      <w:r>
-        <w:t xml:space="preserve"> before else and an indented </w:t>
-      </w:r>
-      <w:r>
-        <w:rPr>
-          <w:rFonts w:ascii="DejaVu Sans Mono" w:hAnsi="DejaVu Sans Mono"/>
-          <w:sz w:val="18"/>
-        </w:rPr>
-        <w:t>destination = "left"</w:t>
-      </w:r>
-      <w:r>
-        <w:t xml:space="preserve">. First hint: change only the value on the right of </w:t>
-      </w:r>
-      <w:r>
-        <w:rPr>
-          <w:rFonts w:ascii="DejaVu Sans Mono" w:hAnsi="DejaVu Sans Mono"/>
-          <w:sz w:val="18"/>
-        </w:rPr>
-        <w:t>=</w:t>
-      </w:r>
-      <w:r>
-        <w:t>. Second hint: point to the quoted color. Ask a student to explain why changing a name label does not change the repeat count.</w:t>
-      </w:r>
-    </w:p>
-    <w:p>
-      <w:r>
-        <w:t>If a quote is missing, read the last error line aloud, repair one quote and rerun. If indentation changes, compare the line with the clean original. Demonstrate this once; do not treat an error as failure.</w:t>
-      </w:r>
-    </w:p>
-    <w:p>
-      <w:pPr>
-        <w:pStyle w:val="Heading1"/>
-      </w:pPr>
-      <w:r>
-        <w:t>B Camera information 35 minutes</w:t>
-      </w:r>
-    </w:p>
-    <w:p>
-      <w:r>
-        <w:t>Spend 8 minutes comparing the real photograph crops and their human labels, 12 minutes on the five simulated reports, 10 minutes on actual versus reported color, and 5 minutes sharing explanations. The photograph contains real colored objects; the lists are controlled simulated sensor reports, not an implemented image classifier.</w:t>
-      </w:r>
-    </w:p>
-    <w:p>
-      <w:r>
-        <w:t>Default counts: left 2, right 2, reject 1. Changing the second blue report to red produces 3, 1, 1. Adding green without a rule adds a reject. Reverse the two destination variables to flip individual actions. For green insert an elif before else; preserve fallback rejection. In the actual/report experiment, changing only the first report from red to blue sends an actual red object right. Changing it to None rejects it. A believable incorrect report is not detectable by this routing rule alone.</w:t>
-      </w:r>
-    </w:p>
-    <w:p>
-      <w:r>
-        <w:t>First hint: trace one list item through its condition. Second hint: underline the report and destination separately. Ask “Did the program do the wrong thing, or did it receive wrong information?” Invite lighting, shadows and occlusion examples. Do not claim the human crop labels are measured recognition accuracy.</w:t>
-      </w:r>
-    </w:p>
-    <w:p>
-      <w:pPr>
-        <w:pStyle w:val="Heading1"/>
-      </w:pPr>
-      <w:r>
-        <w:t>Break 10 minutes</w:t>
-      </w:r>
-    </w:p>
-    <w:p>
-      <w:r>
-        <w:t>Save work. Display the three rotation groups and their starting stations. Keep a clean original ready for students who need recovery.</w:t>
-      </w:r>
-    </w:p>
-    <w:p>
-      <w:pPr>
-        <w:pStyle w:val="Heading1"/>
-      </w:pPr>
-      <w:r>
-        <w:t>C Three rotations 45 minutes</w:t>
-      </w:r>
-    </w:p>
-    <w:p>
-      <w:r>
-        <w:t>Run three slots of exactly 15 minutes. Group 1: robot → conveyor → camera. Group 2: conveyor → camera → robot. Group 3: camera → robot → conveyor. In each slot allow 2 minutes to describe the task, 9 minutes to try it, 3 minutes to explain an observation and 1 minute to rotate.</w:t>
-      </w:r>
-    </w:p>
-    <w:p>
-      <w:r>
-        <w:t>At robot use notebook 02 to plan left/left/right, then add reject and an invalid command. Default left/right/left gives left 2/right 1; changed left/left/right has the same totals and a different order. Middle becomes reject. Ask what a real arm needs beyond a label: coordinates relative to a reference, reachable positions, a safe path and gripper timing. A recorded action is not proof of a completed placement.</w:t>
-      </w:r>
-    </w:p>
-    <w:p>
-      <w:r>
-        <w:t>At conveyor ask one partner to call move → stop → observe → decide → pick while the other moves paper objects. Ask what changes if pick happens before stop. At camera compare crops, hide part of one object and discuss uncertain reports. These are complete fallback activities; live demonstrations supplement them only when the instructor has qualified the station. Keep students outside any moving workspace.</w:t>
-      </w:r>
-    </w:p>
-    <w:p>
-      <w:pPr>
-        <w:pStyle w:val="Heading1"/>
-      </w:pPr>
-      <w:r>
-        <w:t>D Integrated factory 45 minutes</w:t>
-      </w:r>
-    </w:p>
-    <w:p>
-      <w:r>
-        <w:t>Use 8 minutes to trace the worked two-object example, 12 minutes for five-object predictions and baseline run, 15 minutes for rule changes, and 10 minutes to compare order and counts. Explain a mapping only now, using red → left and blue → right. Point out braces, colons and commas in the code.</w:t>
-      </w:r>
-    </w:p>
-    <w:p>
-      <w:r>
-        <w:t>Baseline: left 2/right 2/reject 1, five advances and actions left/right/left/reject/right. A reversed rule has identical totals on this balanced input but different actions. This is a useful discovery: totals alone can hide a mistake. Ask teams to invent an asymmetric input. Every cycle stops the belt before reading or picking, and stops again on completion. The helper recreates state each time the cell runs.</w:t>
-      </w:r>
-    </w:p>
-    <w:p>
-      <w:r>
-        <w:t xml:space="preserve">Green extension adds </w:t>
-      </w:r>
-      <w:r>
-        <w:rPr>
-          <w:rFonts w:ascii="DejaVu Sans Mono" w:hAnsi="DejaVu Sans Mono"/>
-          <w:sz w:val="18"/>
-        </w:rPr>
-        <w:t>"green": "left"</w:t>
-      </w:r>
-      <w:r>
-        <w:t xml:space="preserve"> and at least one green report. None and unknown remain rejected with the normal red/blue/green rules. An invalid destination such as middle is rejected. The count assertion checks that objects are not lost; it does not prove each destination is correct.</w:t>
-      </w:r>
-    </w:p>
-    <w:p>
-      <w:pPr>
-        <w:pStyle w:val="Heading1"/>
-      </w:pPr>
-      <w:r>
-        <w:t>E Independent experiments 40 minutes</w:t>
-      </w:r>
-    </w:p>
-    <w:p>
-      <w:r>
-        <w:t>Give 5 minutes to choose two challenges and write predictions, 25 minutes to run and record them, and 10 minutes to swap tests with another pair. Offer one hint at a time. Early finishers design a test that catches swapped rules; they do not need physical hardware.</w:t>
-      </w:r>
-    </w:p>
-    <w:p>
-      <w:r>
-        <w:t xml:space="preserve">Suggested answers: adding None, unknown, 42 and empty text to baseline produces left 2/right 2/reject 5. A middle destination for red makes baseline left 0/right 2/reject 3. A ten-report run must total ten. Green without a rule rejects; with a valid rule it reaches that bin. Swapping an unbalanced input changes totals. An assertion like </w:t>
-      </w:r>
-      <w:r>
-        <w:rPr>
-          <w:rFonts w:ascii="DejaVu Sans Mono" w:hAnsi="DejaVu Sans Mono"/>
-          <w:sz w:val="18"/>
-        </w:rPr>
-        <w:t>assert factory.counts["reject"] == 1</w:t>
-      </w:r>
-      <w:r>
-        <w:t xml:space="preserve"> is useful on baseline but insufficient alone.</w:t>
-      </w:r>
-    </w:p>
-    <w:p>
-      <w:pPr>
-        <w:pStyle w:val="Heading1"/>
-      </w:pPr>
-      <w:r>
-        <w:t>Closing 15 minutes</w:t>
-      </w:r>
-    </w:p>
-    <w:p>
-      <w:r>
-        <w:t>Give pairs 5 minutes to prepare a result, 7 minutes for several short presentations and 3 minutes for a final explanation and save. Each presentation includes a prediction, a changed rule, observed evidence and one real-world limitation. Invite quieter students to explain a single route. Collect worksheets as formative evidence, not a speed contest.</w:t>
-      </w:r>
-    </w:p>
-    <w:p>
-      <w:pPr>
-        <w:pStyle w:val="Heading1"/>
-      </w:pPr>
-      <w:r>
-        <w:t>If the notebook environment fails</w:t>
-      </w:r>
-    </w:p>
-    <w:p>
-      <w:r>
-        <w:t>Use the prepared plain Python route. Open a terminal, then run one command at a time. The scripts locate their own imports, so they also work when invoked with an absolute path from another directory.</w:t>
+        <w:t>.venv-workshop/bin/python tools/launch_live_workshop.py</w:t>
       </w:r>
     </w:p>
     <w:p>
@@ -361,7 +596,7 @@
           <w:rFonts w:ascii="DejaVu Sans Mono" w:hAnsi="DejaVu Sans Mono"/>
           <w:sz w:val="17"/>
         </w:rPr>
-        <w:t>python3 exercises/check_setup.py</w:t>
+        <w:t># Instructor only, existing station topics through existing ROS wrapper</w:t>
       </w:r>
     </w:p>
     <w:p>
@@ -370,48 +605,48 @@
           <w:rFonts w:ascii="DejaVu Sans Mono" w:hAnsi="DejaVu Sans Mono"/>
           <w:sz w:val="17"/>
         </w:rPr>
-        <w:t>python3 exercises/01_python.py</w:t>
+        <w:t>ROS_DOMAIN_ID=76 .venv-workshop/bin/python tools/launch_live_workshop.py --live</w:t>
       </w:r>
     </w:p>
     <w:p>
       <w:r>
-        <w:rPr>
-          <w:rFonts w:ascii="DejaVu Sans Mono" w:hAnsi="DejaVu Sans Mono"/>
-          <w:sz w:val="17"/>
-        </w:rPr>
-        <w:t>python3 exercises/03_vision.py</w:t>
+        <w:t>The helper defaults to this checkout's existing ros2/conda/so101-conda.sh run wrapper. It uses the prepared Conda ROS environment, while Jupyter stays isolated. For the remote station pass --ros-wrapper ~/.local/bin/station-fwmini4 --ros-wrapper-command ros-vulkan to the live launcher. This preserves the station's accepted environment. No container image is needed. The live Jupyter server uses loopback port 8890, separate from the student server on 8888; a second launch reports that the port is in use. Jupyter remains a normal Python kernel. Each capture starts a bounded subscriber through the existing prepared ROS wrapper; it collects for 3 seconds (maximum 5), samples at most 5 times/second and exits, destroying the node. The outer process timeout includes up to 20 seconds for ROS wrapper startup. This avoids installing incompatible ROS libraries into Jupyter. Localhost binding and normal Jupyter token authentication are preserved. For a remote browser use the prepared SSH forwarding arrangement; do not expose an unauthenticated notebook server.</w:t>
       </w:r>
     </w:p>
     <w:p>
       <w:r>
-        <w:rPr>
-          <w:rFonts w:ascii="DejaVu Sans Mono" w:hAnsi="DejaVu Sans Mono"/>
-          <w:sz w:val="17"/>
-        </w:rPr>
-        <w:t>python3 exercises/02_robot.py</w:t>
+        <w:t>Freshness requires receipt age and source age at most one second. Joint source age is ROS header age; the follower header is publication time, not an independent motor acquisition timestamp. The controller retains its own acquisition freshness gates. Teleop status uses same-host monotonic time; latched disabled status may be old. The notebook hides expired values, reports missing streams and never silently substitutes demo data. A fresh topic does not establish motion permission, independent geometry accuracy or physical sorting success.</w:t>
       </w:r>
     </w:p>
     <w:p>
       <w:r>
-        <w:rPr>
-          <w:rFonts w:ascii="DejaVu Sans Mono" w:hAnsi="DejaVu Sans Mono"/>
-          <w:sz w:val="17"/>
-        </w:rPr>
-        <w:t>python3 exercises/04_sort.py</w:t>
+        <w:t>If a LIVE stream disappears, rerun the observation after the instructor restores the existing station. Every call starts a new node; reconnection needs no notebook service. On failure use the explicit DEMO launcher and restart the kernel. Never infer zero from missing data. The observer is additional visualization, not an emergency stop or safety monitor.</w:t>
+      </w:r>
+    </w:p>
+    <w:p>
+      <w:pPr>
+        <w:pStyle w:val="Heading1"/>
+      </w:pPr>
+      <w:r>
+        <w:t>Offline and environment fallback</w:t>
       </w:r>
     </w:p>
     <w:p>
       <w:r>
-        <w:rPr>
-          <w:rFonts w:ascii="DejaVu Sans Mono" w:hAnsi="DejaVu Sans Mono"/>
-          <w:sz w:val="17"/>
-        </w:rPr>
-        <w:t>python3 exercises/05_visual_sort.py</w:t>
+        <w:t>Run python3 exercises/check_setup.py, then exercises/01_python.py, 03_vision.py, 02_robot.py and 04_sort.py in lesson order. Edit the marked STUDENT AREA, save and rerun. Python standard library is sufficient. Run exercises/05_visual_sort.py and open sorting-result.html for an offline browser animation. If computers fail, use paper objects, report cards and three bins with the same predictions and worksheet.</w:t>
+      </w:r>
+    </w:p>
+    <w:p>
+      <w:pPr>
+        <w:pStyle w:val="Heading1"/>
+      </w:pPr>
+      <w:r>
+        <w:t>Build and verification</w:t>
       </w:r>
     </w:p>
     <w:p>
       <w:r>
-        <w:t>Students edit the marked STUDENT AREA, save, and rerun the same command. Open sorting-result.html in a browser for the fallback animation; it needs no network. Use student-exercises.md for explanations and print the station photo if necessary. If no computers work, enact the same decision rules with paper reports and three labeled bins and record predictions on the worksheet.</w:t>
+        <w:t>Build notebooks and shared handbook text with python tools/build_notebooks.py. Build printable handouts using SOFFICE=/path/to/prepared/soffice python tools/build_materials.py --handouts-only. Build the learner ZIP with python exercises/make_student_bundle.py --output docs/student-workshop.zip. Execute tools/verify_notebooks.py in the prepared environment; it opens fresh kernels and checks meaningful variants. These software checks do not establish physical commissioning or complete sorting acceptance.</w:t>
       </w:r>
     </w:p>
     <w:sectPr>

</xml_diff>

<commit_message>
Refresh printed workshop guides for Blockly station activities
Keep the 240-minute schedule; distinguish external web activities from the offline factory and explain the supervised taught-stroke extension and commissioned sorting transaction. Regenerate all handouts and learner bundle from current sources.

Validation: 18 learner-readiness tests; all 12 printed pages visually inspected; current instructor and lesson-plan paragraphs match DOCX/PDF; all 78 ZIP entries match current files.
</commit_message>
<xml_diff>
--- a/docs/instructor-guide.docx
+++ b/docs/instructor-guide.docx
@@ -62,7 +62,7 @@
     </w:p>
     <w:p>
       <w:r>
-        <w:t>Windows uses .venv-workshop\Scripts\python.exe with the same launcher. The launcher opens a local JupyterLab with the bundle as its root. No JupyterLite service is provided. Internet is needed for the optional Blockly and Teachable Machine activities; check the links and prepare offline alternatives in workshop-resources.md. Use nonpersonal objects, not student faces, for camera examples. Print one worksheet per pair.</w:t>
+        <w:t>Windows uses .venv-workshop\Scripts\python.exe with the same launcher. The launcher opens a local JupyterLab with the bundle as its root. No JupyterLite service is provided. Internet is needed for the external Blockly Maze and Teachable Machine websites; check the links and prepare offline alternatives in workshop-resources.md. The bundled Blockly factory runs offline after setup; follow docs/blockly-student.md for the learner challenge and docs/blockly-workshop.md for instructor setup. Use nonpersonal objects, not student faces, for camera examples. Print one worksheet per pair.</w:t>
       </w:r>
     </w:p>
     <w:p>
@@ -438,7 +438,7 @@
               <w:rPr>
                 <w:sz w:val="16"/>
               </w:rPr>
-              <w:t>E Challenges</w:t>
+              <w:t>E Blockly factory or notebook challenges</w:t>
             </w:r>
           </w:p>
         </w:tc>
@@ -528,7 +528,7 @@
     </w:p>
     <w:p>
       <w:r>
-        <w:t>E: select two experiments, reset the original inputs between them and record predictions before running. Adding None, unknown, 42 and empty text to the baseline yields left 2, right 2, reject 5. Red-to-middle produces left 0, right 2, reject 3. Ten reports must produce ten outcomes. Ask early finishers for a test that detects swapped rules.</w:t>
+        <w:t>E: pairs choose the offline Blockly factory challenge or notebook challenges for the same 35-minute slot. For Blockly, start in simulation: predict and run, change the sequence, add color branches, test unknown, then save and explain the result. Use the instructor Blockly guide for setup and recovery. For notebooks, select two experiments, reset the original inputs between them and record predictions before running. Adding None, unknown, 42 and empty text to the baseline yields left 2, right 2, reject 5. Red-to-middle produces left 0, right 2, reject 3. Ten reports must produce ten outcomes. Ask early finishers for a test that detects swapped rules.</w:t>
       </w:r>
     </w:p>
     <w:p>
@@ -547,6 +547,11 @@
     <w:p>
       <w:r>
         <w:t>Robot and twin: open Robot_Candy_Factory_Live_SO101.ipynb. It defaults to invented DEMO data. Students choose one body joint, read a graph and calculate one relative versus absolute prediction. Relative mapping is follower start + leader now − leader start; 30 + 15 − 10 = 35 degrees. Absolute prediction is 15 degrees. Angle differences can be expected in relative mode. The gripper JointState is a visual proxy and is excluded. A twin follows measurements; it is not an independent confirmation of reality.</w:t>
+      </w:r>
+    </w:p>
+    <w:p>
+      <w:r>
+        <w:t>A supervised physical Blockly extension replaces time within the robot rotation or challenge slot; it adds no lesson time. After simulation, teach a short fixed-jaw stroke with the leader, record the follower, return to the checked starting pose and replay once at speed 0.5. Add one approved EV3 action only when commissioned; require unknown to stop before manipulation. Dispensing and jaw control need their own commissioning. For payload sorting, the separate Run one commissioned sorting cycle block lets the native station own the complete grasp and object ownership transaction; a taught replay plus jaw movement does not establish a grasp. Review setup and recovery in docs/blockly-workshop.md.</w:t>
       </w:r>
     </w:p>
     <w:p>

</xml_diff>

<commit_message>
feat: add canonical workshop and guarded shared station programs
Generate the four-hour curriculum and editable offline materials from one source. Share bounded Blockly and executable Python programs, add calibrated taught pick/place and restart-safe recording identity, and close stale-control STOP races. Add read-only readiness diagnostics and experimental resident Vulkan, video, alignment and geometry preparation with explicit qualification gates. Software checkpoint evidence and remaining physical and GPU acceptance work are documented; this is not the final qualified station release.
</commit_message>
<xml_diff>
--- a/docs/instructor-guide.docx
+++ b/docs/instructor-guide.docx
@@ -7,70 +7,22 @@
         <w:pStyle w:val="Title"/>
       </w:pPr>
       <w:r>
-        <w:t>Teaching the sorting factory workshop</w:t>
+        <w:t>Beginner robot factory instructor guide</w:t>
       </w:r>
     </w:p>
     <w:p>
       <w:r>
-        <w:t>22 October 2026 · Four hours · First semester · No prerequisites</w:t>
+        <w:t>Build an offline robot factory from ordered instructions. Start with one fixed pickup fixture and one fixed destination. Pair roles: driver edits; observer predicts and checks; swap halfway. Only the instructor enables supervised hardware.</w:t>
       </w:r>
     </w:p>
     <w:p>
       <w:r>
-        <w:t>Students learn by predicting a small change, running it and explaining a visible result. Use the student notebook as the main route. The instructor notebook adds guidance beside identical executable activities. Swap typing and predicting roles every activity. Red routes left, blue right, all other reports reject.</w:t>
-      </w:r>
-    </w:p>
-    <w:p>
-      <w:pPr>
-        <w:pStyle w:val="Heading1"/>
-      </w:pPr>
-      <w:r>
-        <w:t>Prepare before class</w:t>
+        <w:t>Simulation, paper, reports and measured physical outcomes are separate evidence. Never claim a grasp or placement from a command log alone. Unknown or stale observations require pause and inspection.</w:t>
       </w:r>
     </w:p>
     <w:p>
       <w:r>
-        <w:t>Prepare Python 3.11 or newer in an environment separate from ROS. Install notebooks/requirements.txt in that environment before class. Extract the complete student ZIP; retain exercises, notebooks and workshop together. Do not distribute the instructor notebook as learner material. Open a clean notebook, run setup and the first activity, save a team copy and demonstrate recovery after a kernel restart.</w:t>
-      </w:r>
-    </w:p>
-    <w:p>
-      <w:r>
-        <w:rPr>
-          <w:rFonts w:ascii="DejaVu Sans Mono" w:hAnsi="DejaVu Sans Mono"/>
-          <w:sz w:val="17"/>
-        </w:rPr>
-        <w:t>python3 -m venv .venv-workshop</w:t>
-      </w:r>
-    </w:p>
-    <w:p>
-      <w:r>
-        <w:rPr>
-          <w:rFonts w:ascii="DejaVu Sans Mono" w:hAnsi="DejaVu Sans Mono"/>
-          <w:sz w:val="17"/>
-        </w:rPr>
-        <w:t>.venv-workshop/bin/python -m pip install -r notebooks/requirements.txt</w:t>
-      </w:r>
-    </w:p>
-    <w:p>
-      <w:r>
-        <w:rPr>
-          <w:rFonts w:ascii="DejaVu Sans Mono" w:hAnsi="DejaVu Sans Mono"/>
-          <w:sz w:val="17"/>
-        </w:rPr>
-        <w:t>.venv-workshop/bin/python notebooks/launch.py</w:t>
-      </w:r>
-    </w:p>
-    <w:p>
-      <w:r>
-        <w:t>Windows uses .venv-workshop\Scripts\python.exe with the same launcher. The launcher opens a local JupyterLab with the bundle as its root. No JupyterLite service is provided. Internet is needed for the external Blockly Maze and Teachable Machine websites; check the links and prepare offline alternatives in workshop-resources.md. The bundled Blockly factory runs offline after setup; follow docs/blockly-student.md for the learner challenge and docs/blockly-workshop.md for instructor setup. Use nonpersonal objects, not student faces, for camera examples. Print one worksheet per pair.</w:t>
-      </w:r>
-    </w:p>
-    <w:p>
-      <w:pPr>
-        <w:pStyle w:val="Heading1"/>
-      </w:pPr>
-      <w:r>
-        <w:t>Timetable and transitions</w:t>
+        <w:t>Prepare local Blockly, learner notebooks and printed cards before class. Keep recovery, restart and physical enable controls with the instructor. No essential activity needs an external website. Use the paper route when a station gate is incomplete. Historical commissioning evidence remains in the operational runbooks.</w:t>
       </w:r>
     </w:p>
     <w:tbl>
@@ -97,7 +49,7 @@
               <w:rPr>
                 <w:sz w:val="16"/>
               </w:rPr>
-              <w:t>Elapsed minutes</w:t>
+              <w:t>Minutes</w:t>
             </w:r>
           </w:p>
         </w:tc>
@@ -110,7 +62,7 @@
               <w:rPr>
                 <w:sz w:val="16"/>
               </w:rPr>
-              <w:t>Task</w:t>
+              <w:t>Duration</w:t>
             </w:r>
           </w:p>
         </w:tc>
@@ -123,7 +75,7 @@
               <w:rPr>
                 <w:sz w:val="16"/>
               </w:rPr>
-              <w:t>Teaching move</w:t>
+              <w:t>Session</w:t>
             </w:r>
           </w:p>
         </w:tc>
@@ -138,7 +90,7 @@
               <w:rPr>
                 <w:sz w:val="16"/>
               </w:rPr>
-              <w:t>00–25</w:t>
+              <w:t>0-20</w:t>
             </w:r>
           </w:p>
         </w:tc>
@@ -151,7 +103,7 @@
               <w:rPr>
                 <w:sz w:val="16"/>
               </w:rPr>
-              <w:t>Introduction</w:t>
+              <w:t>20</w:t>
             </w:r>
           </w:p>
         </w:tc>
@@ -164,7 +116,7 @@
               <w:rPr>
                 <w:sz w:val="16"/>
               </w:rPr>
-              <w:t>Ask how humans sort; show sensing, deciding, acting and feedback; demonstrate notebook controls</w:t>
+              <w:t>Meet our factory</w:t>
             </w:r>
           </w:p>
         </w:tc>
@@ -179,7 +131,7 @@
               <w:rPr>
                 <w:sz w:val="16"/>
               </w:rPr>
-              <w:t>25–35</w:t>
+              <w:t>20-45</w:t>
             </w:r>
           </w:p>
         </w:tc>
@@ -192,7 +144,7 @@
               <w:rPr>
                 <w:sz w:val="16"/>
               </w:rPr>
-              <w:t>Blockly Maze</w:t>
+              <w:t>25</w:t>
             </w:r>
           </w:p>
         </w:tc>
@@ -205,7 +157,7 @@
               <w:rPr>
                 <w:sz w:val="16"/>
               </w:rPr>
-              <w:t>Levels 1–3 core; 4–5 stretch; reserve last minute to return to notebook</w:t>
+              <w:t>Ordered instructions</w:t>
             </w:r>
           </w:p>
         </w:tc>
@@ -220,7 +172,7 @@
               <w:rPr>
                 <w:sz w:val="16"/>
               </w:rPr>
-              <w:t>35–65</w:t>
+              <w:t>45-65</w:t>
             </w:r>
           </w:p>
         </w:tc>
@@ -233,7 +185,7 @@
               <w:rPr>
                 <w:sz w:val="16"/>
               </w:rPr>
-              <w:t>A Python</w:t>
+              <w:t>20</w:t>
             </w:r>
           </w:p>
         </w:tc>
@@ -246,7 +198,7 @@
               <w:rPr>
                 <w:sz w:val="16"/>
               </w:rPr>
-              <w:t>Greeting 6 min, repeat 8, condition 10, explanation and transition 6</w:t>
+              <w:t>Observations and uncertainty</w:t>
             </w:r>
           </w:p>
         </w:tc>
@@ -261,7 +213,7 @@
               <w:rPr>
                 <w:sz w:val="16"/>
               </w:rPr>
-              <w:t>65–85</w:t>
+              <w:t>65-95</w:t>
             </w:r>
           </w:p>
         </w:tc>
@@ -274,7 +226,7 @@
               <w:rPr>
                 <w:sz w:val="16"/>
               </w:rPr>
-              <w:t>B Teachable Machine</w:t>
+              <w:t>30</w:t>
             </w:r>
           </w:p>
         </w:tc>
@@ -287,7 +239,7 @@
               <w:rPr>
                 <w:sz w:val="16"/>
               </w:rPr>
-              <w:t>Classes 5 min, tests 7, changed condition 5, explanation 3</w:t>
+              <w:t>First Python edits</w:t>
             </w:r>
           </w:p>
         </w:tc>
@@ -302,7 +254,20 @@
               <w:rPr>
                 <w:sz w:val="16"/>
               </w:rPr>
-              <w:t>85–95</w:t>
+              <w:t>95-105</w:t>
+            </w:r>
+          </w:p>
+        </w:tc>
+        <w:tc>
+          <w:tcPr>
+            <w:tcW w:type="dxa" w:w="3278"/>
+          </w:tcPr>
+          <w:p>
+            <w:r>
+              <w:rPr>
+                <w:sz w:val="16"/>
+              </w:rPr>
+              <w:t>10</w:t>
             </w:r>
           </w:p>
         </w:tc>
@@ -319,6 +284,8 @@
             </w:r>
           </w:p>
         </w:tc>
+      </w:tr>
+      <w:tr>
         <w:tc>
           <w:tcPr>
             <w:tcW w:type="dxa" w:w="3278"/>
@@ -328,7 +295,33 @@
               <w:rPr>
                 <w:sz w:val="16"/>
               </w:rPr>
-              <w:t>Save; name three groups and starting stations</w:t>
+              <w:t>105-120</w:t>
+            </w:r>
+          </w:p>
+        </w:tc>
+        <w:tc>
+          <w:tcPr>
+            <w:tcW w:type="dxa" w:w="3278"/>
+          </w:tcPr>
+          <w:p>
+            <w:r>
+              <w:rPr>
+                <w:sz w:val="16"/>
+              </w:rPr>
+              <w:t>15</w:t>
+            </w:r>
+          </w:p>
+        </w:tc>
+        <w:tc>
+          <w:tcPr>
+            <w:tcW w:type="dxa" w:w="3278"/>
+          </w:tcPr>
+          <w:p>
+            <w:r>
+              <w:rPr>
+                <w:sz w:val="16"/>
+              </w:rPr>
+              <w:t>Teach inspect and replay demonstration</w:t>
             </w:r>
           </w:p>
         </w:tc>
@@ -343,7 +336,7 @@
               <w:rPr>
                 <w:sz w:val="16"/>
               </w:rPr>
-              <w:t>95–140</w:t>
+              <w:t>120-165</w:t>
             </w:r>
           </w:p>
         </w:tc>
@@ -356,7 +349,7 @@
               <w:rPr>
                 <w:sz w:val="16"/>
               </w:rPr>
-              <w:t>C Stations</w:t>
+              <w:t>45</w:t>
             </w:r>
           </w:p>
         </w:tc>
@@ -369,7 +362,7 @@
               <w:rPr>
                 <w:sz w:val="16"/>
               </w:rPr>
-              <w:t>Three 15-minute rotations including 1-minute transitions</w:t>
+              <w:t>Explore three stations</w:t>
             </w:r>
           </w:p>
         </w:tc>
@@ -384,7 +377,7 @@
               <w:rPr>
                 <w:sz w:val="16"/>
               </w:rPr>
-              <w:t>140–190</w:t>
+              <w:t>165-210</w:t>
             </w:r>
           </w:p>
         </w:tc>
@@ -397,7 +390,7 @@
               <w:rPr>
                 <w:sz w:val="16"/>
               </w:rPr>
-              <w:t>D Factory</w:t>
+              <w:t>45</w:t>
             </w:r>
           </w:p>
         </w:tc>
@@ -410,7 +403,7 @@
               <w:rPr>
                 <w:sz w:val="16"/>
               </w:rPr>
-              <w:t>Trace 10 min, baseline 12, change rule 15, compare routes 10, save 3</w:t>
+              <w:t>Build the physical sequence</w:t>
             </w:r>
           </w:p>
         </w:tc>
@@ -425,7 +418,7 @@
               <w:rPr>
                 <w:sz w:val="16"/>
               </w:rPr>
-              <w:t>190–225</w:t>
+              <w:t>210-230</w:t>
             </w:r>
           </w:p>
         </w:tc>
@@ -438,7 +431,7 @@
               <w:rPr>
                 <w:sz w:val="16"/>
               </w:rPr>
-              <w:t>E Blockly factory or notebook challenges</w:t>
+              <w:t>20</w:t>
             </w:r>
           </w:p>
         </w:tc>
@@ -451,7 +444,7 @@
               <w:rPr>
                 <w:sz w:val="16"/>
               </w:rPr>
-              <w:t>Choose 5 min, run and record 22, exchange tests 8</w:t>
+              <w:t>Improve one failure</w:t>
             </w:r>
           </w:p>
         </w:tc>
@@ -466,7 +459,7 @@
               <w:rPr>
                 <w:sz w:val="16"/>
               </w:rPr>
-              <w:t>225–240</w:t>
+              <w:t>230-240</w:t>
             </w:r>
           </w:p>
         </w:tc>
@@ -479,7 +472,7 @@
               <w:rPr>
                 <w:sz w:val="16"/>
               </w:rPr>
-              <w:t>Demos</w:t>
+              <w:t>10</w:t>
             </w:r>
           </w:p>
         </w:tc>
@@ -492,7 +485,500 @@
               <w:rPr>
                 <w:sz w:val="16"/>
               </w:rPr>
-              <w:t>Prepare 4 min, show results 8, reflect and save 3</w:t>
+              <w:t>Three pair demonstrations</w:t>
+            </w:r>
+          </w:p>
+        </w:tc>
+      </w:tr>
+    </w:tbl>
+    <w:p>
+      <w:pPr>
+        <w:pStyle w:val="Heading1"/>
+      </w:pPr>
+      <w:r>
+        <w:t>Pair rotations</w:t>
+      </w:r>
+    </w:p>
+    <w:p>
+      <w:r>
+        <w:t>Each 15-minute slot includes 2 minutes to save and transition. Driver edits; observer predicts and checks. Swap roles halfway. One instructor controls the physical integration station.</w:t>
+      </w:r>
+    </w:p>
+    <w:p>
+      <w:pPr>
+        <w:pStyle w:val="Heading2"/>
+      </w:pPr>
+      <w:r>
+        <w:t>Explore three stations</w:t>
+      </w:r>
+    </w:p>
+    <w:tbl>
+      <w:tblPr>
+        <w:tblStyle w:val="LightShading-Accent1"/>
+        <w:tblW w:type="auto" w:w="0"/>
+        <w:tblLook w:firstColumn="1" w:firstRow="1" w:lastColumn="0" w:lastRow="0" w:noHBand="0" w:noVBand="1" w:val="04A0"/>
+      </w:tblPr>
+      <w:tblGrid>
+        <w:gridCol w:w="2459"/>
+        <w:gridCol w:w="2459"/>
+        <w:gridCol w:w="2459"/>
+        <w:gridCol w:w="2459"/>
+      </w:tblGrid>
+      <w:tr>
+        <w:trPr>
+          <w:tblHeader/>
+        </w:trPr>
+        <w:tc>
+          <w:tcPr>
+            <w:tcW w:type="dxa" w:w="2459"/>
+          </w:tcPr>
+          <w:p>
+            <w:r>
+              <w:rPr>
+                <w:sz w:val="16"/>
+              </w:rPr>
+              <w:t>Slot</w:t>
+            </w:r>
+          </w:p>
+        </w:tc>
+        <w:tc>
+          <w:tcPr>
+            <w:tcW w:type="dxa" w:w="2459"/>
+          </w:tcPr>
+          <w:p>
+            <w:r>
+              <w:rPr>
+                <w:sz w:val="16"/>
+              </w:rPr>
+              <w:t>Pair A</w:t>
+            </w:r>
+          </w:p>
+        </w:tc>
+        <w:tc>
+          <w:tcPr>
+            <w:tcW w:type="dxa" w:w="2459"/>
+          </w:tcPr>
+          <w:p>
+            <w:r>
+              <w:rPr>
+                <w:sz w:val="16"/>
+              </w:rPr>
+              <w:t>Pair B</w:t>
+            </w:r>
+          </w:p>
+        </w:tc>
+        <w:tc>
+          <w:tcPr>
+            <w:tcW w:type="dxa" w:w="2459"/>
+          </w:tcPr>
+          <w:p>
+            <w:r>
+              <w:rPr>
+                <w:sz w:val="16"/>
+              </w:rPr>
+              <w:t>Pair C</w:t>
+            </w:r>
+          </w:p>
+        </w:tc>
+      </w:tr>
+      <w:tr>
+        <w:tc>
+          <w:tcPr>
+            <w:tcW w:type="dxa" w:w="2459"/>
+          </w:tcPr>
+          <w:p>
+            <w:r>
+              <w:rPr>
+                <w:sz w:val="16"/>
+              </w:rPr>
+              <w:t>1</w:t>
+            </w:r>
+          </w:p>
+        </w:tc>
+        <w:tc>
+          <w:tcPr>
+            <w:tcW w:type="dxa" w:w="2459"/>
+          </w:tcPr>
+          <w:p>
+            <w:r>
+              <w:rPr>
+                <w:sz w:val="16"/>
+              </w:rPr>
+              <w:t>Arm and twin observation</w:t>
+            </w:r>
+          </w:p>
+        </w:tc>
+        <w:tc>
+          <w:tcPr>
+            <w:tcW w:type="dxa" w:w="2459"/>
+          </w:tcPr>
+          <w:p>
+            <w:r>
+              <w:rPr>
+                <w:sz w:val="16"/>
+              </w:rPr>
+              <w:t>Conveyor and observation sequencing</w:t>
+            </w:r>
+          </w:p>
+        </w:tc>
+        <w:tc>
+          <w:tcPr>
+            <w:tcW w:type="dxa" w:w="2459"/>
+          </w:tcPr>
+          <w:p>
+            <w:r>
+              <w:rPr>
+                <w:sz w:val="16"/>
+              </w:rPr>
+              <w:t>Offline Blockly and Python preparation</w:t>
+            </w:r>
+          </w:p>
+        </w:tc>
+      </w:tr>
+      <w:tr>
+        <w:tc>
+          <w:tcPr>
+            <w:tcW w:type="dxa" w:w="2459"/>
+          </w:tcPr>
+          <w:p>
+            <w:r>
+              <w:rPr>
+                <w:sz w:val="16"/>
+              </w:rPr>
+              <w:t>2</w:t>
+            </w:r>
+          </w:p>
+        </w:tc>
+        <w:tc>
+          <w:tcPr>
+            <w:tcW w:type="dxa" w:w="2459"/>
+          </w:tcPr>
+          <w:p>
+            <w:r>
+              <w:rPr>
+                <w:sz w:val="16"/>
+              </w:rPr>
+              <w:t>Conveyor and observation sequencing</w:t>
+            </w:r>
+          </w:p>
+        </w:tc>
+        <w:tc>
+          <w:tcPr>
+            <w:tcW w:type="dxa" w:w="2459"/>
+          </w:tcPr>
+          <w:p>
+            <w:r>
+              <w:rPr>
+                <w:sz w:val="16"/>
+              </w:rPr>
+              <w:t>Offline Blockly and Python preparation</w:t>
+            </w:r>
+          </w:p>
+        </w:tc>
+        <w:tc>
+          <w:tcPr>
+            <w:tcW w:type="dxa" w:w="2459"/>
+          </w:tcPr>
+          <w:p>
+            <w:r>
+              <w:rPr>
+                <w:sz w:val="16"/>
+              </w:rPr>
+              <w:t>Arm and twin observation</w:t>
+            </w:r>
+          </w:p>
+        </w:tc>
+      </w:tr>
+      <w:tr>
+        <w:tc>
+          <w:tcPr>
+            <w:tcW w:type="dxa" w:w="2459"/>
+          </w:tcPr>
+          <w:p>
+            <w:r>
+              <w:rPr>
+                <w:sz w:val="16"/>
+              </w:rPr>
+              <w:t>3</w:t>
+            </w:r>
+          </w:p>
+        </w:tc>
+        <w:tc>
+          <w:tcPr>
+            <w:tcW w:type="dxa" w:w="2459"/>
+          </w:tcPr>
+          <w:p>
+            <w:r>
+              <w:rPr>
+                <w:sz w:val="16"/>
+              </w:rPr>
+              <w:t>Offline Blockly and Python preparation</w:t>
+            </w:r>
+          </w:p>
+        </w:tc>
+        <w:tc>
+          <w:tcPr>
+            <w:tcW w:type="dxa" w:w="2459"/>
+          </w:tcPr>
+          <w:p>
+            <w:r>
+              <w:rPr>
+                <w:sz w:val="16"/>
+              </w:rPr>
+              <w:t>Arm and twin observation</w:t>
+            </w:r>
+          </w:p>
+        </w:tc>
+        <w:tc>
+          <w:tcPr>
+            <w:tcW w:type="dxa" w:w="2459"/>
+          </w:tcPr>
+          <w:p>
+            <w:r>
+              <w:rPr>
+                <w:sz w:val="16"/>
+              </w:rPr>
+              <w:t>Conveyor and observation sequencing</w:t>
+            </w:r>
+          </w:p>
+        </w:tc>
+      </w:tr>
+    </w:tbl>
+    <w:p>
+      <w:pPr>
+        <w:pStyle w:val="Heading2"/>
+      </w:pPr>
+      <w:r>
+        <w:t>Build the physical sequence</w:t>
+      </w:r>
+    </w:p>
+    <w:tbl>
+      <w:tblPr>
+        <w:tblStyle w:val="LightShading-Accent1"/>
+        <w:tblW w:type="auto" w:w="0"/>
+        <w:tblLook w:firstColumn="1" w:firstRow="1" w:lastColumn="0" w:lastRow="0" w:noHBand="0" w:noVBand="1" w:val="04A0"/>
+      </w:tblPr>
+      <w:tblGrid>
+        <w:gridCol w:w="2459"/>
+        <w:gridCol w:w="2459"/>
+        <w:gridCol w:w="2459"/>
+        <w:gridCol w:w="2459"/>
+      </w:tblGrid>
+      <w:tr>
+        <w:trPr>
+          <w:tblHeader/>
+        </w:trPr>
+        <w:tc>
+          <w:tcPr>
+            <w:tcW w:type="dxa" w:w="2459"/>
+          </w:tcPr>
+          <w:p>
+            <w:r>
+              <w:rPr>
+                <w:sz w:val="16"/>
+              </w:rPr>
+              <w:t>Slot</w:t>
+            </w:r>
+          </w:p>
+        </w:tc>
+        <w:tc>
+          <w:tcPr>
+            <w:tcW w:type="dxa" w:w="2459"/>
+          </w:tcPr>
+          <w:p>
+            <w:r>
+              <w:rPr>
+                <w:sz w:val="16"/>
+              </w:rPr>
+              <w:t>Pair A</w:t>
+            </w:r>
+          </w:p>
+        </w:tc>
+        <w:tc>
+          <w:tcPr>
+            <w:tcW w:type="dxa" w:w="2459"/>
+          </w:tcPr>
+          <w:p>
+            <w:r>
+              <w:rPr>
+                <w:sz w:val="16"/>
+              </w:rPr>
+              <w:t>Pair B</w:t>
+            </w:r>
+          </w:p>
+        </w:tc>
+        <w:tc>
+          <w:tcPr>
+            <w:tcW w:type="dxa" w:w="2459"/>
+          </w:tcPr>
+          <w:p>
+            <w:r>
+              <w:rPr>
+                <w:sz w:val="16"/>
+              </w:rPr>
+              <w:t>Pair C</w:t>
+            </w:r>
+          </w:p>
+        </w:tc>
+      </w:tr>
+      <w:tr>
+        <w:tc>
+          <w:tcPr>
+            <w:tcW w:type="dxa" w:w="2459"/>
+          </w:tcPr>
+          <w:p>
+            <w:r>
+              <w:rPr>
+                <w:sz w:val="16"/>
+              </w:rPr>
+              <w:t>1</w:t>
+            </w:r>
+          </w:p>
+        </w:tc>
+        <w:tc>
+          <w:tcPr>
+            <w:tcW w:type="dxa" w:w="2459"/>
+          </w:tcPr>
+          <w:p>
+            <w:r>
+              <w:rPr>
+                <w:sz w:val="16"/>
+              </w:rPr>
+              <w:t>Supervised fixed-fixture integration</w:t>
+            </w:r>
+          </w:p>
+        </w:tc>
+        <w:tc>
+          <w:tcPr>
+            <w:tcW w:type="dxa" w:w="2459"/>
+          </w:tcPr>
+          <w:p>
+            <w:r>
+              <w:rPr>
+                <w:sz w:val="16"/>
+              </w:rPr>
+              <w:t>Offline sequence rehearsal</w:t>
+            </w:r>
+          </w:p>
+        </w:tc>
+        <w:tc>
+          <w:tcPr>
+            <w:tcW w:type="dxa" w:w="2459"/>
+          </w:tcPr>
+          <w:p>
+            <w:r>
+              <w:rPr>
+                <w:sz w:val="16"/>
+              </w:rPr>
+              <w:t>Failure tests and evidence</w:t>
+            </w:r>
+          </w:p>
+        </w:tc>
+      </w:tr>
+      <w:tr>
+        <w:tc>
+          <w:tcPr>
+            <w:tcW w:type="dxa" w:w="2459"/>
+          </w:tcPr>
+          <w:p>
+            <w:r>
+              <w:rPr>
+                <w:sz w:val="16"/>
+              </w:rPr>
+              <w:t>2</w:t>
+            </w:r>
+          </w:p>
+        </w:tc>
+        <w:tc>
+          <w:tcPr>
+            <w:tcW w:type="dxa" w:w="2459"/>
+          </w:tcPr>
+          <w:p>
+            <w:r>
+              <w:rPr>
+                <w:sz w:val="16"/>
+              </w:rPr>
+              <w:t>Offline sequence rehearsal</w:t>
+            </w:r>
+          </w:p>
+        </w:tc>
+        <w:tc>
+          <w:tcPr>
+            <w:tcW w:type="dxa" w:w="2459"/>
+          </w:tcPr>
+          <w:p>
+            <w:r>
+              <w:rPr>
+                <w:sz w:val="16"/>
+              </w:rPr>
+              <w:t>Failure tests and evidence</w:t>
+            </w:r>
+          </w:p>
+        </w:tc>
+        <w:tc>
+          <w:tcPr>
+            <w:tcW w:type="dxa" w:w="2459"/>
+          </w:tcPr>
+          <w:p>
+            <w:r>
+              <w:rPr>
+                <w:sz w:val="16"/>
+              </w:rPr>
+              <w:t>Supervised fixed-fixture integration</w:t>
+            </w:r>
+          </w:p>
+        </w:tc>
+      </w:tr>
+      <w:tr>
+        <w:tc>
+          <w:tcPr>
+            <w:tcW w:type="dxa" w:w="2459"/>
+          </w:tcPr>
+          <w:p>
+            <w:r>
+              <w:rPr>
+                <w:sz w:val="16"/>
+              </w:rPr>
+              <w:t>3</w:t>
+            </w:r>
+          </w:p>
+        </w:tc>
+        <w:tc>
+          <w:tcPr>
+            <w:tcW w:type="dxa" w:w="2459"/>
+          </w:tcPr>
+          <w:p>
+            <w:r>
+              <w:rPr>
+                <w:sz w:val="16"/>
+              </w:rPr>
+              <w:t>Failure tests and evidence</w:t>
+            </w:r>
+          </w:p>
+        </w:tc>
+        <w:tc>
+          <w:tcPr>
+            <w:tcW w:type="dxa" w:w="2459"/>
+          </w:tcPr>
+          <w:p>
+            <w:r>
+              <w:rPr>
+                <w:sz w:val="16"/>
+              </w:rPr>
+              <w:t>Supervised fixed-fixture integration</w:t>
+            </w:r>
+          </w:p>
+        </w:tc>
+        <w:tc>
+          <w:tcPr>
+            <w:tcW w:type="dxa" w:w="2459"/>
+          </w:tcPr>
+          <w:p>
+            <w:r>
+              <w:rPr>
+                <w:sz w:val="16"/>
+              </w:rPr>
+              <w:t>Offline sequence rehearsal</w:t>
             </w:r>
           </w:p>
         </w:tc>
@@ -500,7 +986,7 @@
     </w:tbl>
     <w:p>
       <w:r>
-        <w:t>Exactly 240 minutes. Do not add the live lab as an extra lesson. The camera notebook contains optional extensions: select one controlled observation experiment within the 20-minute perception block; leave further list experiments for challenges. Definitions follow visible examples, not a vocabulary lecture.</w:t>
+        <w:br w:type="page"/>
       </w:r>
     </w:p>
     <w:p>
@@ -508,27 +994,171 @@
         <w:pStyle w:val="Heading1"/>
       </w:pPr>
       <w:r>
-        <w:t>Beginner prompts and solutions</w:t>
+        <w:t>Make a short conveyor story</w:t>
       </w:r>
     </w:p>
     <w:p>
       <w:r>
-        <w:t>A: show Shift+Enter, output, quotes and indentation. A variable stores a value with =; == compares values. Original loop prints 1, 2, 3. Five repeats print 1–5. Red chooses left; blue right; yellow reject. If a quote is missing, read the last error line, repair one quote and rerun. A kernel restart clears values but preserves saved edits; run setup again.</w:t>
+        <w:t xml:space="preserve">Mission </w:t>
+      </w:r>
+      <w:r>
+        <w:rPr>
+          <w:rFonts w:ascii="Noto Sans Mono" w:hAnsi="Noto Sans Mono"/>
+          <w:sz w:val="19"/>
+        </w:rPr>
+        <w:t>blocks</w:t>
+      </w:r>
+      <w:r>
+        <w:t xml:space="preserve"> · 25 minutes · Put instructions in order and repeat a small section.</w:t>
+      </w:r>
+    </w:p>
+    <w:p>
+      <w:r/>
+      <w:r>
+        <w:rPr>
+          <w:b/>
+        </w:rPr>
+        <w:t>Worked example</w:t>
+      </w:r>
+      <w:r>
+        <w:t xml:space="preserve"> Ready → dispense → belt to pickup endpoint → inspect. In simulation each command changes a model; no physical object is verified.</w:t>
+      </w:r>
+    </w:p>
+    <w:p>
+      <w:r/>
+      <w:r>
+        <w:rPr>
+          <w:b/>
+        </w:rPr>
+        <w:t>Predict</w:t>
+      </w:r>
+      <w:r>
+        <w:t xml:space="preserve"> Which message appears first? Where should the object model stop?</w:t>
+      </w:r>
+    </w:p>
+    <w:p>
+      <w:r/>
+      <w:r>
+        <w:rPr>
+          <w:b/>
+        </w:rPr>
+        <w:t>Change</w:t>
+      </w:r>
+      <w:r>
+        <w:t xml:space="preserve"> Change Ready to your pair name. Add repeat 2 around a message, then around one tested short sequence.</w:t>
+      </w:r>
+    </w:p>
+    <w:p>
+      <w:r/>
+      <w:r>
+        <w:rPr>
+          <w:b/>
+        </w:rPr>
+        <w:t>Run</w:t>
+      </w:r>
+      <w:r>
+        <w:t xml:space="preserve"> Open local Blockly simulation; select this mission; run the starter once. Use STOP and Reset before a different test. Save your workspace.</w:t>
+      </w:r>
+    </w:p>
+    <w:p>
+      <w:r/>
+      <w:r>
+        <w:rPr>
+          <w:b/>
+        </w:rPr>
+        <w:t>Observe</w:t>
+      </w:r>
+      <w:r>
+        <w:t xml:space="preserve"> Read the command log and model state. Compare the repeated messages with your prediction.</w:t>
+      </w:r>
+    </w:p>
+    <w:p>
+      <w:r/>
+      <w:r>
+        <w:rPr>
+          <w:b/>
+        </w:rPr>
+        <w:t>Explain</w:t>
+      </w:r>
+      <w:r>
+        <w:t xml:space="preserve"> Why do instruction order and a stopped belt matter before pickup?</w:t>
+      </w:r>
+    </w:p>
+    <w:p>
+      <w:r/>
+      <w:r>
+        <w:rPr>
+          <w:b/>
+        </w:rPr>
+        <w:t>Success check</w:t>
+      </w:r>
+      <w:r>
+        <w:t xml:space="preserve"> Your pair can trace the order, predict a repeat count and explain one corrected sequence.</w:t>
+      </w:r>
+    </w:p>
+    <w:p>
+      <w:r/>
+      <w:r>
+        <w:rPr>
+          <w:b/>
+        </w:rPr>
+        <w:t>Optional challenge</w:t>
+      </w:r>
+      <w:r>
+        <w:t xml:space="preserve"> Try an intentionally wrong order in simulation and explain the result.</w:t>
+      </w:r>
+    </w:p>
+    <w:p>
+      <w:r/>
+      <w:r>
+        <w:rPr>
+          <w:b/>
+        </w:rPr>
+        <w:t>Offline route</w:t>
+      </w:r>
+      <w:r>
+        <w:t xml:space="preserve"> Draw each instruction on paper and move a paper object only when its instruction runs.</w:t>
+      </w:r>
+    </w:p>
+    <w:p>
+      <w:r/>
+      <w:r>
+        <w:rPr>
+          <w:b/>
+        </w:rPr>
+        <w:t>Hint 1</w:t>
+      </w:r>
+      <w:r>
+        <w:t xml:space="preserve"> Read from the top connection down.</w:t>
+      </w:r>
+    </w:p>
+    <w:p>
+      <w:r/>
+      <w:r>
+        <w:rPr>
+          <w:b/>
+        </w:rPr>
+        <w:t>Hint 2</w:t>
+      </w:r>
+      <w:r>
+        <w:t xml:space="preserve"> Repeat repeats every block inside it; start with a message.</w:t>
+      </w:r>
+    </w:p>
+    <w:p>
+      <w:r/>
+      <w:r>
+        <w:rPr>
+          <w:b/>
+        </w:rPr>
+        <w:t>Instructor guidance</w:t>
+      </w:r>
+      <w:r>
+        <w:t xml:space="preserve"> Expected order is message, eject, endpoint, inspect. Repeat does not imply two verified physical placements.</w:t>
       </w:r>
     </w:p>
     <w:p>
       <w:r>
-        <w:t>B: prepared red, blue and background classes reduce setup time. Keep a few examples out of training. Ask what changes when background or illumination changes. The notebook photograph crops are real photographs with human descriptions; its report lists are controlled teaching data, not output of an implemented camera classifier. Actual red reported blue goes right; None rejects. A plausible incorrect report cannot be detected by the routing rule alone. Offline use the photograph and actual/report comparison; avoid presenting demo counts as recognition accuracy.</w:t>
-      </w:r>
-    </w:p>
-    <w:p>
-      <w:r>
-        <w:t>D: baseline is left 2, right 2, reject 1, with five belt advances and actions left/right/left/reject/right. Swapping rules has identical totals for this balanced input but different actions. Use three reds and one blue to reveal the difference in counts. Stop precedes observation and placement. Adding green without a rule rejects it; with a green-to-left rule it reaches left. None, unknown and invalid destinations reject. Counting every object does not prove every route is correct.</w:t>
-      </w:r>
-    </w:p>
-    <w:p>
-      <w:r>
-        <w:t>E: pairs choose the offline Blockly factory challenge or notebook challenges for the same 35-minute slot. For Blockly, start in simulation: predict and run, change the sequence, add color branches, test unknown, then save and explain the result. Use the instructor Blockly guide for setup and recovery. For notebooks, select two experiments, reset the original inputs between them and record predictions before running. Adding None, unknown, 42 and empty text to the baseline yields left 2, right 2, reject 5. Red-to-middle produces left 0, right 2, reject 3. Ten reports must produce ten outcomes. Ask early finishers for a test that detects swapped rules.</w:t>
+        <w:br w:type="page"/>
       </w:r>
     </w:p>
     <w:p>
@@ -536,32 +1166,171 @@
         <w:pStyle w:val="Heading1"/>
       </w:pPr>
       <w:r>
-        <w:t>Three stations</w:t>
+        <w:t>Separate the object from its report</w:t>
       </w:r>
     </w:p>
     <w:p>
       <w:r>
-        <w:t>Use three groups: robot → camera → virtual; camera → virtual → robot; virtual → robot → camera. Each slot uses explain 2 min, try 9, explain evidence 3, save and rotate 1.</w:t>
+        <w:t xml:space="preserve">Mission </w:t>
+      </w:r>
+      <w:r>
+        <w:rPr>
+          <w:rFonts w:ascii="Noto Sans Mono" w:hAnsi="Noto Sans Mono"/>
+          <w:sz w:val="19"/>
+        </w:rPr>
+        <w:t>observe</w:t>
+      </w:r>
+      <w:r>
+        <w:t xml:space="preserve"> · 20 minutes · Recognise missing and incorrect observations.</w:t>
+      </w:r>
+    </w:p>
+    <w:p>
+      <w:r/>
+      <w:r>
+        <w:rPr>
+          <w:b/>
+        </w:rPr>
+        <w:t>Worked example</w:t>
+      </w:r>
+      <w:r>
+        <w:t xml:space="preserve"> An actual blue brick can have a missing report. An actual red brick can be reported blue. Both need inspection.</w:t>
+      </w:r>
+    </w:p>
+    <w:p>
+      <w:r/>
+      <w:r>
+        <w:rPr>
+          <w:b/>
+        </w:rPr>
+        <w:t>Predict</w:t>
+      </w:r>
+      <w:r>
+        <w:t xml:space="preserve"> Which of the three reports is missing? Which disagrees with the labelled object?</w:t>
+      </w:r>
+    </w:p>
+    <w:p>
+      <w:r/>
+      <w:r>
+        <w:rPr>
+          <w:b/>
+        </w:rPr>
+        <w:t>Change</w:t>
+      </w:r>
+      <w:r>
+        <w:t xml:space="preserve"> Change one report to None; then change one known report to a wrong known color.</w:t>
+      </w:r>
+    </w:p>
+    <w:p>
+      <w:r/>
+      <w:r>
+        <w:rPr>
+          <w:b/>
+        </w:rPr>
+        <w:t>Run</w:t>
+      </w:r>
+      <w:r>
+        <w:t xml:space="preserve"> Run the short Python example or trace its three rows on paper. Compare the real labelled photo with a deliberately changed report.</w:t>
+      </w:r>
+    </w:p>
+    <w:p>
+      <w:r/>
+      <w:r>
+        <w:rPr>
+          <w:b/>
+        </w:rPr>
+        <w:t>Observe</w:t>
+      </w:r>
+      <w:r>
+        <w:t xml:space="preserve"> Record actual object, reported label and your decision separately. None means missing, never zero or proof of empty space.</w:t>
+      </w:r>
+    </w:p>
+    <w:p>
+      <w:r/>
+      <w:r>
+        <w:rPr>
+          <w:b/>
+        </w:rPr>
+        <w:t>Explain</w:t>
+      </w:r>
+      <w:r>
+        <w:t xml:space="preserve"> Why can a fresh color label still be wrong? What evidence would justify continuing?</w:t>
+      </w:r>
+    </w:p>
+    <w:p>
+      <w:r/>
+      <w:r>
+        <w:rPr>
+          <w:b/>
+        </w:rPr>
+        <w:t>Success check</w:t>
+      </w:r>
+      <w:r>
+        <w:t xml:space="preserve"> You identify one missing and one wrong report and choose pause/inspect for uncertainty.</w:t>
+      </w:r>
+    </w:p>
+    <w:p>
+      <w:r/>
+      <w:r>
+        <w:rPr>
+          <w:b/>
+        </w:rPr>
+        <w:t>Optional challenge</w:t>
+      </w:r>
+      <w:r>
+        <w:t xml:space="preserve"> Test unfamiliar green without adding a rule.</w:t>
+      </w:r>
+    </w:p>
+    <w:p>
+      <w:r/>
+      <w:r>
+        <w:rPr>
+          <w:b/>
+        </w:rPr>
+        <w:t>Offline route</w:t>
+      </w:r>
+      <w:r>
+        <w:t xml:space="preserve"> Use the supplied real photo and handwritten report cards; no camera or website is needed.</w:t>
+      </w:r>
+    </w:p>
+    <w:p>
+      <w:r/>
+      <w:r>
+        <w:rPr>
+          <w:b/>
+        </w:rPr>
+        <w:t>Hint 1</w:t>
+      </w:r>
+      <w:r>
+        <w:t xml:space="preserve"> Compare actual and reported columns one row at a time.</w:t>
+      </w:r>
+    </w:p>
+    <w:p>
+      <w:r/>
+      <w:r>
+        <w:rPr>
+          <w:b/>
+        </w:rPr>
+        <w:t>Hint 2</w:t>
+      </w:r>
+      <w:r>
+        <w:t xml:space="preserve"> A known word is still only a report.</w:t>
+      </w:r>
+    </w:p>
+    <w:p>
+      <w:r/>
+      <w:r>
+        <w:rPr>
+          <w:b/>
+        </w:rPr>
+        <w:t>Instructor guidance</w:t>
+      </w:r>
+      <w:r>
+        <w:t xml:space="preserve"> Missing is row two; wrong known label row three. Correct words alone do not validate a classifier.</w:t>
       </w:r>
     </w:p>
     <w:p>
       <w:r>
-        <w:t>Robot and twin: open Robot_Candy_Factory_Live_SO101.ipynb. It defaults to invented DEMO data. Students choose one body joint, read a graph and calculate one relative versus absolute prediction. Relative mapping is follower start + leader now − leader start; 30 + 15 − 10 = 35 degrees. Absolute prediction is 15 degrees. Angle differences can be expected in relative mode. The gripper JointState is a visual proxy and is excluded. A twin follows measurements; it is not an independent confirmation of reality.</w:t>
-      </w:r>
-    </w:p>
-    <w:p>
-      <w:r>
-        <w:t>A supervised physical Blockly extension replaces time within the robot rotation or challenge slot; it adds no lesson time. After simulation, teach a short fixed-jaw stroke with the leader, record the follower, return to the checked starting pose and replay once at speed 0.5. Add one approved EV3 action only when commissioned; require unknown to stop before manipulation. Dispensing and jaw control need their own commissioning. For payload sorting, the separate Run one commissioned sorting cycle block lets the native station own the complete grasp and object ownership transaction; a taught replay plus jaw movement does not establish a grasp. Review setup and recovery in docs/blockly-workshop.md.</w:t>
-      </w:r>
-    </w:p>
-    <w:p>
-      <w:r>
-        <w:t>Camera and conveyor: trace move → stop → observe → decide → pick using paper objects or a qualified instructor demonstration. Ask why stopping before picking matters. Change one visual condition and explain uncertainty. No student connects motor hardware or changes station controls.</w:t>
-      </w:r>
-    </w:p>
-    <w:p>
-      <w:r>
-        <w:t>Virtual robot: run the notebook's short destination sequence; compare order and totals. Original left/right/left has the same totals as left/left/right. Add reject, then middle; invalid destinations reject. Optional kinematics activity is linked in workshop-resources.md; use the sequence fallback if unavailable. A destination label is not a physical motor coordinate.</w:t>
+        <w:br w:type="page"/>
       </w:r>
     </w:p>
     <w:p>
@@ -569,63 +1338,171 @@
         <w:pStyle w:val="Heading1"/>
       </w:pPr>
       <w:r>
-        <w:t>Live observer preparation</w:t>
+        <w:t>Change a name and a number</w:t>
       </w:r>
     </w:p>
     <w:p>
       <w:r>
-        <w:t>Use the full checkout on the same station host as ROS. Keep the existing commissioned resident controller; the observer starts no controller, opens no USB, calls no ROS services and reads only /leader/joint_states, /follower/joint_states and /follower/teleop_status. Real enable, mode selection and stop belong in the instructor's RViz operations panel. Review current physical acceptance evidence before demonstrating motion.</w:t>
+        <w:t xml:space="preserve">Mission </w:t>
+      </w:r>
+      <w:r>
+        <w:rPr>
+          <w:rFonts w:ascii="Noto Sans Mono" w:hAnsi="Noto Sans Mono"/>
+          <w:sz w:val="19"/>
+        </w:rPr>
+        <w:t>python</w:t>
+      </w:r>
+      <w:r>
+        <w:t xml:space="preserve"> · 30 minutes · Read and edit a short Python program before sharing the same program representation with blocks.</w:t>
+      </w:r>
+    </w:p>
+    <w:p>
+      <w:r/>
+      <w:r>
+        <w:rPr>
+          <w:b/>
+        </w:rPr>
+        <w:t>Worked example</w:t>
+      </w:r>
+      <w:r>
+        <w:t xml:space="preserve"> TEAM stores text in quotes. REPEATS stores a number. print shows text. The indented line runs once for each number.</w:t>
+      </w:r>
+    </w:p>
+    <w:p>
+      <w:r/>
+      <w:r>
+        <w:rPr>
+          <w:b/>
+        </w:rPr>
+        <w:t>Predict</w:t>
+      </w:r>
+      <w:r>
+        <w:t xml:space="preserve"> What greeting and how many object lines will appear?</w:t>
+      </w:r>
+    </w:p>
+    <w:p>
+      <w:r/>
+      <w:r>
+        <w:rPr>
+          <w:b/>
+        </w:rPr>
+        <w:t>Change</w:t>
+      </w:r>
+      <w:r>
+        <w:t xml:space="preserve"> Change TEAM, predict, run. Then change REPEATS to 2, predict, run. Keep indentation.</w:t>
+      </w:r>
+    </w:p>
+    <w:p>
+      <w:r/>
+      <w:r>
+        <w:rPr>
+          <w:b/>
+        </w:rPr>
+        <w:t>Run</w:t>
+      </w:r>
+      <w:r>
+        <w:t xml:space="preserve"> Open the Student notebook, save a pair copy and run cells from the top with Shift+Enter. Run the shared Program example in simulation.</w:t>
+      </w:r>
+    </w:p>
+    <w:p>
+      <w:r/>
+      <w:r>
+        <w:rPr>
+          <w:b/>
+        </w:rPr>
+        <w:t>Observe</w:t>
+      </w:r>
+      <w:r>
+        <w:t xml:space="preserve"> Count output lines and compare the shared Python program JSON with the Blockly exported JSON.</w:t>
+      </w:r>
+    </w:p>
+    <w:p>
+      <w:r/>
+      <w:r>
+        <w:rPr>
+          <w:b/>
+        </w:rPr>
+        <w:t>Explain</w:t>
+      </w:r>
+      <w:r>
+        <w:t xml:space="preserve"> Which edit changed text? Which changed how often a line ran? What stayed in the same order?</w:t>
+      </w:r>
+    </w:p>
+    <w:p>
+      <w:r/>
+      <w:r>
+        <w:rPr>
+          <w:b/>
+        </w:rPr>
+        <w:t>Success check</w:t>
+      </w:r>
+      <w:r>
+        <w:t xml:space="preserve"> Both partners make one edit and explain it; shared commands are validated before execution.</w:t>
+      </w:r>
+    </w:p>
+    <w:p>
+      <w:r/>
+      <w:r>
+        <w:rPr>
+          <w:b/>
+        </w:rPr>
+        <w:t>Optional challenge</w:t>
+      </w:r>
+      <w:r>
+        <w:t xml:space="preserve"> Change a wait or message in both Python and Blockly and compare command traces.</w:t>
+      </w:r>
+    </w:p>
+    <w:p>
+      <w:r/>
+      <w:r>
+        <w:rPr>
+          <w:b/>
+        </w:rPr>
+        <w:t>Offline route</w:t>
+      </w:r>
+      <w:r>
+        <w:t xml:space="preserve"> Run exercises/01_python.py using the prepared Python or trace it on paper. No package downloads.</w:t>
+      </w:r>
+    </w:p>
+    <w:p>
+      <w:r/>
+      <w:r>
+        <w:rPr>
+          <w:b/>
+        </w:rPr>
+        <w:t>Hint 1</w:t>
+      </w:r>
+      <w:r>
+        <w:t xml:space="preserve"> Quotes surround text; do not quote the number.</w:t>
+      </w:r>
+    </w:p>
+    <w:p>
+      <w:r/>
+      <w:r>
+        <w:rPr>
+          <w:b/>
+        </w:rPr>
+        <w:t>Hint 2</w:t>
+      </w:r>
+      <w:r>
+        <w:t xml:space="preserve"> Four spaces keep print inside the loop.</w:t>
+      </w:r>
+    </w:p>
+    <w:p>
+      <w:r/>
+      <w:r>
+        <w:rPr>
+          <w:b/>
+        </w:rPr>
+        <w:t>Instructor guidance</w:t>
+      </w:r>
+      <w:r>
+        <w:t xml:space="preserve"> Original prints three object lines. Changing REPEATS resets the next run; Program simulation is not hardware proof.</w:t>
       </w:r>
     </w:p>
     <w:p>
       <w:r>
-        <w:rPr>
-          <w:rFonts w:ascii="DejaVu Sans Mono" w:hAnsi="DejaVu Sans Mono"/>
-          <w:sz w:val="17"/>
-        </w:rPr>
-        <w:t># Offline invented examples, no ROS needed</w:t>
-      </w:r>
-    </w:p>
-    <w:p>
-      <w:r>
-        <w:rPr>
-          <w:rFonts w:ascii="DejaVu Sans Mono" w:hAnsi="DejaVu Sans Mono"/>
-          <w:sz w:val="17"/>
-        </w:rPr>
-        <w:t>.venv-workshop/bin/python tools/launch_live_workshop.py</w:t>
-      </w:r>
-    </w:p>
-    <w:p>
-      <w:r>
-        <w:rPr>
-          <w:rFonts w:ascii="DejaVu Sans Mono" w:hAnsi="DejaVu Sans Mono"/>
-          <w:sz w:val="17"/>
-        </w:rPr>
-        <w:t># Instructor only, existing station topics through existing ROS wrapper</w:t>
-      </w:r>
-    </w:p>
-    <w:p>
-      <w:r>
-        <w:rPr>
-          <w:rFonts w:ascii="DejaVu Sans Mono" w:hAnsi="DejaVu Sans Mono"/>
-          <w:sz w:val="17"/>
-        </w:rPr>
-        <w:t>ROS_DOMAIN_ID=76 .venv-workshop/bin/python tools/launch_live_workshop.py --live</w:t>
-      </w:r>
-    </w:p>
-    <w:p>
-      <w:r>
-        <w:t>The helper defaults to this checkout's existing ros2/conda/so101-conda.sh run wrapper. It uses the prepared Conda ROS environment, while Jupyter stays isolated. For the remote station pass --ros-wrapper ~/.local/bin/station-fwmini4 --ros-wrapper-command ros-vulkan to the live launcher. This preserves the station's accepted environment. No container image is needed. The live Jupyter server uses loopback port 8890, separate from the student server on 8888; a second launch reports that the port is in use. Jupyter remains a normal Python kernel. Each capture starts a bounded subscriber through the existing prepared ROS wrapper; it collects for 3 seconds (maximum 5), samples at most 5 times/second and exits, destroying the node. The outer process timeout includes up to 20 seconds for ROS wrapper startup. This avoids installing incompatible ROS libraries into Jupyter. Localhost binding and normal Jupyter token authentication are preserved. For a remote browser use the prepared SSH forwarding arrangement; do not expose an unauthenticated notebook server.</w:t>
-      </w:r>
-    </w:p>
-    <w:p>
-      <w:r>
-        <w:t>Freshness requires receipt age and source age at most one second. Joint source age is ROS header age; the follower header is publication time, not an independent motor acquisition timestamp. The controller retains its own acquisition freshness gates. Teleop status uses same-host monotonic time; latched disabled status may be old. The notebook hides expired values, reports missing streams and never silently substitutes demo data. A fresh topic does not establish motion permission, independent geometry accuracy or physical sorting success.</w:t>
-      </w:r>
-    </w:p>
-    <w:p>
-      <w:r>
-        <w:t>If a LIVE stream disappears, rerun the observation after the instructor restores the existing station. Every call starts a new node; reconnection needs no notebook service. On failure use the explicit DEMO launcher and restart the kernel. Never infer zero from missing data. The observer is additional visualization, not an emergency stop or safety monitor.</w:t>
+        <w:br w:type="page"/>
       </w:r>
     </w:p>
     <w:p>
@@ -633,12 +1510,171 @@
         <w:pStyle w:val="Heading1"/>
       </w:pPr>
       <w:r>
-        <w:t>Offline and environment fallback</w:t>
+        <w:t>Watch teach inspect return replay</w:t>
       </w:r>
     </w:p>
     <w:p>
       <w:r>
-        <w:t>Run python3 exercises/check_setup.py, then exercises/01_python.py, 03_vision.py, 02_robot.py and 04_sort.py in lesson order. Edit the marked STUDENT AREA, save and rerun. Python standard library is sufficient. Run exercises/05_visual_sort.py and open sorting-result.html for an offline browser animation. If computers fail, use paper objects, report cards and three bins with the same predictions and worksheet.</w:t>
+        <w:t xml:space="preserve">Mission </w:t>
+      </w:r>
+      <w:r>
+        <w:rPr>
+          <w:rFonts w:ascii="Noto Sans Mono" w:hAnsi="Noto Sans Mono"/>
+          <w:sz w:val="19"/>
+        </w:rPr>
+        <w:t>teach-demo</w:t>
+      </w:r>
+      <w:r>
+        <w:t xml:space="preserve"> · 15 minutes · Understand that a recorded stroke needs validated start/end poses and explicit jaw state.</w:t>
+      </w:r>
+    </w:p>
+    <w:p>
+      <w:r/>
+      <w:r>
+        <w:rPr>
+          <w:b/>
+        </w:rPr>
+        <w:t>Worked example</w:t>
+      </w:r>
+      <w:r>
+        <w:t xml:space="preserve"> Leader 10°, follower 30°, leader now 15° gives relative request 35°. A request and a measured result are different.</w:t>
+      </w:r>
+    </w:p>
+    <w:p>
+      <w:r/>
+      <w:r>
+        <w:rPr>
+          <w:b/>
+        </w:rPr>
+        <w:t>Predict</w:t>
+      </w:r>
+      <w:r>
+        <w:t xml:space="preserve"> Will a replay start safely from any pose? What if the jaw state changed?</w:t>
+      </w:r>
+    </w:p>
+    <w:p>
+      <w:r/>
+      <w:r>
+        <w:rPr>
+          <w:b/>
+        </w:rPr>
+        <w:t>Change</w:t>
+      </w:r>
+      <w:r>
+        <w:t xml:space="preserve"> Ask the instructor to change one invented angle; predict before rerunning. Learners do not change physical modes.</w:t>
+      </w:r>
+    </w:p>
+    <w:p>
+      <w:r/>
+      <w:r>
+        <w:rPr>
+          <w:b/>
+        </w:rPr>
+        <w:t>Run</w:t>
+      </w:r>
+      <w:r>
+        <w:t xml:space="preserve"> Watch instructor: teach a short empty stroke, stop recording, inspect metadata and path, return safely to its validated start, then replay separately.</w:t>
+      </w:r>
+    </w:p>
+    <w:p>
+      <w:r/>
+      <w:r>
+        <w:rPr>
+          <w:b/>
+        </w:rPr>
+        <w:t>Observe</w:t>
+      </w:r>
+      <w:r>
+        <w:t xml:space="preserve"> Name start pose, endpoint, jaw state, identity/calibration and validity evidence. An invented demo recording is never a student-taught physical skill.</w:t>
+      </w:r>
+    </w:p>
+    <w:p>
+      <w:r/>
+      <w:r>
+        <w:rPr>
+          <w:b/>
+        </w:rPr>
+        <w:t>Explain</w:t>
+      </w:r>
+      <w:r>
+        <w:t xml:space="preserve"> Why must teaching and playback be separate runs? Why does a changed robot or calibration require reteaching?</w:t>
+      </w:r>
+    </w:p>
+    <w:p>
+      <w:r/>
+      <w:r>
+        <w:rPr>
+          <w:b/>
+        </w:rPr>
+        <w:t>Success check</w:t>
+      </w:r>
+      <w:r>
+        <w:t xml:space="preserve"> You can say teach → inspect/validate → return to start → replay, and point to STOP.</w:t>
+      </w:r>
+    </w:p>
+    <w:p>
+      <w:r/>
+      <w:r>
+        <w:rPr>
+          <w:b/>
+        </w:rPr>
+        <w:t>Optional challenge</w:t>
+      </w:r>
+      <w:r>
+        <w:t xml:space="preserve"> Predict a relative versus absolute joint request.</w:t>
+      </w:r>
+    </w:p>
+    <w:p>
+      <w:r/>
+      <w:r>
+        <w:rPr>
+          <w:b/>
+        </w:rPr>
+        <w:t>Offline route</w:t>
+      </w:r>
+      <w:r>
+        <w:t xml:space="preserve"> Use the invented joint example and paper start/end diagrams. Label evidence DEMO.</w:t>
+      </w:r>
+    </w:p>
+    <w:p>
+      <w:r/>
+      <w:r>
+        <w:rPr>
+          <w:b/>
+        </w:rPr>
+        <w:t>Hint 1</w:t>
+      </w:r>
+      <w:r>
+        <w:t xml:space="preserve"> A recording stores movement; it does not plan a safe approach from every pose.</w:t>
+      </w:r>
+    </w:p>
+    <w:p>
+      <w:r/>
+      <w:r>
+        <w:rPr>
+          <w:b/>
+        </w:rPr>
+        <w:t>Hint 2</w:t>
+      </w:r>
+      <w:r>
+        <w:t xml:space="preserve"> A screen model can match commands while a physical object slips.</w:t>
+      </w:r>
+    </w:p>
+    <w:p>
+      <w:r/>
+      <w:r>
+        <w:rPr>
+          <w:b/>
+        </w:rPr>
+        <w:t>Instructor guidance</w:t>
+      </w:r>
+      <w:r>
+        <w:t xml:space="preserve"> Relative is 35 and absolute 15. Demonstrate only with prepared supervised hardware; if validation fails use paper and report physical gate incomplete.</w:t>
+      </w:r>
+    </w:p>
+    <w:p>
+      <w:r>
+        <w:br w:type="page"/>
       </w:r>
     </w:p>
     <w:p>
@@ -646,15 +1682,686 @@
         <w:pStyle w:val="Heading1"/>
       </w:pPr>
       <w:r>
-        <w:t>Build and verification</w:t>
+        <w:t>Explore three stations</w:t>
       </w:r>
     </w:p>
     <w:p>
       <w:r>
-        <w:t>Build notebooks and shared handbook text with python tools/build_notebooks.py. Build printable handouts using SOFFICE=/path/to/prepared/soffice python tools/build_materials.py --handouts-only. Build the learner ZIP with python exercises/make_student_bundle.py --output docs/student-workshop.zip. Execute tools/verify_notebooks.py in the prepared environment; it opens fresh kernels and checks meaningful variants. These software checks do not establish physical commissioning or complete sorting acceptance.</w:t>
+        <w:t xml:space="preserve">Mission </w:t>
+      </w:r>
+      <w:r>
+        <w:rPr>
+          <w:rFonts w:ascii="Noto Sans Mono" w:hAnsi="Noto Sans Mono"/>
+          <w:sz w:val="19"/>
+        </w:rPr>
+        <w:t>explore</w:t>
+      </w:r>
+      <w:r>
+        <w:t xml:space="preserve"> · 45 minutes · Connect observations, instructions and the robot model.</w:t>
+      </w:r>
+    </w:p>
+    <w:p>
+      <w:r/>
+      <w:r>
+        <w:rPr>
+          <w:b/>
+        </w:rPr>
+        <w:t>Worked example</w:t>
+      </w:r>
+      <w:r>
+        <w:t xml:space="preserve"> Three pairs rotate through arm/twin observation, conveyor/observation sequencing, and offline Blockly/Python preparation.</w:t>
+      </w:r>
+    </w:p>
+    <w:p>
+      <w:r/>
+      <w:r>
+        <w:rPr>
+          <w:b/>
+        </w:rPr>
+        <w:t>Predict</w:t>
+      </w:r>
+      <w:r>
+        <w:t xml:space="preserve"> At your current station, predict one direction, report or sequence before the instructor or simulator acts.</w:t>
+      </w:r>
+    </w:p>
+    <w:p>
+      <w:r/>
+      <w:r>
+        <w:rPr>
+          <w:b/>
+        </w:rPr>
+        <w:t>Change</w:t>
+      </w:r>
+      <w:r>
+        <w:t xml:space="preserve"> Change only one paper angle, report or message; switch driver and observer halfway.</w:t>
+      </w:r>
+    </w:p>
+    <w:p>
+      <w:r/>
+      <w:r>
+        <w:rPr>
+          <w:b/>
+        </w:rPr>
+        <w:t>Run</w:t>
+      </w:r>
+      <w:r>
+        <w:t xml:space="preserve"> Each slot is 15 minutes: 2 predict, 7 change/run, 4 observe/explain, 2 save and transition. Use the rotation table.</w:t>
+      </w:r>
+    </w:p>
+    <w:p>
+      <w:r/>
+      <w:r>
+        <w:rPr>
+          <w:b/>
+        </w:rPr>
+        <w:t>Observe</w:t>
+      </w:r>
+      <w:r>
+        <w:t xml:space="preserve"> Arm: compare measured joint and twin when available. Conveyor: inspect stopped fixture/report. Offline: compare ordered traces. Label each evidence source.</w:t>
+      </w:r>
+    </w:p>
+    <w:p>
+      <w:r/>
+      <w:r>
+        <w:rPr>
+          <w:b/>
+        </w:rPr>
+        <w:t>Explain</w:t>
+      </w:r>
+      <w:r>
+        <w:t xml:space="preserve"> Which part measures, decides or acts? What can your evidence establish?</w:t>
+      </w:r>
+    </w:p>
+    <w:p>
+      <w:r/>
+      <w:r>
+        <w:rPr>
+          <w:b/>
+        </w:rPr>
+        <w:t>Success check</w:t>
+      </w:r>
+      <w:r>
+        <w:t xml:space="preserve"> Every pair completes all three positions with one recorded prediction and evidence statement per position.</w:t>
+      </w:r>
+    </w:p>
+    <w:p>
+      <w:r/>
+      <w:r>
+        <w:rPr>
+          <w:b/>
+        </w:rPr>
+        <w:t>Optional challenge</w:t>
+      </w:r>
+      <w:r>
+        <w:t xml:space="preserve"> Compare a fresh report with a stale one without guessing missing values.</w:t>
+      </w:r>
+    </w:p>
+    <w:p>
+      <w:r/>
+      <w:r>
+        <w:rPr>
+          <w:b/>
+        </w:rPr>
+        <w:t>Offline route</w:t>
+      </w:r>
+      <w:r>
+        <w:t xml:space="preserve"> All three positions have photo, paper and simulation versions; record DEMO/OFFLINE if no measured stream.</w:t>
+      </w:r>
+    </w:p>
+    <w:p>
+      <w:r/>
+      <w:r>
+        <w:rPr>
+          <w:b/>
+        </w:rPr>
+        <w:t>Hint 1</w:t>
+      </w:r>
+      <w:r>
+        <w:t xml:space="preserve"> The twin is a model updated from a stream.</w:t>
+      </w:r>
+    </w:p>
+    <w:p>
+      <w:r/>
+      <w:r>
+        <w:rPr>
+          <w:b/>
+        </w:rPr>
+        <w:t>Hint 2</w:t>
+      </w:r>
+      <w:r>
+        <w:t xml:space="preserve"> Use the same short sequence at the offline table.</w:t>
+      </w:r>
+    </w:p>
+    <w:p>
+      <w:r/>
+      <w:r>
+        <w:rPr>
+          <w:b/>
+        </w:rPr>
+        <w:t>Instructor guidance</w:t>
+      </w:r>
+      <w:r>
+        <w:t xml:space="preserve"> No three physical robots implied. Instructor controls the arm path; preserve transition time.</w:t>
+      </w:r>
+    </w:p>
+    <w:p>
+      <w:r>
+        <w:br w:type="page"/>
+      </w:r>
+    </w:p>
+    <w:p>
+      <w:pPr>
+        <w:pStyle w:val="Heading1"/>
+      </w:pPr>
+      <w:r>
+        <w:t>Dispense carry pick and place</w:t>
+      </w:r>
+    </w:p>
+    <w:p>
+      <w:r>
+        <w:t xml:space="preserve">Mission </w:t>
+      </w:r>
+      <w:r>
+        <w:rPr>
+          <w:rFonts w:ascii="Noto Sans Mono" w:hAnsi="Noto Sans Mono"/>
+          <w:sz w:val="19"/>
+        </w:rPr>
+        <w:t>integrate</w:t>
+      </w:r>
+      <w:r>
+        <w:t xml:space="preserve"> · 45 minutes · Assemble the supervised fixed pickup to fixed destination sequence.</w:t>
+      </w:r>
+    </w:p>
+    <w:p>
+      <w:r/>
+      <w:r>
+        <w:rPr>
+          <w:b/>
+        </w:rPr>
+        <w:t>Worked example</w:t>
+      </w:r>
+      <w:r>
+        <w:t xml:space="preserve"> EV3 dispense → conveyor to pickup fixture and stop → named taught skill fixed_pick_place. That skill binds validated approach/open, calibrated grasp, lift/transfer, release and return phases. Missing or uncommissioned qualification blocks physical execution; simulation labels every transfer synthetic.</w:t>
+      </w:r>
+    </w:p>
+    <w:p>
+      <w:r/>
+      <w:r>
+        <w:rPr>
+          <w:b/>
+        </w:rPr>
+        <w:t>Predict</w:t>
+      </w:r>
+      <w:r>
+        <w:t xml:space="preserve"> Where must the object and arm be before each next step? What should stop the run?</w:t>
+      </w:r>
+    </w:p>
+    <w:p>
+      <w:r/>
+      <w:r>
+        <w:rPr>
+          <w:b/>
+        </w:rPr>
+        <w:t>Change</w:t>
+      </w:r>
+      <w:r>
+        <w:t xml:space="preserve"> First reorder paper cards. In simulation use pick_place_recording named fixed_pick_place and change one message or delay. Physical execution requires instructor-validated phase recordings, measured jaw calibration and the qualification manifest; missing evidence is a blocking result.</w:t>
+      </w:r>
+    </w:p>
+    <w:p>
+      <w:r/>
+      <w:r>
+        <w:rPr>
+          <w:b/>
+        </w:rPr>
+        <w:t>Run</w:t>
+      </w:r>
+      <w:r>
+        <w:t xml:space="preserve"> Rotate: supervised integration, offline trace/rehearsal, failure/evidence desk. Each 15-minute slot includes 2 minutes transition. Run dispense, conveyor/stop and the named fixed_pick_place skill only through the existing shared endpoint. Instructor alone enables a qualified physical run; otherwise complete explicit synthetic simulation.</w:t>
+      </w:r>
+    </w:p>
+    <w:p>
+      <w:r/>
+      <w:r>
+        <w:rPr>
+          <w:b/>
+        </w:rPr>
+        <w:t>Observe</w:t>
+      </w:r>
+      <w:r>
+        <w:t xml:space="preserve"> Record dispense, stopped fixture arrival, grasp, lift, placement/release and return separately. A completed command does not prove object transfer.</w:t>
+      </w:r>
+    </w:p>
+    <w:p>
+      <w:r/>
+      <w:r>
+        <w:rPr>
+          <w:b/>
+        </w:rPr>
+        <w:t>Explain</w:t>
+      </w:r>
+      <w:r>
+        <w:t xml:space="preserve"> Which observation supports each claimed step? Which step remains unverified?</w:t>
+      </w:r>
+    </w:p>
+    <w:p>
+      <w:r/>
+      <w:r>
+        <w:rPr>
+          <w:b/>
+        </w:rPr>
+        <w:t>Success check</w:t>
+      </w:r>
+      <w:r>
+        <w:t xml:space="preserve"> Your pair explains the full fixed-fixture sequence and records honest per-step evidence. Physical completion requires observed object transfer; offline completion is labelled rehearsal.</w:t>
+      </w:r>
+    </w:p>
+    <w:p>
+      <w:r/>
+      <w:r>
+        <w:rPr>
+          <w:b/>
+        </w:rPr>
+        <w:t>Optional challenge</w:t>
+      </w:r>
+      <w:r>
+        <w:t xml:space="preserve"> After the core succeeds, discuss color-dependent destinations as separately validated taught skills.</w:t>
+      </w:r>
+    </w:p>
+    <w:p>
+      <w:r/>
+      <w:r>
+        <w:rPr>
+          <w:b/>
+        </w:rPr>
+        <w:t>Offline route</w:t>
+      </w:r>
+      <w:r>
+        <w:t xml:space="preserve"> Use the same fixed pickup/drop paper layout and named-skill simulation. Its grasp/lift/release outcomes are synthetic assumptions with physical_evidence false. Missing recordings or qualification means physical execution remains incomplete.</w:t>
+      </w:r>
+    </w:p>
+    <w:p>
+      <w:r/>
+      <w:r>
+        <w:rPr>
+          <w:b/>
+        </w:rPr>
+        <w:t>Hint 1</w:t>
+      </w:r>
+      <w:r>
+        <w:t xml:space="preserve"> Stop the conveyor before the arm approaches.</w:t>
+      </w:r>
+    </w:p>
+    <w:p>
+      <w:r/>
+      <w:r>
+        <w:rPr>
+          <w:b/>
+        </w:rPr>
+        <w:t>Hint 2</w:t>
+      </w:r>
+      <w:r>
+        <w:t xml:space="preserve"> Start/end poses and jaw state of adjacent taught strokes must agree.</w:t>
+      </w:r>
+    </w:p>
+    <w:p>
+      <w:r/>
+      <w:r>
+        <w:rPr>
+          <w:b/>
+        </w:rPr>
+        <w:t>Instructor guidance</w:t>
+      </w:r>
+      <w:r>
+        <w:t xml:space="preserve"> Do not substitute demo recordings. Current historical operational notes remain evidence until a new physical rehearsal supersedes them. Never infer payload success from a log.</w:t>
+      </w:r>
+    </w:p>
+    <w:p>
+      <w:r>
+        <w:br w:type="page"/>
+      </w:r>
+    </w:p>
+    <w:p>
+      <w:pPr>
+        <w:pStyle w:val="Heading1"/>
+      </w:pPr>
+      <w:r>
+        <w:t>Find one failure and test a repair</w:t>
+      </w:r>
+    </w:p>
+    <w:p>
+      <w:r>
+        <w:t xml:space="preserve">Mission </w:t>
+      </w:r>
+      <w:r>
+        <w:rPr>
+          <w:rFonts w:ascii="Noto Sans Mono" w:hAnsi="Noto Sans Mono"/>
+          <w:sz w:val="19"/>
+        </w:rPr>
+        <w:t>improve</w:t>
+      </w:r>
+      <w:r>
+        <w:t xml:space="preserve"> · 20 minutes · Use a controlled change and evidence to improve a sequence.</w:t>
+      </w:r>
+    </w:p>
+    <w:p>
+      <w:r/>
+      <w:r>
+        <w:rPr>
+          <w:b/>
+        </w:rPr>
+        <w:t>Worked example</w:t>
+      </w:r>
+      <w:r>
+        <w:t xml:space="preserve"> A missing fixture observation pauses the sequence after one inspected object. Fix the observation path before retrying.</w:t>
+      </w:r>
+    </w:p>
+    <w:p>
+      <w:r/>
+      <w:r>
+        <w:rPr>
+          <w:b/>
+        </w:rPr>
+        <w:t>Predict</w:t>
+      </w:r>
+      <w:r>
+        <w:t xml:space="preserve"> What happens when the middle report is None?</w:t>
+      </w:r>
+    </w:p>
+    <w:p>
+      <w:r/>
+      <w:r>
+        <w:rPr>
+          <w:b/>
+        </w:rPr>
+        <w:t>Change</w:t>
+      </w:r>
+      <w:r>
+        <w:t xml:space="preserve"> Test one failure: missing report, wrong order, missing recording or STOP. Change one cause only and reset.</w:t>
+      </w:r>
+    </w:p>
+    <w:p>
+      <w:r/>
+      <w:r>
+        <w:rPr>
+          <w:b/>
+        </w:rPr>
+        <w:t>Run</w:t>
+      </w:r>
+      <w:r>
+        <w:t xml:space="preserve"> Reproduce in simulation or paper; record expected versus actual. Repair and rerun the same input.</w:t>
+      </w:r>
+    </w:p>
+    <w:p>
+      <w:r/>
+      <w:r>
+        <w:rPr>
+          <w:b/>
+        </w:rPr>
+        <w:t>Observe</w:t>
+      </w:r>
+      <w:r>
+        <w:t xml:space="preserve"> Capture the failure message, stopped state and repaired trace. No physical fault injection by learners.</w:t>
+      </w:r>
+    </w:p>
+    <w:p>
+      <w:r/>
+      <w:r>
+        <w:rPr>
+          <w:b/>
+        </w:rPr>
+        <w:t>Explain</w:t>
+      </w:r>
+      <w:r>
+        <w:t xml:space="preserve"> Did your test detect the problem? What could still fail on hardware?</w:t>
+      </w:r>
+    </w:p>
+    <w:p>
+      <w:r/>
+      <w:r>
+        <w:rPr>
+          <w:b/>
+        </w:rPr>
+        <w:t>Success check</w:t>
+      </w:r>
+      <w:r>
+        <w:t xml:space="preserve"> You show a failing prediction, one repair and a repeated check with its limits.</w:t>
+      </w:r>
+    </w:p>
+    <w:p>
+      <w:r/>
+      <w:r>
+        <w:rPr>
+          <w:b/>
+        </w:rPr>
+        <w:t>Optional challenge</w:t>
+      </w:r>
+      <w:r>
+        <w:t xml:space="preserve"> Use the optional color-routing example with three reds and one blue to expose swapped rules.</w:t>
+      </w:r>
+    </w:p>
+    <w:p>
+      <w:r/>
+      <w:r>
+        <w:rPr>
+          <w:b/>
+        </w:rPr>
+        <w:t>Offline route</w:t>
+      </w:r>
+      <w:r>
+        <w:t xml:space="preserve"> All failures can be traced with paper command/report cards.</w:t>
+      </w:r>
+    </w:p>
+    <w:p>
+      <w:r/>
+      <w:r>
+        <w:rPr>
+          <w:b/>
+        </w:rPr>
+        <w:t>Hint 1</w:t>
+      </w:r>
+      <w:r>
+        <w:t xml:space="preserve"> Choose one input so cause and effect stay clear.</w:t>
+      </w:r>
+    </w:p>
+    <w:p>
+      <w:r/>
+      <w:r>
+        <w:rPr>
+          <w:b/>
+        </w:rPr>
+        <w:t>Hint 2</w:t>
+      </w:r>
+      <w:r>
+        <w:t xml:space="preserve"> A successful run alone cannot identify a wrong known report.</w:t>
+      </w:r>
+    </w:p>
+    <w:p>
+      <w:r/>
+      <w:r>
+        <w:rPr>
+          <w:b/>
+        </w:rPr>
+        <w:t>Instructor guidance</w:t>
+      </w:r>
+      <w:r>
+        <w:t xml:space="preserve"> Missing report stops after one; avoid relaxing admission or faking a report to pass.</w:t>
+      </w:r>
+    </w:p>
+    <w:p>
+      <w:r>
+        <w:br w:type="page"/>
+      </w:r>
+    </w:p>
+    <w:p>
+      <w:pPr>
+        <w:pStyle w:val="Heading1"/>
+      </w:pPr>
+      <w:r>
+        <w:t>Show one prediction and result</w:t>
+      </w:r>
+    </w:p>
+    <w:p>
+      <w:r>
+        <w:t xml:space="preserve">Mission </w:t>
+      </w:r>
+      <w:r>
+        <w:rPr>
+          <w:rFonts w:ascii="Noto Sans Mono" w:hAnsi="Noto Sans Mono"/>
+          <w:sz w:val="19"/>
+        </w:rPr>
+        <w:t>share</w:t>
+      </w:r>
+      <w:r>
+        <w:t xml:space="preserve"> · 10 minutes · Explain what your program did and what the evidence cannot prove.</w:t>
+      </w:r>
+    </w:p>
+    <w:p>
+      <w:r/>
+      <w:r>
+        <w:rPr>
+          <w:b/>
+        </w:rPr>
+        <w:t>Worked example</w:t>
+      </w:r>
+      <w:r>
+        <w:t xml:space="preserve"> Pair A shows prediction, one change, observed result and one limit; then pairs B and C follow.</w:t>
+      </w:r>
+    </w:p>
+    <w:p>
+      <w:r/>
+      <w:r>
+        <w:rPr>
+          <w:b/>
+        </w:rPr>
+        <w:t>Predict</w:t>
+      </w:r>
+      <w:r>
+        <w:t xml:space="preserve"> Which single output best supports your claim?</w:t>
+      </w:r>
+    </w:p>
+    <w:p>
+      <w:r/>
+      <w:r>
+        <w:rPr>
+          <w:b/>
+        </w:rPr>
+        <w:t>Change</w:t>
+      </w:r>
+      <w:r>
+        <w:t xml:space="preserve"> Shorten your demonstration to one change and one observation.</w:t>
+      </w:r>
+    </w:p>
+    <w:p>
+      <w:r/>
+      <w:r>
+        <w:rPr>
+          <w:b/>
+        </w:rPr>
+        <w:t>Run</w:t>
+      </w:r>
+      <w:r>
+        <w:t xml:space="preserve"> Use 1 minute preparation, 3 demonstrations of 2 minutes, 3 minutes shared reflection. Both partners speak.</w:t>
+      </w:r>
+    </w:p>
+    <w:p>
+      <w:r/>
+      <w:r>
+        <w:rPr>
+          <w:b/>
+        </w:rPr>
+        <w:t>Observe</w:t>
+      </w:r>
+      <w:r>
+        <w:t xml:space="preserve"> Show saved trace, worksheet or observed supervised step; label simulation, paper or physical.</w:t>
+      </w:r>
+    </w:p>
+    <w:p>
+      <w:r/>
+      <w:r>
+        <w:rPr>
+          <w:b/>
+        </w:rPr>
+        <w:t>Explain</w:t>
+      </w:r>
+      <w:r>
+        <w:t xml:space="preserve"> Name one next test that would increase confidence.</w:t>
+      </w:r>
+    </w:p>
+    <w:p>
+      <w:r/>
+      <w:r>
+        <w:rPr>
+          <w:b/>
+        </w:rPr>
+        <w:t>Success check</w:t>
+      </w:r>
+      <w:r>
+        <w:t xml:space="preserve"> All three pairs demonstrate and state a specific limitation.</w:t>
+      </w:r>
+    </w:p>
+    <w:p>
+      <w:r/>
+      <w:r>
+        <w:rPr>
+          <w:b/>
+        </w:rPr>
+        <w:t>Optional challenge</w:t>
+      </w:r>
+      <w:r>
+        <w:t xml:space="preserve"> Explain how a wrong known color differs from a missing report.</w:t>
+      </w:r>
+    </w:p>
+    <w:p>
+      <w:r/>
+      <w:r>
+        <w:rPr>
+          <w:b/>
+        </w:rPr>
+        <w:t>Offline route</w:t>
+      </w:r>
+      <w:r>
+        <w:t xml:space="preserve"> Present the worksheet and paper trace.</w:t>
+      </w:r>
+    </w:p>
+    <w:p>
+      <w:r/>
+      <w:r>
+        <w:rPr>
+          <w:b/>
+        </w:rPr>
+        <w:t>Hint 1</w:t>
+      </w:r>
+      <w:r>
+        <w:t xml:space="preserve"> Read your prediction before the result.</w:t>
+      </w:r>
+    </w:p>
+    <w:p>
+      <w:r/>
+      <w:r>
+        <w:rPr>
+          <w:b/>
+        </w:rPr>
+        <w:t>Hint 2</w:t>
+      </w:r>
+      <w:r>
+        <w:t xml:space="preserve"> A trace supports instruction order, not physical arrival.</w:t>
+      </w:r>
+    </w:p>
+    <w:p>
+      <w:r/>
+      <w:r>
+        <w:rPr>
+          <w:b/>
+        </w:rPr>
+        <w:t>Instructor guidance</w:t>
+      </w:r>
+      <w:r>
+        <w:t xml:space="preserve"> Keep all three demonstrations within ten minutes. Do not require successful hardware to explain evidence.</w:t>
       </w:r>
     </w:p>
     <w:sectPr>
+      <w:footerReference w:type="default" r:id="rId9"/>
       <w:pgSz w:w="11909" w:h="16834"/>
       <w:pgMar w:top="936" w:right="1037" w:bottom="936" w:left="1037" w:header="720" w:footer="720" w:gutter="0"/>
       <w:cols w:space="720"/>
@@ -662,6 +2369,18 @@
     </w:sectPr>
   </w:body>
 </w:document>
+</file>
+
+<file path=word/footer1.xml><?xml version="1.0" encoding="utf-8"?>
+<w:ftr xmlns:m="http://schemas.openxmlformats.org/officeDocument/2006/math" xmlns:mc="http://schemas.openxmlformats.org/markup-compatibility/2006" xmlns:mo="http://schemas.microsoft.com/office/mac/office/2008/main" xmlns:mv="urn:schemas-microsoft-com:mac:vml" xmlns:o="urn:schemas-microsoft-com:office:office" xmlns:r="http://schemas.openxmlformats.org/officeDocument/2006/relationships" xmlns:v="urn:schemas-microsoft-com:vml" xmlns:w10="urn:schemas-microsoft-com:office:word" xmlns:w14="http://schemas.microsoft.com/office/word/2010/wordml" xmlns:w="http://schemas.openxmlformats.org/wordprocessingml/2006/main" xmlns:wne="http://schemas.microsoft.com/office/word/2006/wordml" xmlns:wp14="http://schemas.microsoft.com/office/word/2010/wordprocessingDrawing" xmlns:wp="http://schemas.openxmlformats.org/drawingml/2006/wordprocessingDrawing" xmlns:wpc="http://schemas.microsoft.com/office/word/2010/wordprocessingCanvas" xmlns:wpg="http://schemas.microsoft.com/office/word/2010/wordprocessingGroup" xmlns:wpi="http://schemas.microsoft.com/office/word/2010/wordprocessingInk" xmlns:wps="http://schemas.microsoft.com/office/word/2010/wordprocessingShape" mc:Ignorable="w14 wp14">
+  <w:p>
+    <w:pPr>
+      <w:pStyle w:val="Footer"/>
+      <w:jc w:val="right"/>
+    </w:pPr>
+    <w:fldSimple w:instr="PAGE"/>
+  </w:p>
+</w:ftr>
 </file>
 
 <file path=word/numbering.xml><?xml version="1.0" encoding="utf-8"?>
@@ -1032,8 +2751,8 @@
     </w:pPr>
     <w:rPr>
       <w:rFonts w:ascii="DejaVu Sans" w:hAnsi="DejaVu Sans"/>
-      <w:color w:val="17354B"/>
-      <w:sz w:val="20"/>
+      <w:color w:val="000000"/>
+      <w:sz w:val="22"/>
     </w:rPr>
   </w:style>
   <w:style w:type="paragraph" w:styleId="Header">
@@ -1098,7 +2817,7 @@
       <w:rFonts w:asciiTheme="majorHAnsi" w:eastAsiaTheme="majorEastAsia" w:hAnsiTheme="majorHAnsi" w:cstheme="majorBidi" w:ascii="DejaVu Sans" w:hAnsi="DejaVu Sans"/>
       <w:b/>
       <w:bCs/>
-      <w:color w:val="17354B"/>
+      <w:color w:val="000000"/>
       <w:sz w:val="30"/>
       <w:szCs w:val="28"/>
     </w:rPr>
@@ -1122,7 +2841,7 @@
       <w:rFonts w:asciiTheme="majorHAnsi" w:eastAsiaTheme="majorEastAsia" w:hAnsiTheme="majorHAnsi" w:cstheme="majorBidi" w:ascii="DejaVu Sans" w:hAnsi="DejaVu Sans"/>
       <w:b/>
       <w:bCs/>
-      <w:color w:val="17354B"/>
+      <w:color w:val="000000"/>
       <w:sz w:val="24"/>
       <w:szCs w:val="26"/>
     </w:rPr>

</xml_diff>